<commit_message>
doc: Fin analyse du projet
</commit_message>
<xml_diff>
--- a/R-320-alemartino.docx
+++ b/R-320-alemartino.docx
@@ -5,8 +5,14 @@
     <w:p>
       <w:pPr>
         <w:pStyle w:val="Titre"/>
-      </w:pPr>
-      <w:r>
+        <w:rPr>
+          <w:lang w:val="en-US"/>
+        </w:rPr>
+      </w:pPr>
+      <w:r>
+        <w:rPr>
+          <w:lang w:val="en-US"/>
+        </w:rPr>
         <w:t>P_320 Parking</w:t>
       </w:r>
     </w:p>
@@ -18,20 +24,18 @@
           <w:rFonts w:cs="Arial"/>
           <w:sz w:val="22"/>
           <w:szCs w:val="22"/>
+          <w:lang w:val="en-US"/>
         </w:rPr>
       </w:pPr>
       <w:r>
         <w:rPr>
-          <w:rFonts w:cs="Arial"/>
           <w:noProof/>
-          <w:sz w:val="22"/>
-          <w:szCs w:val="22"/>
         </w:rPr>
         <w:drawing>
-          <wp:inline distT="0" distB="0" distL="0" distR="0" wp14:anchorId="700C59BE" wp14:editId="24DBBAF9">
-            <wp:extent cx="3134995" cy="2558415"/>
-            <wp:effectExtent l="19050" t="0" r="8255" b="0"/>
-            <wp:docPr id="3" name="Image 3"/>
+          <wp:inline distT="0" distB="0" distL="0" distR="0" wp14:anchorId="2FB5E3CD" wp14:editId="37ADADFB">
+            <wp:extent cx="2995448" cy="2995448"/>
+            <wp:effectExtent l="0" t="0" r="0" b="0"/>
+            <wp:docPr id="584235562" name="Image 3" descr="Icône de stationnement svg png jpg pdf Images vectorielles Panneau de  symbole de stationnement de voiture Panneaux de stationnement réservés  imprimables Logo de stationnement pour personnes handicapées parking privé  - Etsy France"/>
             <wp:cNvGraphicFramePr>
               <a:graphicFrameLocks xmlns:a="http://schemas.openxmlformats.org/drawingml/2006/main" noChangeAspect="1"/>
             </wp:cNvGraphicFramePr>
@@ -39,13 +43,19 @@
               <a:graphicData uri="http://schemas.openxmlformats.org/drawingml/2006/picture">
                 <pic:pic xmlns:pic="http://schemas.openxmlformats.org/drawingml/2006/picture">
                   <pic:nvPicPr>
-                    <pic:cNvPr id="0" name="Picture 3"/>
+                    <pic:cNvPr id="0" name="Picture 12" descr="Icône de stationnement svg png jpg pdf Images vectorielles Panneau de  symbole de stationnement de voiture Panneaux de stationnement réservés  imprimables Logo de stationnement pour personnes handicapées parking privé  - Etsy France"/>
                     <pic:cNvPicPr>
                       <a:picLocks noChangeAspect="1" noChangeArrowheads="1"/>
                     </pic:cNvPicPr>
                   </pic:nvPicPr>
                   <pic:blipFill>
-                    <a:blip r:embed="rId11" cstate="print"/>
+                    <a:blip r:embed="rId11">
+                      <a:extLst>
+                        <a:ext uri="{28A0092B-C50C-407E-A947-70E740481C1C}">
+                          <a14:useLocalDpi xmlns:a14="http://schemas.microsoft.com/office/drawing/2010/main" val="0"/>
+                        </a:ext>
+                      </a:extLst>
+                    </a:blip>
                     <a:srcRect/>
                     <a:stretch>
                       <a:fillRect/>
@@ -54,17 +64,14 @@
                   <pic:spPr bwMode="auto">
                     <a:xfrm>
                       <a:off x="0" y="0"/>
-                      <a:ext cx="3134995" cy="2558415"/>
+                      <a:ext cx="3000017" cy="3000017"/>
                     </a:xfrm>
                     <a:prstGeom prst="rect">
                       <a:avLst/>
                     </a:prstGeom>
                     <a:noFill/>
-                    <a:ln w="9525">
+                    <a:ln>
                       <a:noFill/>
-                      <a:miter lim="800000"/>
-                      <a:headEnd/>
-                      <a:tailEnd/>
                     </a:ln>
                   </pic:spPr>
                 </pic:pic>
@@ -77,13 +84,7 @@
     <w:p>
       <w:pPr>
         <w:spacing w:before="2000"/>
-        <w:jc w:val="center"/>
-      </w:pPr>
-    </w:p>
-    <w:p>
-      <w:pPr>
-        <w:spacing w:before="2000"/>
-        <w:jc w:val="center"/>
+        <w:ind w:left="2832" w:firstLine="708"/>
       </w:pPr>
       <w:r>
         <w:t>Alessio Martino – CID2A</w:t>
@@ -130,8 +131,10 @@
           <w:bCs w:val="0"/>
           <w:caps w:val="0"/>
           <w:noProof/>
-          <w:sz w:val="22"/>
-          <w:szCs w:val="22"/>
+          <w:kern w:val="2"/>
+          <w:sz w:val="24"/>
+          <w:szCs w:val="24"/>
+          <w14:ligatures w14:val="standardContextual"/>
         </w:rPr>
       </w:pPr>
       <w:r>
@@ -167,7 +170,7 @@
         </w:rPr>
         <w:fldChar w:fldCharType="separate"/>
       </w:r>
-      <w:hyperlink w:anchor="_Toc308526316" w:history="1">
+      <w:hyperlink w:anchor="_Toc239402421" w:history="1">
         <w:r>
           <w:rPr>
             <w:rStyle w:val="Lienhypertexte"/>
@@ -182,8 +185,10 @@
             <w:bCs w:val="0"/>
             <w:caps w:val="0"/>
             <w:noProof/>
-            <w:sz w:val="22"/>
-            <w:szCs w:val="22"/>
+            <w:kern w:val="2"/>
+            <w:sz w:val="24"/>
+            <w:szCs w:val="24"/>
+            <w14:ligatures w14:val="standardContextual"/>
           </w:rPr>
           <w:tab/>
         </w:r>
@@ -213,7 +218,7 @@
             <w:noProof/>
             <w:webHidden/>
           </w:rPr>
-          <w:instrText xml:space="preserve"> PAGEREF _Toc308526316 \h </w:instrText>
+          <w:instrText xml:space="preserve"> PAGEREF _Toc239402421 \h </w:instrText>
         </w:r>
         <w:r>
           <w:rPr>
@@ -255,11 +260,13 @@
           <w:rFonts w:eastAsiaTheme="minorEastAsia" w:cstheme="minorBidi"/>
           <w:smallCaps w:val="0"/>
           <w:noProof/>
-          <w:sz w:val="22"/>
-          <w:szCs w:val="22"/>
+          <w:kern w:val="2"/>
+          <w:sz w:val="24"/>
+          <w:szCs w:val="24"/>
+          <w14:ligatures w14:val="standardContextual"/>
         </w:rPr>
       </w:pPr>
-      <w:hyperlink w:anchor="_Toc308526317" w:history="1">
+      <w:hyperlink w:anchor="_Toc239402422" w:history="1">
         <w:r>
           <w:rPr>
             <w:rStyle w:val="Lienhypertexte"/>
@@ -272,8 +279,10 @@
             <w:rFonts w:eastAsiaTheme="minorEastAsia" w:cstheme="minorBidi"/>
             <w:smallCaps w:val="0"/>
             <w:noProof/>
-            <w:sz w:val="22"/>
-            <w:szCs w:val="22"/>
+            <w:kern w:val="2"/>
+            <w:sz w:val="24"/>
+            <w:szCs w:val="24"/>
+            <w14:ligatures w14:val="standardContextual"/>
           </w:rPr>
           <w:tab/>
         </w:r>
@@ -303,7 +312,7 @@
             <w:noProof/>
             <w:webHidden/>
           </w:rPr>
-          <w:instrText xml:space="preserve"> PAGEREF _Toc308526317 \h </w:instrText>
+          <w:instrText xml:space="preserve"> PAGEREF _Toc239402422 \h </w:instrText>
         </w:r>
         <w:r>
           <w:rPr>
@@ -345,11 +354,13 @@
           <w:rFonts w:eastAsiaTheme="minorEastAsia" w:cstheme="minorBidi"/>
           <w:smallCaps w:val="0"/>
           <w:noProof/>
-          <w:sz w:val="22"/>
-          <w:szCs w:val="22"/>
+          <w:kern w:val="2"/>
+          <w:sz w:val="24"/>
+          <w:szCs w:val="24"/>
+          <w14:ligatures w14:val="standardContextual"/>
         </w:rPr>
       </w:pPr>
-      <w:hyperlink w:anchor="_Toc308526318" w:history="1">
+      <w:hyperlink w:anchor="_Toc239402423" w:history="1">
         <w:r>
           <w:rPr>
             <w:rStyle w:val="Lienhypertexte"/>
@@ -362,8 +373,10 @@
             <w:rFonts w:eastAsiaTheme="minorEastAsia" w:cstheme="minorBidi"/>
             <w:smallCaps w:val="0"/>
             <w:noProof/>
-            <w:sz w:val="22"/>
-            <w:szCs w:val="22"/>
+            <w:kern w:val="2"/>
+            <w:sz w:val="24"/>
+            <w:szCs w:val="24"/>
+            <w14:ligatures w14:val="standardContextual"/>
           </w:rPr>
           <w:tab/>
         </w:r>
@@ -393,7 +406,7 @@
             <w:noProof/>
             <w:webHidden/>
           </w:rPr>
-          <w:instrText xml:space="preserve"> PAGEREF _Toc308526318 \h </w:instrText>
+          <w:instrText xml:space="preserve"> PAGEREF _Toc239402423 \h </w:instrText>
         </w:r>
         <w:r>
           <w:rPr>
@@ -435,11 +448,13 @@
           <w:rFonts w:eastAsiaTheme="minorEastAsia" w:cstheme="minorBidi"/>
           <w:smallCaps w:val="0"/>
           <w:noProof/>
-          <w:sz w:val="22"/>
-          <w:szCs w:val="22"/>
+          <w:kern w:val="2"/>
+          <w:sz w:val="24"/>
+          <w:szCs w:val="24"/>
+          <w14:ligatures w14:val="standardContextual"/>
         </w:rPr>
       </w:pPr>
-      <w:hyperlink w:anchor="_Toc308526319" w:history="1">
+      <w:hyperlink w:anchor="_Toc239402424" w:history="1">
         <w:r>
           <w:rPr>
             <w:rStyle w:val="Lienhypertexte"/>
@@ -452,8 +467,10 @@
             <w:rFonts w:eastAsiaTheme="minorEastAsia" w:cstheme="minorBidi"/>
             <w:smallCaps w:val="0"/>
             <w:noProof/>
-            <w:sz w:val="22"/>
-            <w:szCs w:val="22"/>
+            <w:kern w:val="2"/>
+            <w:sz w:val="24"/>
+            <w:szCs w:val="24"/>
+            <w14:ligatures w14:val="standardContextual"/>
           </w:rPr>
           <w:tab/>
         </w:r>
@@ -483,7 +500,7 @@
             <w:noProof/>
             <w:webHidden/>
           </w:rPr>
-          <w:instrText xml:space="preserve"> PAGEREF _Toc308526319 \h </w:instrText>
+          <w:instrText xml:space="preserve"> PAGEREF _Toc239402424 \h </w:instrText>
         </w:r>
         <w:r>
           <w:rPr>
@@ -525,11 +542,13 @@
           <w:rFonts w:eastAsiaTheme="minorEastAsia" w:cstheme="minorBidi"/>
           <w:smallCaps w:val="0"/>
           <w:noProof/>
-          <w:sz w:val="22"/>
-          <w:szCs w:val="22"/>
+          <w:kern w:val="2"/>
+          <w:sz w:val="24"/>
+          <w:szCs w:val="24"/>
+          <w14:ligatures w14:val="standardContextual"/>
         </w:rPr>
       </w:pPr>
-      <w:hyperlink w:anchor="_Toc308526320" w:history="1">
+      <w:hyperlink w:anchor="_Toc239402425" w:history="1">
         <w:r>
           <w:rPr>
             <w:rStyle w:val="Lienhypertexte"/>
@@ -542,8 +561,10 @@
             <w:rFonts w:eastAsiaTheme="minorEastAsia" w:cstheme="minorBidi"/>
             <w:smallCaps w:val="0"/>
             <w:noProof/>
-            <w:sz w:val="22"/>
-            <w:szCs w:val="22"/>
+            <w:kern w:val="2"/>
+            <w:sz w:val="24"/>
+            <w:szCs w:val="24"/>
+            <w14:ligatures w14:val="standardContextual"/>
           </w:rPr>
           <w:tab/>
         </w:r>
@@ -573,7 +594,7 @@
             <w:noProof/>
             <w:webHidden/>
           </w:rPr>
-          <w:instrText xml:space="preserve"> PAGEREF _Toc308526320 \h </w:instrText>
+          <w:instrText xml:space="preserve"> PAGEREF _Toc239402425 \h </w:instrText>
         </w:r>
         <w:r>
           <w:rPr>
@@ -615,11 +636,13 @@
           <w:rFonts w:eastAsiaTheme="minorEastAsia" w:cstheme="minorBidi"/>
           <w:smallCaps w:val="0"/>
           <w:noProof/>
-          <w:sz w:val="22"/>
-          <w:szCs w:val="22"/>
+          <w:kern w:val="2"/>
+          <w:sz w:val="24"/>
+          <w:szCs w:val="24"/>
+          <w14:ligatures w14:val="standardContextual"/>
         </w:rPr>
       </w:pPr>
-      <w:hyperlink w:anchor="_Toc308526321" w:history="1">
+      <w:hyperlink w:anchor="_Toc239402426" w:history="1">
         <w:r>
           <w:rPr>
             <w:rStyle w:val="Lienhypertexte"/>
@@ -632,8 +655,10 @@
             <w:rFonts w:eastAsiaTheme="minorEastAsia" w:cstheme="minorBidi"/>
             <w:smallCaps w:val="0"/>
             <w:noProof/>
-            <w:sz w:val="22"/>
-            <w:szCs w:val="22"/>
+            <w:kern w:val="2"/>
+            <w:sz w:val="24"/>
+            <w:szCs w:val="24"/>
+            <w14:ligatures w14:val="standardContextual"/>
           </w:rPr>
           <w:tab/>
         </w:r>
@@ -663,7 +688,7 @@
             <w:noProof/>
             <w:webHidden/>
           </w:rPr>
-          <w:instrText xml:space="preserve"> PAGEREF _Toc308526321 \h </w:instrText>
+          <w:instrText xml:space="preserve"> PAGEREF _Toc239402426 \h </w:instrText>
         </w:r>
         <w:r>
           <w:rPr>
@@ -684,830 +709,6 @@
             <w:webHidden/>
           </w:rPr>
           <w:t>3</w:t>
-        </w:r>
-        <w:r>
-          <w:rPr>
-            <w:noProof/>
-            <w:webHidden/>
-          </w:rPr>
-          <w:fldChar w:fldCharType="end"/>
-        </w:r>
-      </w:hyperlink>
-    </w:p>
-    <w:p>
-      <w:pPr>
-        <w:pStyle w:val="TM3"/>
-        <w:tabs>
-          <w:tab w:val="left" w:pos="1200"/>
-          <w:tab w:val="right" w:leader="dot" w:pos="9060"/>
-        </w:tabs>
-        <w:rPr>
-          <w:rFonts w:eastAsiaTheme="minorEastAsia" w:cstheme="minorBidi"/>
-          <w:i w:val="0"/>
-          <w:iCs w:val="0"/>
-          <w:noProof/>
-          <w:sz w:val="22"/>
-          <w:szCs w:val="22"/>
-        </w:rPr>
-      </w:pPr>
-      <w:hyperlink w:anchor="_Toc308526322" w:history="1">
-        <w:r>
-          <w:rPr>
-            <w:rStyle w:val="Lienhypertexte"/>
-            <w:noProof/>
-          </w:rPr>
-          <w:t>1.5.1</w:t>
-        </w:r>
-        <w:r>
-          <w:rPr>
-            <w:rFonts w:eastAsiaTheme="minorEastAsia" w:cstheme="minorBidi"/>
-            <w:i w:val="0"/>
-            <w:iCs w:val="0"/>
-            <w:noProof/>
-            <w:sz w:val="22"/>
-            <w:szCs w:val="22"/>
-          </w:rPr>
-          <w:tab/>
-        </w:r>
-        <w:r>
-          <w:rPr>
-            <w:rStyle w:val="Lienhypertexte"/>
-            <w:noProof/>
-          </w:rPr>
-          <w:t>Objectifs et portée du projet (objectifs SMART)</w:t>
-        </w:r>
-        <w:r>
-          <w:rPr>
-            <w:noProof/>
-            <w:webHidden/>
-          </w:rPr>
-          <w:tab/>
-        </w:r>
-        <w:r>
-          <w:rPr>
-            <w:noProof/>
-            <w:webHidden/>
-          </w:rPr>
-          <w:fldChar w:fldCharType="begin"/>
-        </w:r>
-        <w:r>
-          <w:rPr>
-            <w:noProof/>
-            <w:webHidden/>
-          </w:rPr>
-          <w:instrText xml:space="preserve"> PAGEREF _Toc308526322 \h </w:instrText>
-        </w:r>
-        <w:r>
-          <w:rPr>
-            <w:noProof/>
-            <w:webHidden/>
-          </w:rPr>
-        </w:r>
-        <w:r>
-          <w:rPr>
-            <w:noProof/>
-            <w:webHidden/>
-          </w:rPr>
-          <w:fldChar w:fldCharType="separate"/>
-        </w:r>
-        <w:r>
-          <w:rPr>
-            <w:noProof/>
-            <w:webHidden/>
-          </w:rPr>
-          <w:t>3</w:t>
-        </w:r>
-        <w:r>
-          <w:rPr>
-            <w:noProof/>
-            <w:webHidden/>
-          </w:rPr>
-          <w:fldChar w:fldCharType="end"/>
-        </w:r>
-      </w:hyperlink>
-    </w:p>
-    <w:p>
-      <w:pPr>
-        <w:pStyle w:val="TM3"/>
-        <w:tabs>
-          <w:tab w:val="left" w:pos="1200"/>
-          <w:tab w:val="right" w:leader="dot" w:pos="9060"/>
-        </w:tabs>
-        <w:rPr>
-          <w:rFonts w:eastAsiaTheme="minorEastAsia" w:cstheme="minorBidi"/>
-          <w:i w:val="0"/>
-          <w:iCs w:val="0"/>
-          <w:noProof/>
-          <w:sz w:val="22"/>
-          <w:szCs w:val="22"/>
-        </w:rPr>
-      </w:pPr>
-      <w:hyperlink w:anchor="_Toc308526323" w:history="1">
-        <w:r>
-          <w:rPr>
-            <w:rStyle w:val="Lienhypertexte"/>
-            <w:noProof/>
-          </w:rPr>
-          <w:t>1.5.2</w:t>
-        </w:r>
-        <w:r>
-          <w:rPr>
-            <w:rFonts w:eastAsiaTheme="minorEastAsia" w:cstheme="minorBidi"/>
-            <w:i w:val="0"/>
-            <w:iCs w:val="0"/>
-            <w:noProof/>
-            <w:sz w:val="22"/>
-            <w:szCs w:val="22"/>
-          </w:rPr>
-          <w:tab/>
-        </w:r>
-        <w:r>
-          <w:rPr>
-            <w:rStyle w:val="Lienhypertexte"/>
-            <w:noProof/>
-          </w:rPr>
-          <w:t>Caractéristiques des utilisateurs et impacts</w:t>
-        </w:r>
-        <w:r>
-          <w:rPr>
-            <w:noProof/>
-            <w:webHidden/>
-          </w:rPr>
-          <w:tab/>
-        </w:r>
-        <w:r>
-          <w:rPr>
-            <w:noProof/>
-            <w:webHidden/>
-          </w:rPr>
-          <w:fldChar w:fldCharType="begin"/>
-        </w:r>
-        <w:r>
-          <w:rPr>
-            <w:noProof/>
-            <w:webHidden/>
-          </w:rPr>
-          <w:instrText xml:space="preserve"> PAGEREF _Toc308526323 \h </w:instrText>
-        </w:r>
-        <w:r>
-          <w:rPr>
-            <w:noProof/>
-            <w:webHidden/>
-          </w:rPr>
-        </w:r>
-        <w:r>
-          <w:rPr>
-            <w:noProof/>
-            <w:webHidden/>
-          </w:rPr>
-          <w:fldChar w:fldCharType="separate"/>
-        </w:r>
-        <w:r>
-          <w:rPr>
-            <w:noProof/>
-            <w:webHidden/>
-          </w:rPr>
-          <w:t>3</w:t>
-        </w:r>
-        <w:r>
-          <w:rPr>
-            <w:noProof/>
-            <w:webHidden/>
-          </w:rPr>
-          <w:fldChar w:fldCharType="end"/>
-        </w:r>
-      </w:hyperlink>
-    </w:p>
-    <w:p>
-      <w:pPr>
-        <w:pStyle w:val="TM3"/>
-        <w:tabs>
-          <w:tab w:val="left" w:pos="1200"/>
-          <w:tab w:val="right" w:leader="dot" w:pos="9060"/>
-        </w:tabs>
-        <w:rPr>
-          <w:rFonts w:eastAsiaTheme="minorEastAsia" w:cstheme="minorBidi"/>
-          <w:i w:val="0"/>
-          <w:iCs w:val="0"/>
-          <w:noProof/>
-          <w:sz w:val="22"/>
-          <w:szCs w:val="22"/>
-        </w:rPr>
-      </w:pPr>
-      <w:hyperlink w:anchor="_Toc308526324" w:history="1">
-        <w:r>
-          <w:rPr>
-            <w:rStyle w:val="Lienhypertexte"/>
-            <w:noProof/>
-          </w:rPr>
-          <w:t>1.5.3</w:t>
-        </w:r>
-        <w:r>
-          <w:rPr>
-            <w:rFonts w:eastAsiaTheme="minorEastAsia" w:cstheme="minorBidi"/>
-            <w:i w:val="0"/>
-            <w:iCs w:val="0"/>
-            <w:noProof/>
-            <w:sz w:val="22"/>
-            <w:szCs w:val="22"/>
-          </w:rPr>
-          <w:tab/>
-        </w:r>
-        <w:r>
-          <w:rPr>
-            <w:rStyle w:val="Lienhypertexte"/>
-            <w:noProof/>
-          </w:rPr>
-          <w:t>Fonctionnalités requises (du point de vue de l’utilisateur)</w:t>
-        </w:r>
-        <w:r>
-          <w:rPr>
-            <w:noProof/>
-            <w:webHidden/>
-          </w:rPr>
-          <w:tab/>
-        </w:r>
-        <w:r>
-          <w:rPr>
-            <w:noProof/>
-            <w:webHidden/>
-          </w:rPr>
-          <w:fldChar w:fldCharType="begin"/>
-        </w:r>
-        <w:r>
-          <w:rPr>
-            <w:noProof/>
-            <w:webHidden/>
-          </w:rPr>
-          <w:instrText xml:space="preserve"> PAGEREF _Toc308526324 \h </w:instrText>
-        </w:r>
-        <w:r>
-          <w:rPr>
-            <w:noProof/>
-            <w:webHidden/>
-          </w:rPr>
-        </w:r>
-        <w:r>
-          <w:rPr>
-            <w:noProof/>
-            <w:webHidden/>
-          </w:rPr>
-          <w:fldChar w:fldCharType="separate"/>
-        </w:r>
-        <w:r>
-          <w:rPr>
-            <w:noProof/>
-            <w:webHidden/>
-          </w:rPr>
-          <w:t>3</w:t>
-        </w:r>
-        <w:r>
-          <w:rPr>
-            <w:noProof/>
-            <w:webHidden/>
-          </w:rPr>
-          <w:fldChar w:fldCharType="end"/>
-        </w:r>
-      </w:hyperlink>
-    </w:p>
-    <w:p>
-      <w:pPr>
-        <w:pStyle w:val="TM3"/>
-        <w:tabs>
-          <w:tab w:val="left" w:pos="1200"/>
-          <w:tab w:val="right" w:leader="dot" w:pos="9060"/>
-        </w:tabs>
-        <w:rPr>
-          <w:rFonts w:eastAsiaTheme="minorEastAsia" w:cstheme="minorBidi"/>
-          <w:i w:val="0"/>
-          <w:iCs w:val="0"/>
-          <w:noProof/>
-          <w:sz w:val="22"/>
-          <w:szCs w:val="22"/>
-        </w:rPr>
-      </w:pPr>
-      <w:hyperlink w:anchor="_Toc308526325" w:history="1">
-        <w:r>
-          <w:rPr>
-            <w:rStyle w:val="Lienhypertexte"/>
-            <w:noProof/>
-          </w:rPr>
-          <w:t>1.5.4</w:t>
-        </w:r>
-        <w:r>
-          <w:rPr>
-            <w:rFonts w:eastAsiaTheme="minorEastAsia" w:cstheme="minorBidi"/>
-            <w:i w:val="0"/>
-            <w:iCs w:val="0"/>
-            <w:noProof/>
-            <w:sz w:val="22"/>
-            <w:szCs w:val="22"/>
-          </w:rPr>
-          <w:tab/>
-        </w:r>
-        <w:r>
-          <w:rPr>
-            <w:rStyle w:val="Lienhypertexte"/>
-            <w:noProof/>
-          </w:rPr>
-          <w:t>Contraintes</w:t>
-        </w:r>
-        <w:r>
-          <w:rPr>
-            <w:noProof/>
-            <w:webHidden/>
-          </w:rPr>
-          <w:tab/>
-        </w:r>
-        <w:r>
-          <w:rPr>
-            <w:noProof/>
-            <w:webHidden/>
-          </w:rPr>
-          <w:fldChar w:fldCharType="begin"/>
-        </w:r>
-        <w:r>
-          <w:rPr>
-            <w:noProof/>
-            <w:webHidden/>
-          </w:rPr>
-          <w:instrText xml:space="preserve"> PAGEREF _Toc308526325 \h </w:instrText>
-        </w:r>
-        <w:r>
-          <w:rPr>
-            <w:noProof/>
-            <w:webHidden/>
-          </w:rPr>
-        </w:r>
-        <w:r>
-          <w:rPr>
-            <w:noProof/>
-            <w:webHidden/>
-          </w:rPr>
-          <w:fldChar w:fldCharType="separate"/>
-        </w:r>
-        <w:r>
-          <w:rPr>
-            <w:noProof/>
-            <w:webHidden/>
-          </w:rPr>
-          <w:t>3</w:t>
-        </w:r>
-        <w:r>
-          <w:rPr>
-            <w:noProof/>
-            <w:webHidden/>
-          </w:rPr>
-          <w:fldChar w:fldCharType="end"/>
-        </w:r>
-      </w:hyperlink>
-    </w:p>
-    <w:p>
-      <w:pPr>
-        <w:pStyle w:val="TM3"/>
-        <w:tabs>
-          <w:tab w:val="left" w:pos="1200"/>
-          <w:tab w:val="right" w:leader="dot" w:pos="9060"/>
-        </w:tabs>
-        <w:rPr>
-          <w:rFonts w:eastAsiaTheme="minorEastAsia" w:cstheme="minorBidi"/>
-          <w:i w:val="0"/>
-          <w:iCs w:val="0"/>
-          <w:noProof/>
-          <w:sz w:val="22"/>
-          <w:szCs w:val="22"/>
-        </w:rPr>
-      </w:pPr>
-      <w:hyperlink w:anchor="_Toc308526326" w:history="1">
-        <w:r>
-          <w:rPr>
-            <w:rStyle w:val="Lienhypertexte"/>
-            <w:noProof/>
-          </w:rPr>
-          <w:t>1.5.5</w:t>
-        </w:r>
-        <w:r>
-          <w:rPr>
-            <w:rFonts w:eastAsiaTheme="minorEastAsia" w:cstheme="minorBidi"/>
-            <w:i w:val="0"/>
-            <w:iCs w:val="0"/>
-            <w:noProof/>
-            <w:sz w:val="22"/>
-            <w:szCs w:val="22"/>
-          </w:rPr>
-          <w:tab/>
-        </w:r>
-        <w:r>
-          <w:rPr>
-            <w:rStyle w:val="Lienhypertexte"/>
-            <w:noProof/>
-          </w:rPr>
-          <w:t>Travail à réaliser par l'apprenti</w:t>
-        </w:r>
-        <w:r>
-          <w:rPr>
-            <w:noProof/>
-            <w:webHidden/>
-          </w:rPr>
-          <w:tab/>
-        </w:r>
-        <w:r>
-          <w:rPr>
-            <w:noProof/>
-            <w:webHidden/>
-          </w:rPr>
-          <w:fldChar w:fldCharType="begin"/>
-        </w:r>
-        <w:r>
-          <w:rPr>
-            <w:noProof/>
-            <w:webHidden/>
-          </w:rPr>
-          <w:instrText xml:space="preserve"> PAGEREF _Toc308526326 \h </w:instrText>
-        </w:r>
-        <w:r>
-          <w:rPr>
-            <w:noProof/>
-            <w:webHidden/>
-          </w:rPr>
-        </w:r>
-        <w:r>
-          <w:rPr>
-            <w:noProof/>
-            <w:webHidden/>
-          </w:rPr>
-          <w:fldChar w:fldCharType="separate"/>
-        </w:r>
-        <w:r>
-          <w:rPr>
-            <w:noProof/>
-            <w:webHidden/>
-          </w:rPr>
-          <w:t>4</w:t>
-        </w:r>
-        <w:r>
-          <w:rPr>
-            <w:noProof/>
-            <w:webHidden/>
-          </w:rPr>
-          <w:fldChar w:fldCharType="end"/>
-        </w:r>
-      </w:hyperlink>
-    </w:p>
-    <w:p>
-      <w:pPr>
-        <w:pStyle w:val="TM3"/>
-        <w:tabs>
-          <w:tab w:val="left" w:pos="1200"/>
-          <w:tab w:val="right" w:leader="dot" w:pos="9060"/>
-        </w:tabs>
-        <w:rPr>
-          <w:rFonts w:eastAsiaTheme="minorEastAsia" w:cstheme="minorBidi"/>
-          <w:i w:val="0"/>
-          <w:iCs w:val="0"/>
-          <w:noProof/>
-          <w:sz w:val="22"/>
-          <w:szCs w:val="22"/>
-        </w:rPr>
-      </w:pPr>
-      <w:hyperlink w:anchor="_Toc308526327" w:history="1">
-        <w:r>
-          <w:rPr>
-            <w:rStyle w:val="Lienhypertexte"/>
-            <w:noProof/>
-          </w:rPr>
-          <w:t>1.5.6</w:t>
-        </w:r>
-        <w:r>
-          <w:rPr>
-            <w:rFonts w:eastAsiaTheme="minorEastAsia" w:cstheme="minorBidi"/>
-            <w:i w:val="0"/>
-            <w:iCs w:val="0"/>
-            <w:noProof/>
-            <w:sz w:val="22"/>
-            <w:szCs w:val="22"/>
-          </w:rPr>
-          <w:tab/>
-        </w:r>
-        <w:r>
-          <w:rPr>
-            <w:rStyle w:val="Lienhypertexte"/>
-            <w:noProof/>
-          </w:rPr>
-          <w:t>Si le temps le permet …</w:t>
-        </w:r>
-        <w:r>
-          <w:rPr>
-            <w:noProof/>
-            <w:webHidden/>
-          </w:rPr>
-          <w:tab/>
-        </w:r>
-        <w:r>
-          <w:rPr>
-            <w:noProof/>
-            <w:webHidden/>
-          </w:rPr>
-          <w:fldChar w:fldCharType="begin"/>
-        </w:r>
-        <w:r>
-          <w:rPr>
-            <w:noProof/>
-            <w:webHidden/>
-          </w:rPr>
-          <w:instrText xml:space="preserve"> PAGEREF _Toc308526327 \h </w:instrText>
-        </w:r>
-        <w:r>
-          <w:rPr>
-            <w:noProof/>
-            <w:webHidden/>
-          </w:rPr>
-        </w:r>
-        <w:r>
-          <w:rPr>
-            <w:noProof/>
-            <w:webHidden/>
-          </w:rPr>
-          <w:fldChar w:fldCharType="separate"/>
-        </w:r>
-        <w:r>
-          <w:rPr>
-            <w:noProof/>
-            <w:webHidden/>
-          </w:rPr>
-          <w:t>4</w:t>
-        </w:r>
-        <w:r>
-          <w:rPr>
-            <w:noProof/>
-            <w:webHidden/>
-          </w:rPr>
-          <w:fldChar w:fldCharType="end"/>
-        </w:r>
-      </w:hyperlink>
-    </w:p>
-    <w:p>
-      <w:pPr>
-        <w:pStyle w:val="TM3"/>
-        <w:tabs>
-          <w:tab w:val="left" w:pos="1200"/>
-          <w:tab w:val="right" w:leader="dot" w:pos="9060"/>
-        </w:tabs>
-        <w:rPr>
-          <w:rFonts w:eastAsiaTheme="minorEastAsia" w:cstheme="minorBidi"/>
-          <w:i w:val="0"/>
-          <w:iCs w:val="0"/>
-          <w:noProof/>
-          <w:sz w:val="22"/>
-          <w:szCs w:val="22"/>
-        </w:rPr>
-      </w:pPr>
-      <w:hyperlink w:anchor="_Toc308526328" w:history="1">
-        <w:r>
-          <w:rPr>
-            <w:rStyle w:val="Lienhypertexte"/>
-            <w:noProof/>
-          </w:rPr>
-          <w:t>1.5.7</w:t>
-        </w:r>
-        <w:r>
-          <w:rPr>
-            <w:rFonts w:eastAsiaTheme="minorEastAsia" w:cstheme="minorBidi"/>
-            <w:i w:val="0"/>
-            <w:iCs w:val="0"/>
-            <w:noProof/>
-            <w:sz w:val="22"/>
-            <w:szCs w:val="22"/>
-          </w:rPr>
-          <w:tab/>
-        </w:r>
-        <w:r>
-          <w:rPr>
-            <w:rStyle w:val="Lienhypertexte"/>
-            <w:noProof/>
-          </w:rPr>
-          <w:t>Méthodes de validation des solutions</w:t>
-        </w:r>
-        <w:r>
-          <w:rPr>
-            <w:noProof/>
-            <w:webHidden/>
-          </w:rPr>
-          <w:tab/>
-        </w:r>
-        <w:r>
-          <w:rPr>
-            <w:noProof/>
-            <w:webHidden/>
-          </w:rPr>
-          <w:fldChar w:fldCharType="begin"/>
-        </w:r>
-        <w:r>
-          <w:rPr>
-            <w:noProof/>
-            <w:webHidden/>
-          </w:rPr>
-          <w:instrText xml:space="preserve"> PAGEREF _Toc308526328 \h </w:instrText>
-        </w:r>
-        <w:r>
-          <w:rPr>
-            <w:noProof/>
-            <w:webHidden/>
-          </w:rPr>
-        </w:r>
-        <w:r>
-          <w:rPr>
-            <w:noProof/>
-            <w:webHidden/>
-          </w:rPr>
-          <w:fldChar w:fldCharType="separate"/>
-        </w:r>
-        <w:r>
-          <w:rPr>
-            <w:noProof/>
-            <w:webHidden/>
-          </w:rPr>
-          <w:t>4</w:t>
-        </w:r>
-        <w:r>
-          <w:rPr>
-            <w:noProof/>
-            <w:webHidden/>
-          </w:rPr>
-          <w:fldChar w:fldCharType="end"/>
-        </w:r>
-      </w:hyperlink>
-    </w:p>
-    <w:p>
-      <w:pPr>
-        <w:pStyle w:val="TM2"/>
-        <w:tabs>
-          <w:tab w:val="left" w:pos="800"/>
-          <w:tab w:val="right" w:leader="dot" w:pos="9060"/>
-        </w:tabs>
-        <w:rPr>
-          <w:rFonts w:eastAsiaTheme="minorEastAsia" w:cstheme="minorBidi"/>
-          <w:smallCaps w:val="0"/>
-          <w:noProof/>
-          <w:sz w:val="22"/>
-          <w:szCs w:val="22"/>
-        </w:rPr>
-      </w:pPr>
-      <w:hyperlink w:anchor="_Toc308526329" w:history="1">
-        <w:r>
-          <w:rPr>
-            <w:rStyle w:val="Lienhypertexte"/>
-            <w:noProof/>
-          </w:rPr>
-          <w:t>1.6</w:t>
-        </w:r>
-        <w:r>
-          <w:rPr>
-            <w:rFonts w:eastAsiaTheme="minorEastAsia" w:cstheme="minorBidi"/>
-            <w:smallCaps w:val="0"/>
-            <w:noProof/>
-            <w:sz w:val="22"/>
-            <w:szCs w:val="22"/>
-          </w:rPr>
-          <w:tab/>
-        </w:r>
-        <w:r>
-          <w:rPr>
-            <w:rStyle w:val="Lienhypertexte"/>
-            <w:noProof/>
-          </w:rPr>
-          <w:t>Les points suivants seront évalués</w:t>
-        </w:r>
-        <w:r>
-          <w:rPr>
-            <w:noProof/>
-            <w:webHidden/>
-          </w:rPr>
-          <w:tab/>
-        </w:r>
-        <w:r>
-          <w:rPr>
-            <w:noProof/>
-            <w:webHidden/>
-          </w:rPr>
-          <w:fldChar w:fldCharType="begin"/>
-        </w:r>
-        <w:r>
-          <w:rPr>
-            <w:noProof/>
-            <w:webHidden/>
-          </w:rPr>
-          <w:instrText xml:space="preserve"> PAGEREF _Toc308526329 \h </w:instrText>
-        </w:r>
-        <w:r>
-          <w:rPr>
-            <w:noProof/>
-            <w:webHidden/>
-          </w:rPr>
-        </w:r>
-        <w:r>
-          <w:rPr>
-            <w:noProof/>
-            <w:webHidden/>
-          </w:rPr>
-          <w:fldChar w:fldCharType="separate"/>
-        </w:r>
-        <w:r>
-          <w:rPr>
-            <w:noProof/>
-            <w:webHidden/>
-          </w:rPr>
-          <w:t>4</w:t>
-        </w:r>
-        <w:r>
-          <w:rPr>
-            <w:noProof/>
-            <w:webHidden/>
-          </w:rPr>
-          <w:fldChar w:fldCharType="end"/>
-        </w:r>
-      </w:hyperlink>
-    </w:p>
-    <w:p>
-      <w:pPr>
-        <w:pStyle w:val="TM2"/>
-        <w:tabs>
-          <w:tab w:val="left" w:pos="800"/>
-          <w:tab w:val="right" w:leader="dot" w:pos="9060"/>
-        </w:tabs>
-        <w:rPr>
-          <w:rFonts w:eastAsiaTheme="minorEastAsia" w:cstheme="minorBidi"/>
-          <w:smallCaps w:val="0"/>
-          <w:noProof/>
-          <w:sz w:val="22"/>
-          <w:szCs w:val="22"/>
-        </w:rPr>
-      </w:pPr>
-      <w:hyperlink w:anchor="_Toc308526330" w:history="1">
-        <w:r>
-          <w:rPr>
-            <w:rStyle w:val="Lienhypertexte"/>
-            <w:noProof/>
-          </w:rPr>
-          <w:t>1.7</w:t>
-        </w:r>
-        <w:r>
-          <w:rPr>
-            <w:rFonts w:eastAsiaTheme="minorEastAsia" w:cstheme="minorBidi"/>
-            <w:smallCaps w:val="0"/>
-            <w:noProof/>
-            <w:sz w:val="22"/>
-            <w:szCs w:val="22"/>
-          </w:rPr>
-          <w:tab/>
-        </w:r>
-        <w:r>
-          <w:rPr>
-            <w:rStyle w:val="Lienhypertexte"/>
-            <w:noProof/>
-          </w:rPr>
-          <w:t>Validation et conditions de réussite</w:t>
-        </w:r>
-        <w:r>
-          <w:rPr>
-            <w:noProof/>
-            <w:webHidden/>
-          </w:rPr>
-          <w:tab/>
-        </w:r>
-        <w:r>
-          <w:rPr>
-            <w:noProof/>
-            <w:webHidden/>
-          </w:rPr>
-          <w:fldChar w:fldCharType="begin"/>
-        </w:r>
-        <w:r>
-          <w:rPr>
-            <w:noProof/>
-            <w:webHidden/>
-          </w:rPr>
-          <w:instrText xml:space="preserve"> PAGEREF _Toc308526330 \h </w:instrText>
-        </w:r>
-        <w:r>
-          <w:rPr>
-            <w:noProof/>
-            <w:webHidden/>
-          </w:rPr>
-        </w:r>
-        <w:r>
-          <w:rPr>
-            <w:noProof/>
-            <w:webHidden/>
-          </w:rPr>
-          <w:fldChar w:fldCharType="separate"/>
-        </w:r>
-        <w:r>
-          <w:rPr>
-            <w:noProof/>
-            <w:webHidden/>
-          </w:rPr>
-          <w:t>4</w:t>
         </w:r>
         <w:r>
           <w:rPr>
@@ -1531,11 +732,13 @@
           <w:bCs w:val="0"/>
           <w:caps w:val="0"/>
           <w:noProof/>
-          <w:sz w:val="22"/>
-          <w:szCs w:val="22"/>
+          <w:kern w:val="2"/>
+          <w:sz w:val="24"/>
+          <w:szCs w:val="24"/>
+          <w14:ligatures w14:val="standardContextual"/>
         </w:rPr>
       </w:pPr>
-      <w:hyperlink w:anchor="_Toc308526331" w:history="1">
+      <w:hyperlink w:anchor="_Toc239402427" w:history="1">
         <w:r>
           <w:rPr>
             <w:rStyle w:val="Lienhypertexte"/>
@@ -1550,8 +753,10 @@
             <w:bCs w:val="0"/>
             <w:caps w:val="0"/>
             <w:noProof/>
-            <w:sz w:val="22"/>
-            <w:szCs w:val="22"/>
+            <w:kern w:val="2"/>
+            <w:sz w:val="24"/>
+            <w:szCs w:val="24"/>
+            <w14:ligatures w14:val="standardContextual"/>
           </w:rPr>
           <w:tab/>
         </w:r>
@@ -1581,7 +786,7 @@
             <w:noProof/>
             <w:webHidden/>
           </w:rPr>
-          <w:instrText xml:space="preserve"> PAGEREF _Toc308526331 \h </w:instrText>
+          <w:instrText xml:space="preserve"> PAGEREF _Toc239402427 \h </w:instrText>
         </w:r>
         <w:r>
           <w:rPr>
@@ -1601,7 +806,7 @@
             <w:noProof/>
             <w:webHidden/>
           </w:rPr>
-          <w:t>4</w:t>
+          <w:t>3</w:t>
         </w:r>
         <w:r>
           <w:rPr>
@@ -1625,11 +830,13 @@
           <w:bCs w:val="0"/>
           <w:caps w:val="0"/>
           <w:noProof/>
-          <w:sz w:val="22"/>
-          <w:szCs w:val="22"/>
+          <w:kern w:val="2"/>
+          <w:sz w:val="24"/>
+          <w:szCs w:val="24"/>
+          <w14:ligatures w14:val="standardContextual"/>
         </w:rPr>
       </w:pPr>
-      <w:hyperlink w:anchor="_Toc308526332" w:history="1">
+      <w:hyperlink w:anchor="_Toc239402428" w:history="1">
         <w:r>
           <w:rPr>
             <w:rStyle w:val="Lienhypertexte"/>
@@ -1644,8 +851,10 @@
             <w:bCs w:val="0"/>
             <w:caps w:val="0"/>
             <w:noProof/>
-            <w:sz w:val="22"/>
-            <w:szCs w:val="22"/>
+            <w:kern w:val="2"/>
+            <w:sz w:val="24"/>
+            <w:szCs w:val="24"/>
+            <w14:ligatures w14:val="standardContextual"/>
           </w:rPr>
           <w:tab/>
         </w:r>
@@ -1675,7 +884,7 @@
             <w:noProof/>
             <w:webHidden/>
           </w:rPr>
-          <w:instrText xml:space="preserve"> PAGEREF _Toc308526332 \h </w:instrText>
+          <w:instrText xml:space="preserve"> PAGEREF _Toc239402428 \h </w:instrText>
         </w:r>
         <w:r>
           <w:rPr>
@@ -1695,367 +904,7 @@
             <w:noProof/>
             <w:webHidden/>
           </w:rPr>
-          <w:t>4</w:t>
-        </w:r>
-        <w:r>
-          <w:rPr>
-            <w:noProof/>
-            <w:webHidden/>
-          </w:rPr>
-          <w:fldChar w:fldCharType="end"/>
-        </w:r>
-      </w:hyperlink>
-    </w:p>
-    <w:p>
-      <w:pPr>
-        <w:pStyle w:val="TM2"/>
-        <w:tabs>
-          <w:tab w:val="left" w:pos="800"/>
-          <w:tab w:val="right" w:leader="dot" w:pos="9060"/>
-        </w:tabs>
-        <w:rPr>
-          <w:rFonts w:eastAsiaTheme="minorEastAsia" w:cstheme="minorBidi"/>
-          <w:smallCaps w:val="0"/>
-          <w:noProof/>
-          <w:sz w:val="22"/>
-          <w:szCs w:val="22"/>
-        </w:rPr>
-      </w:pPr>
-      <w:hyperlink w:anchor="_Toc308526333" w:history="1">
-        <w:r>
-          <w:rPr>
-            <w:rStyle w:val="Lienhypertexte"/>
-            <w:noProof/>
-          </w:rPr>
-          <w:t>3.1</w:t>
-        </w:r>
-        <w:r>
-          <w:rPr>
-            <w:rFonts w:eastAsiaTheme="minorEastAsia" w:cstheme="minorBidi"/>
-            <w:smallCaps w:val="0"/>
-            <w:noProof/>
-            <w:sz w:val="22"/>
-            <w:szCs w:val="22"/>
-          </w:rPr>
-          <w:tab/>
-        </w:r>
-        <w:r>
-          <w:rPr>
-            <w:rStyle w:val="Lienhypertexte"/>
-            <w:noProof/>
-          </w:rPr>
-          <w:t>Opportunités</w:t>
-        </w:r>
-        <w:r>
-          <w:rPr>
-            <w:noProof/>
-            <w:webHidden/>
-          </w:rPr>
-          <w:tab/>
-        </w:r>
-        <w:r>
-          <w:rPr>
-            <w:noProof/>
-            <w:webHidden/>
-          </w:rPr>
-          <w:fldChar w:fldCharType="begin"/>
-        </w:r>
-        <w:r>
-          <w:rPr>
-            <w:noProof/>
-            <w:webHidden/>
-          </w:rPr>
-          <w:instrText xml:space="preserve"> PAGEREF _Toc308526333 \h </w:instrText>
-        </w:r>
-        <w:r>
-          <w:rPr>
-            <w:noProof/>
-            <w:webHidden/>
-          </w:rPr>
-        </w:r>
-        <w:r>
-          <w:rPr>
-            <w:noProof/>
-            <w:webHidden/>
-          </w:rPr>
-          <w:fldChar w:fldCharType="separate"/>
-        </w:r>
-        <w:r>
-          <w:rPr>
-            <w:noProof/>
-            <w:webHidden/>
-          </w:rPr>
-          <w:t>4</w:t>
-        </w:r>
-        <w:r>
-          <w:rPr>
-            <w:noProof/>
-            <w:webHidden/>
-          </w:rPr>
-          <w:fldChar w:fldCharType="end"/>
-        </w:r>
-      </w:hyperlink>
-    </w:p>
-    <w:p>
-      <w:pPr>
-        <w:pStyle w:val="TM2"/>
-        <w:tabs>
-          <w:tab w:val="left" w:pos="800"/>
-          <w:tab w:val="right" w:leader="dot" w:pos="9060"/>
-        </w:tabs>
-        <w:rPr>
-          <w:rFonts w:eastAsiaTheme="minorEastAsia" w:cstheme="minorBidi"/>
-          <w:smallCaps w:val="0"/>
-          <w:noProof/>
-          <w:sz w:val="22"/>
-          <w:szCs w:val="22"/>
-        </w:rPr>
-      </w:pPr>
-      <w:hyperlink w:anchor="_Toc308526334" w:history="1">
-        <w:r>
-          <w:rPr>
-            <w:rStyle w:val="Lienhypertexte"/>
-            <w:noProof/>
-          </w:rPr>
-          <w:t>3.2</w:t>
-        </w:r>
-        <w:r>
-          <w:rPr>
-            <w:rFonts w:eastAsiaTheme="minorEastAsia" w:cstheme="minorBidi"/>
-            <w:smallCaps w:val="0"/>
-            <w:noProof/>
-            <w:sz w:val="22"/>
-            <w:szCs w:val="22"/>
-          </w:rPr>
-          <w:tab/>
-        </w:r>
-        <w:r>
-          <w:rPr>
-            <w:rStyle w:val="Lienhypertexte"/>
-            <w:noProof/>
-          </w:rPr>
-          <w:t>Document d’analyse et conception</w:t>
-        </w:r>
-        <w:r>
-          <w:rPr>
-            <w:noProof/>
-            <w:webHidden/>
-          </w:rPr>
-          <w:tab/>
-        </w:r>
-        <w:r>
-          <w:rPr>
-            <w:noProof/>
-            <w:webHidden/>
-          </w:rPr>
-          <w:fldChar w:fldCharType="begin"/>
-        </w:r>
-        <w:r>
-          <w:rPr>
-            <w:noProof/>
-            <w:webHidden/>
-          </w:rPr>
-          <w:instrText xml:space="preserve"> PAGEREF _Toc308526334 \h </w:instrText>
-        </w:r>
-        <w:r>
-          <w:rPr>
-            <w:noProof/>
-            <w:webHidden/>
-          </w:rPr>
-        </w:r>
-        <w:r>
-          <w:rPr>
-            <w:noProof/>
-            <w:webHidden/>
-          </w:rPr>
-          <w:fldChar w:fldCharType="separate"/>
-        </w:r>
-        <w:r>
-          <w:rPr>
-            <w:noProof/>
-            <w:webHidden/>
-          </w:rPr>
-          <w:t>4</w:t>
-        </w:r>
-        <w:r>
-          <w:rPr>
-            <w:noProof/>
-            <w:webHidden/>
-          </w:rPr>
-          <w:fldChar w:fldCharType="end"/>
-        </w:r>
-      </w:hyperlink>
-    </w:p>
-    <w:p>
-      <w:pPr>
-        <w:pStyle w:val="TM2"/>
-        <w:tabs>
-          <w:tab w:val="left" w:pos="800"/>
-          <w:tab w:val="right" w:leader="dot" w:pos="9060"/>
-        </w:tabs>
-        <w:rPr>
-          <w:rFonts w:eastAsiaTheme="minorEastAsia" w:cstheme="minorBidi"/>
-          <w:smallCaps w:val="0"/>
-          <w:noProof/>
-          <w:sz w:val="22"/>
-          <w:szCs w:val="22"/>
-        </w:rPr>
-      </w:pPr>
-      <w:hyperlink w:anchor="_Toc308526335" w:history="1">
-        <w:r>
-          <w:rPr>
-            <w:rStyle w:val="Lienhypertexte"/>
-            <w:noProof/>
-          </w:rPr>
-          <w:t>3.3</w:t>
-        </w:r>
-        <w:r>
-          <w:rPr>
-            <w:rFonts w:eastAsiaTheme="minorEastAsia" w:cstheme="minorBidi"/>
-            <w:smallCaps w:val="0"/>
-            <w:noProof/>
-            <w:sz w:val="22"/>
-            <w:szCs w:val="22"/>
-          </w:rPr>
-          <w:tab/>
-        </w:r>
-        <w:r>
-          <w:rPr>
-            <w:rStyle w:val="Lienhypertexte"/>
-            <w:noProof/>
-          </w:rPr>
-          <w:t>Conception des tests</w:t>
-        </w:r>
-        <w:r>
-          <w:rPr>
-            <w:noProof/>
-            <w:webHidden/>
-          </w:rPr>
-          <w:tab/>
-        </w:r>
-        <w:r>
-          <w:rPr>
-            <w:noProof/>
-            <w:webHidden/>
-          </w:rPr>
-          <w:fldChar w:fldCharType="begin"/>
-        </w:r>
-        <w:r>
-          <w:rPr>
-            <w:noProof/>
-            <w:webHidden/>
-          </w:rPr>
-          <w:instrText xml:space="preserve"> PAGEREF _Toc308526335 \h </w:instrText>
-        </w:r>
-        <w:r>
-          <w:rPr>
-            <w:noProof/>
-            <w:webHidden/>
-          </w:rPr>
-        </w:r>
-        <w:r>
-          <w:rPr>
-            <w:noProof/>
-            <w:webHidden/>
-          </w:rPr>
-          <w:fldChar w:fldCharType="separate"/>
-        </w:r>
-        <w:r>
-          <w:rPr>
-            <w:noProof/>
-            <w:webHidden/>
-          </w:rPr>
-          <w:t>5</w:t>
-        </w:r>
-        <w:r>
-          <w:rPr>
-            <w:noProof/>
-            <w:webHidden/>
-          </w:rPr>
-          <w:fldChar w:fldCharType="end"/>
-        </w:r>
-      </w:hyperlink>
-    </w:p>
-    <w:p>
-      <w:pPr>
-        <w:pStyle w:val="TM2"/>
-        <w:tabs>
-          <w:tab w:val="left" w:pos="800"/>
-          <w:tab w:val="right" w:leader="dot" w:pos="9060"/>
-        </w:tabs>
-        <w:rPr>
-          <w:rFonts w:eastAsiaTheme="minorEastAsia" w:cstheme="minorBidi"/>
-          <w:smallCaps w:val="0"/>
-          <w:noProof/>
-          <w:sz w:val="22"/>
-          <w:szCs w:val="22"/>
-        </w:rPr>
-      </w:pPr>
-      <w:hyperlink w:anchor="_Toc308526336" w:history="1">
-        <w:r>
-          <w:rPr>
-            <w:rStyle w:val="Lienhypertexte"/>
-            <w:noProof/>
-          </w:rPr>
-          <w:t>3.4</w:t>
-        </w:r>
-        <w:r>
-          <w:rPr>
-            <w:rFonts w:eastAsiaTheme="minorEastAsia" w:cstheme="minorBidi"/>
-            <w:smallCaps w:val="0"/>
-            <w:noProof/>
-            <w:sz w:val="22"/>
-            <w:szCs w:val="22"/>
-          </w:rPr>
-          <w:tab/>
-        </w:r>
-        <w:r>
-          <w:rPr>
-            <w:rStyle w:val="Lienhypertexte"/>
-            <w:noProof/>
-          </w:rPr>
-          <w:t>Planification détaillée</w:t>
-        </w:r>
-        <w:r>
-          <w:rPr>
-            <w:noProof/>
-            <w:webHidden/>
-          </w:rPr>
-          <w:tab/>
-        </w:r>
-        <w:r>
-          <w:rPr>
-            <w:noProof/>
-            <w:webHidden/>
-          </w:rPr>
-          <w:fldChar w:fldCharType="begin"/>
-        </w:r>
-        <w:r>
-          <w:rPr>
-            <w:noProof/>
-            <w:webHidden/>
-          </w:rPr>
-          <w:instrText xml:space="preserve"> PAGEREF _Toc308526336 \h </w:instrText>
-        </w:r>
-        <w:r>
-          <w:rPr>
-            <w:noProof/>
-            <w:webHidden/>
-          </w:rPr>
-        </w:r>
-        <w:r>
-          <w:rPr>
-            <w:noProof/>
-            <w:webHidden/>
-          </w:rPr>
-          <w:fldChar w:fldCharType="separate"/>
-        </w:r>
-        <w:r>
-          <w:rPr>
-            <w:noProof/>
-            <w:webHidden/>
-          </w:rPr>
-          <w:t>5</w:t>
+          <w:t>3</w:t>
         </w:r>
         <w:r>
           <w:rPr>
@@ -2079,11 +928,13 @@
           <w:bCs w:val="0"/>
           <w:caps w:val="0"/>
           <w:noProof/>
-          <w:sz w:val="22"/>
-          <w:szCs w:val="22"/>
+          <w:kern w:val="2"/>
+          <w:sz w:val="24"/>
+          <w:szCs w:val="24"/>
+          <w14:ligatures w14:val="standardContextual"/>
         </w:rPr>
       </w:pPr>
-      <w:hyperlink w:anchor="_Toc308526337" w:history="1">
+      <w:hyperlink w:anchor="_Toc239402429" w:history="1">
         <w:r>
           <w:rPr>
             <w:rStyle w:val="Lienhypertexte"/>
@@ -2098,8 +949,10 @@
             <w:bCs w:val="0"/>
             <w:caps w:val="0"/>
             <w:noProof/>
-            <w:sz w:val="22"/>
-            <w:szCs w:val="22"/>
+            <w:kern w:val="2"/>
+            <w:sz w:val="24"/>
+            <w:szCs w:val="24"/>
+            <w14:ligatures w14:val="standardContextual"/>
           </w:rPr>
           <w:tab/>
         </w:r>
@@ -2129,7 +982,7 @@
             <w:noProof/>
             <w:webHidden/>
           </w:rPr>
-          <w:instrText xml:space="preserve"> PAGEREF _Toc308526337 \h </w:instrText>
+          <w:instrText xml:space="preserve"> PAGEREF _Toc239402429 \h </w:instrText>
         </w:r>
         <w:r>
           <w:rPr>
@@ -2149,7 +1002,7 @@
             <w:noProof/>
             <w:webHidden/>
           </w:rPr>
-          <w:t>5</w:t>
+          <w:t>4</w:t>
         </w:r>
         <w:r>
           <w:rPr>
@@ -2171,11 +1024,13 @@
           <w:rFonts w:eastAsiaTheme="minorEastAsia" w:cstheme="minorBidi"/>
           <w:smallCaps w:val="0"/>
           <w:noProof/>
-          <w:sz w:val="22"/>
-          <w:szCs w:val="22"/>
+          <w:kern w:val="2"/>
+          <w:sz w:val="24"/>
+          <w:szCs w:val="24"/>
+          <w14:ligatures w14:val="standardContextual"/>
         </w:rPr>
       </w:pPr>
-      <w:hyperlink w:anchor="_Toc308526338" w:history="1">
+      <w:hyperlink w:anchor="_Toc239402430" w:history="1">
         <w:r>
           <w:rPr>
             <w:rStyle w:val="Lienhypertexte"/>
@@ -2188,8 +1043,10 @@
             <w:rFonts w:eastAsiaTheme="minorEastAsia" w:cstheme="minorBidi"/>
             <w:smallCaps w:val="0"/>
             <w:noProof/>
-            <w:sz w:val="22"/>
-            <w:szCs w:val="22"/>
+            <w:kern w:val="2"/>
+            <w:sz w:val="24"/>
+            <w:szCs w:val="24"/>
+            <w14:ligatures w14:val="standardContextual"/>
           </w:rPr>
           <w:tab/>
         </w:r>
@@ -2219,7 +1076,7 @@
             <w:noProof/>
             <w:webHidden/>
           </w:rPr>
-          <w:instrText xml:space="preserve"> PAGEREF _Toc308526338 \h </w:instrText>
+          <w:instrText xml:space="preserve"> PAGEREF _Toc239402430 \h </w:instrText>
         </w:r>
         <w:r>
           <w:rPr>
@@ -2239,7 +1096,7 @@
             <w:noProof/>
             <w:webHidden/>
           </w:rPr>
-          <w:t>5</w:t>
+          <w:t>4</w:t>
         </w:r>
         <w:r>
           <w:rPr>
@@ -2261,11 +1118,13 @@
           <w:rFonts w:eastAsiaTheme="minorEastAsia" w:cstheme="minorBidi"/>
           <w:smallCaps w:val="0"/>
           <w:noProof/>
-          <w:sz w:val="22"/>
-          <w:szCs w:val="22"/>
+          <w:kern w:val="2"/>
+          <w:sz w:val="24"/>
+          <w:szCs w:val="24"/>
+          <w14:ligatures w14:val="standardContextual"/>
         </w:rPr>
       </w:pPr>
-      <w:hyperlink w:anchor="_Toc308526339" w:history="1">
+      <w:hyperlink w:anchor="_Toc239402431" w:history="1">
         <w:r>
           <w:rPr>
             <w:rStyle w:val="Lienhypertexte"/>
@@ -2278,8 +1137,10 @@
             <w:rFonts w:eastAsiaTheme="minorEastAsia" w:cstheme="minorBidi"/>
             <w:smallCaps w:val="0"/>
             <w:noProof/>
-            <w:sz w:val="22"/>
-            <w:szCs w:val="22"/>
+            <w:kern w:val="2"/>
+            <w:sz w:val="24"/>
+            <w:szCs w:val="24"/>
+            <w14:ligatures w14:val="standardContextual"/>
           </w:rPr>
           <w:tab/>
         </w:r>
@@ -2309,7 +1170,7 @@
             <w:noProof/>
             <w:webHidden/>
           </w:rPr>
-          <w:instrText xml:space="preserve"> PAGEREF _Toc308526339 \h </w:instrText>
+          <w:instrText xml:space="preserve"> PAGEREF _Toc239402431 \h </w:instrText>
         </w:r>
         <w:r>
           <w:rPr>
@@ -2329,7 +1190,7 @@
             <w:noProof/>
             <w:webHidden/>
           </w:rPr>
-          <w:t>5</w:t>
+          <w:t>4</w:t>
         </w:r>
         <w:r>
           <w:rPr>
@@ -2353,11 +1214,13 @@
           <w:bCs w:val="0"/>
           <w:caps w:val="0"/>
           <w:noProof/>
-          <w:sz w:val="22"/>
-          <w:szCs w:val="22"/>
+          <w:kern w:val="2"/>
+          <w:sz w:val="24"/>
+          <w:szCs w:val="24"/>
+          <w14:ligatures w14:val="standardContextual"/>
         </w:rPr>
       </w:pPr>
-      <w:hyperlink w:anchor="_Toc308526340" w:history="1">
+      <w:hyperlink w:anchor="_Toc239402432" w:history="1">
         <w:r>
           <w:rPr>
             <w:rStyle w:val="Lienhypertexte"/>
@@ -2372,8 +1235,10 @@
             <w:bCs w:val="0"/>
             <w:caps w:val="0"/>
             <w:noProof/>
-            <w:sz w:val="22"/>
-            <w:szCs w:val="22"/>
+            <w:kern w:val="2"/>
+            <w:sz w:val="24"/>
+            <w:szCs w:val="24"/>
+            <w14:ligatures w14:val="standardContextual"/>
           </w:rPr>
           <w:tab/>
         </w:r>
@@ -2403,7 +1268,7 @@
             <w:noProof/>
             <w:webHidden/>
           </w:rPr>
-          <w:instrText xml:space="preserve"> PAGEREF _Toc308526340 \h </w:instrText>
+          <w:instrText xml:space="preserve"> PAGEREF _Toc239402432 \h </w:instrText>
         </w:r>
         <w:r>
           <w:rPr>
@@ -2423,7 +1288,7 @@
             <w:noProof/>
             <w:webHidden/>
           </w:rPr>
-          <w:t>5</w:t>
+          <w:t>4</w:t>
         </w:r>
         <w:r>
           <w:rPr>
@@ -2445,11 +1310,13 @@
           <w:rFonts w:eastAsiaTheme="minorEastAsia" w:cstheme="minorBidi"/>
           <w:smallCaps w:val="0"/>
           <w:noProof/>
-          <w:sz w:val="22"/>
-          <w:szCs w:val="22"/>
+          <w:kern w:val="2"/>
+          <w:sz w:val="24"/>
+          <w:szCs w:val="24"/>
+          <w14:ligatures w14:val="standardContextual"/>
         </w:rPr>
       </w:pPr>
-      <w:hyperlink w:anchor="_Toc308526341" w:history="1">
+      <w:hyperlink w:anchor="_Toc239402433" w:history="1">
         <w:r>
           <w:rPr>
             <w:rStyle w:val="Lienhypertexte"/>
@@ -2462,8 +1329,10 @@
             <w:rFonts w:eastAsiaTheme="minorEastAsia" w:cstheme="minorBidi"/>
             <w:smallCaps w:val="0"/>
             <w:noProof/>
-            <w:sz w:val="22"/>
-            <w:szCs w:val="22"/>
+            <w:kern w:val="2"/>
+            <w:sz w:val="24"/>
+            <w:szCs w:val="24"/>
+            <w14:ligatures w14:val="standardContextual"/>
           </w:rPr>
           <w:tab/>
         </w:r>
@@ -2493,7 +1362,7 @@
             <w:noProof/>
             <w:webHidden/>
           </w:rPr>
-          <w:instrText xml:space="preserve"> PAGEREF _Toc308526341 \h </w:instrText>
+          <w:instrText xml:space="preserve"> PAGEREF _Toc239402433 \h </w:instrText>
         </w:r>
         <w:r>
           <w:rPr>
@@ -2513,7 +1382,7 @@
             <w:noProof/>
             <w:webHidden/>
           </w:rPr>
-          <w:t>5</w:t>
+          <w:t>4</w:t>
         </w:r>
         <w:r>
           <w:rPr>
@@ -2537,11 +1406,13 @@
           <w:bCs w:val="0"/>
           <w:caps w:val="0"/>
           <w:noProof/>
-          <w:sz w:val="22"/>
-          <w:szCs w:val="22"/>
+          <w:kern w:val="2"/>
+          <w:sz w:val="24"/>
+          <w:szCs w:val="24"/>
+          <w14:ligatures w14:val="standardContextual"/>
         </w:rPr>
       </w:pPr>
-      <w:hyperlink w:anchor="_Toc308526342" w:history="1">
+      <w:hyperlink w:anchor="_Toc239402434" w:history="1">
         <w:r>
           <w:rPr>
             <w:rStyle w:val="Lienhypertexte"/>
@@ -2556,8 +1427,10 @@
             <w:bCs w:val="0"/>
             <w:caps w:val="0"/>
             <w:noProof/>
-            <w:sz w:val="22"/>
-            <w:szCs w:val="22"/>
+            <w:kern w:val="2"/>
+            <w:sz w:val="24"/>
+            <w:szCs w:val="24"/>
+            <w14:ligatures w14:val="standardContextual"/>
           </w:rPr>
           <w:tab/>
         </w:r>
@@ -2587,7 +1460,7 @@
             <w:noProof/>
             <w:webHidden/>
           </w:rPr>
-          <w:instrText xml:space="preserve"> PAGEREF _Toc308526342 \h </w:instrText>
+          <w:instrText xml:space="preserve"> PAGEREF _Toc239402434 \h </w:instrText>
         </w:r>
         <w:r>
           <w:rPr>
@@ -2607,7 +1480,7 @@
             <w:noProof/>
             <w:webHidden/>
           </w:rPr>
-          <w:t>5</w:t>
+          <w:t>4</w:t>
         </w:r>
         <w:r>
           <w:rPr>
@@ -2629,11 +1502,13 @@
           <w:rFonts w:eastAsiaTheme="minorEastAsia" w:cstheme="minorBidi"/>
           <w:smallCaps w:val="0"/>
           <w:noProof/>
-          <w:sz w:val="22"/>
-          <w:szCs w:val="22"/>
+          <w:kern w:val="2"/>
+          <w:sz w:val="24"/>
+          <w:szCs w:val="24"/>
+          <w14:ligatures w14:val="standardContextual"/>
         </w:rPr>
       </w:pPr>
-      <w:hyperlink w:anchor="_Toc308526343" w:history="1">
+      <w:hyperlink w:anchor="_Toc239402435" w:history="1">
         <w:r>
           <w:rPr>
             <w:rStyle w:val="Lienhypertexte"/>
@@ -2646,8 +1521,10 @@
             <w:rFonts w:eastAsiaTheme="minorEastAsia" w:cstheme="minorBidi"/>
             <w:smallCaps w:val="0"/>
             <w:noProof/>
-            <w:sz w:val="22"/>
-            <w:szCs w:val="22"/>
+            <w:kern w:val="2"/>
+            <w:sz w:val="24"/>
+            <w:szCs w:val="24"/>
+            <w14:ligatures w14:val="standardContextual"/>
           </w:rPr>
           <w:tab/>
         </w:r>
@@ -2677,7 +1554,7 @@
             <w:noProof/>
             <w:webHidden/>
           </w:rPr>
-          <w:instrText xml:space="preserve"> PAGEREF _Toc308526343 \h </w:instrText>
+          <w:instrText xml:space="preserve"> PAGEREF _Toc239402435 \h </w:instrText>
         </w:r>
         <w:r>
           <w:rPr>
@@ -2697,7 +1574,7 @@
             <w:noProof/>
             <w:webHidden/>
           </w:rPr>
-          <w:t>5</w:t>
+          <w:t>4</w:t>
         </w:r>
         <w:r>
           <w:rPr>
@@ -2719,11 +1596,13 @@
           <w:rFonts w:eastAsiaTheme="minorEastAsia" w:cstheme="minorBidi"/>
           <w:smallCaps w:val="0"/>
           <w:noProof/>
-          <w:sz w:val="22"/>
-          <w:szCs w:val="22"/>
+          <w:kern w:val="2"/>
+          <w:sz w:val="24"/>
+          <w:szCs w:val="24"/>
+          <w14:ligatures w14:val="standardContextual"/>
         </w:rPr>
       </w:pPr>
-      <w:hyperlink w:anchor="_Toc308526344" w:history="1">
+      <w:hyperlink w:anchor="_Toc239402436" w:history="1">
         <w:r>
           <w:rPr>
             <w:rStyle w:val="Lienhypertexte"/>
@@ -2736,8 +1615,10 @@
             <w:rFonts w:eastAsiaTheme="minorEastAsia" w:cstheme="minorBidi"/>
             <w:smallCaps w:val="0"/>
             <w:noProof/>
-            <w:sz w:val="22"/>
-            <w:szCs w:val="22"/>
+            <w:kern w:val="2"/>
+            <w:sz w:val="24"/>
+            <w:szCs w:val="24"/>
+            <w14:ligatures w14:val="standardContextual"/>
           </w:rPr>
           <w:tab/>
         </w:r>
@@ -2767,7 +1648,7 @@
             <w:noProof/>
             <w:webHidden/>
           </w:rPr>
-          <w:instrText xml:space="preserve"> PAGEREF _Toc308526344 \h </w:instrText>
+          <w:instrText xml:space="preserve"> PAGEREF _Toc239402436 \h </w:instrText>
         </w:r>
         <w:r>
           <w:rPr>
@@ -2787,7 +1668,7 @@
             <w:noProof/>
             <w:webHidden/>
           </w:rPr>
-          <w:t>5</w:t>
+          <w:t>4</w:t>
         </w:r>
         <w:r>
           <w:rPr>
@@ -2809,11 +1690,13 @@
           <w:rFonts w:eastAsiaTheme="minorEastAsia" w:cstheme="minorBidi"/>
           <w:smallCaps w:val="0"/>
           <w:noProof/>
-          <w:sz w:val="22"/>
-          <w:szCs w:val="22"/>
+          <w:kern w:val="2"/>
+          <w:sz w:val="24"/>
+          <w:szCs w:val="24"/>
+          <w14:ligatures w14:val="standardContextual"/>
         </w:rPr>
       </w:pPr>
-      <w:hyperlink w:anchor="_Toc308526345" w:history="1">
+      <w:hyperlink w:anchor="_Toc239402437" w:history="1">
         <w:r>
           <w:rPr>
             <w:rStyle w:val="Lienhypertexte"/>
@@ -2826,8 +1709,10 @@
             <w:rFonts w:eastAsiaTheme="minorEastAsia" w:cstheme="minorBidi"/>
             <w:smallCaps w:val="0"/>
             <w:noProof/>
-            <w:sz w:val="22"/>
-            <w:szCs w:val="22"/>
+            <w:kern w:val="2"/>
+            <w:sz w:val="24"/>
+            <w:szCs w:val="24"/>
+            <w14:ligatures w14:val="standardContextual"/>
           </w:rPr>
           <w:tab/>
         </w:r>
@@ -2857,7 +1742,7 @@
             <w:noProof/>
             <w:webHidden/>
           </w:rPr>
-          <w:instrText xml:space="preserve"> PAGEREF _Toc308526345 \h </w:instrText>
+          <w:instrText xml:space="preserve"> PAGEREF _Toc239402437 \h </w:instrText>
         </w:r>
         <w:r>
           <w:rPr>
@@ -2901,11 +1786,13 @@
           <w:bCs w:val="0"/>
           <w:caps w:val="0"/>
           <w:noProof/>
-          <w:sz w:val="22"/>
-          <w:szCs w:val="22"/>
+          <w:kern w:val="2"/>
+          <w:sz w:val="24"/>
+          <w:szCs w:val="24"/>
+          <w14:ligatures w14:val="standardContextual"/>
         </w:rPr>
       </w:pPr>
-      <w:hyperlink w:anchor="_Toc308526346" w:history="1">
+      <w:hyperlink w:anchor="_Toc239402438" w:history="1">
         <w:r>
           <w:rPr>
             <w:rStyle w:val="Lienhypertexte"/>
@@ -2920,8 +1807,10 @@
             <w:bCs w:val="0"/>
             <w:caps w:val="0"/>
             <w:noProof/>
-            <w:sz w:val="22"/>
-            <w:szCs w:val="22"/>
+            <w:kern w:val="2"/>
+            <w:sz w:val="24"/>
+            <w:szCs w:val="24"/>
+            <w14:ligatures w14:val="standardContextual"/>
           </w:rPr>
           <w:tab/>
         </w:r>
@@ -2951,7 +1840,7 @@
             <w:noProof/>
             <w:webHidden/>
           </w:rPr>
-          <w:instrText xml:space="preserve"> PAGEREF _Toc308526346 \h </w:instrText>
+          <w:instrText xml:space="preserve"> PAGEREF _Toc239402438 \h </w:instrText>
         </w:r>
         <w:r>
           <w:rPr>
@@ -2971,7 +1860,7 @@
             <w:noProof/>
             <w:webHidden/>
           </w:rPr>
-          <w:t>6</w:t>
+          <w:t>5</w:t>
         </w:r>
         <w:r>
           <w:rPr>
@@ -2993,11 +1882,13 @@
           <w:rFonts w:eastAsiaTheme="minorEastAsia" w:cstheme="minorBidi"/>
           <w:smallCaps w:val="0"/>
           <w:noProof/>
-          <w:sz w:val="22"/>
-          <w:szCs w:val="22"/>
+          <w:kern w:val="2"/>
+          <w:sz w:val="24"/>
+          <w:szCs w:val="24"/>
+          <w14:ligatures w14:val="standardContextual"/>
         </w:rPr>
       </w:pPr>
-      <w:hyperlink w:anchor="_Toc308526347" w:history="1">
+      <w:hyperlink w:anchor="_Toc239402439" w:history="1">
         <w:r>
           <w:rPr>
             <w:rStyle w:val="Lienhypertexte"/>
@@ -3010,8 +1901,10 @@
             <w:rFonts w:eastAsiaTheme="minorEastAsia" w:cstheme="minorBidi"/>
             <w:smallCaps w:val="0"/>
             <w:noProof/>
-            <w:sz w:val="22"/>
-            <w:szCs w:val="22"/>
+            <w:kern w:val="2"/>
+            <w:sz w:val="24"/>
+            <w:szCs w:val="24"/>
+            <w14:ligatures w14:val="standardContextual"/>
           </w:rPr>
           <w:tab/>
         </w:r>
@@ -3041,7 +1934,7 @@
             <w:noProof/>
             <w:webHidden/>
           </w:rPr>
-          <w:instrText xml:space="preserve"> PAGEREF _Toc308526347 \h </w:instrText>
+          <w:instrText xml:space="preserve"> PAGEREF _Toc239402439 \h </w:instrText>
         </w:r>
         <w:r>
           <w:rPr>
@@ -3061,187 +1954,7 @@
             <w:noProof/>
             <w:webHidden/>
           </w:rPr>
-          <w:t>6</w:t>
-        </w:r>
-        <w:r>
-          <w:rPr>
-            <w:noProof/>
-            <w:webHidden/>
-          </w:rPr>
-          <w:fldChar w:fldCharType="end"/>
-        </w:r>
-      </w:hyperlink>
-    </w:p>
-    <w:p>
-      <w:pPr>
-        <w:pStyle w:val="TM2"/>
-        <w:tabs>
-          <w:tab w:val="left" w:pos="800"/>
-          <w:tab w:val="right" w:leader="dot" w:pos="9060"/>
-        </w:tabs>
-        <w:rPr>
-          <w:rFonts w:eastAsiaTheme="minorEastAsia" w:cstheme="minorBidi"/>
-          <w:smallCaps w:val="0"/>
-          <w:noProof/>
-          <w:sz w:val="22"/>
-          <w:szCs w:val="22"/>
-        </w:rPr>
-      </w:pPr>
-      <w:hyperlink w:anchor="_Toc308526348" w:history="1">
-        <w:r>
-          <w:rPr>
-            <w:rStyle w:val="Lienhypertexte"/>
-            <w:noProof/>
-          </w:rPr>
-          <w:t>7.2</w:t>
-        </w:r>
-        <w:r>
-          <w:rPr>
-            <w:rFonts w:eastAsiaTheme="minorEastAsia" w:cstheme="minorBidi"/>
-            <w:smallCaps w:val="0"/>
-            <w:noProof/>
-            <w:sz w:val="22"/>
-            <w:szCs w:val="22"/>
-          </w:rPr>
-          <w:tab/>
-        </w:r>
-        <w:r>
-          <w:rPr>
-            <w:rStyle w:val="Lienhypertexte"/>
-            <w:noProof/>
-          </w:rPr>
-          <w:t>Bibliographie</w:t>
-        </w:r>
-        <w:r>
-          <w:rPr>
-            <w:noProof/>
-            <w:webHidden/>
-          </w:rPr>
-          <w:tab/>
-        </w:r>
-        <w:r>
-          <w:rPr>
-            <w:noProof/>
-            <w:webHidden/>
-          </w:rPr>
-          <w:fldChar w:fldCharType="begin"/>
-        </w:r>
-        <w:r>
-          <w:rPr>
-            <w:noProof/>
-            <w:webHidden/>
-          </w:rPr>
-          <w:instrText xml:space="preserve"> PAGEREF _Toc308526348 \h </w:instrText>
-        </w:r>
-        <w:r>
-          <w:rPr>
-            <w:noProof/>
-            <w:webHidden/>
-          </w:rPr>
-        </w:r>
-        <w:r>
-          <w:rPr>
-            <w:noProof/>
-            <w:webHidden/>
-          </w:rPr>
-          <w:fldChar w:fldCharType="separate"/>
-        </w:r>
-        <w:r>
-          <w:rPr>
-            <w:noProof/>
-            <w:webHidden/>
-          </w:rPr>
-          <w:t>6</w:t>
-        </w:r>
-        <w:r>
-          <w:rPr>
-            <w:noProof/>
-            <w:webHidden/>
-          </w:rPr>
-          <w:fldChar w:fldCharType="end"/>
-        </w:r>
-      </w:hyperlink>
-    </w:p>
-    <w:p>
-      <w:pPr>
-        <w:pStyle w:val="TM2"/>
-        <w:tabs>
-          <w:tab w:val="left" w:pos="800"/>
-          <w:tab w:val="right" w:leader="dot" w:pos="9060"/>
-        </w:tabs>
-        <w:rPr>
-          <w:rFonts w:eastAsiaTheme="minorEastAsia" w:cstheme="minorBidi"/>
-          <w:smallCaps w:val="0"/>
-          <w:noProof/>
-          <w:sz w:val="22"/>
-          <w:szCs w:val="22"/>
-        </w:rPr>
-      </w:pPr>
-      <w:hyperlink w:anchor="_Toc308526349" w:history="1">
-        <w:r>
-          <w:rPr>
-            <w:rStyle w:val="Lienhypertexte"/>
-            <w:noProof/>
-          </w:rPr>
-          <w:t>7.3</w:t>
-        </w:r>
-        <w:r>
-          <w:rPr>
-            <w:rFonts w:eastAsiaTheme="minorEastAsia" w:cstheme="minorBidi"/>
-            <w:smallCaps w:val="0"/>
-            <w:noProof/>
-            <w:sz w:val="22"/>
-            <w:szCs w:val="22"/>
-          </w:rPr>
-          <w:tab/>
-        </w:r>
-        <w:r>
-          <w:rPr>
-            <w:rStyle w:val="Lienhypertexte"/>
-            <w:noProof/>
-          </w:rPr>
-          <w:t>Webographie</w:t>
-        </w:r>
-        <w:r>
-          <w:rPr>
-            <w:noProof/>
-            <w:webHidden/>
-          </w:rPr>
-          <w:tab/>
-        </w:r>
-        <w:r>
-          <w:rPr>
-            <w:noProof/>
-            <w:webHidden/>
-          </w:rPr>
-          <w:fldChar w:fldCharType="begin"/>
-        </w:r>
-        <w:r>
-          <w:rPr>
-            <w:noProof/>
-            <w:webHidden/>
-          </w:rPr>
-          <w:instrText xml:space="preserve"> PAGEREF _Toc308526349 \h </w:instrText>
-        </w:r>
-        <w:r>
-          <w:rPr>
-            <w:noProof/>
-            <w:webHidden/>
-          </w:rPr>
-        </w:r>
-        <w:r>
-          <w:rPr>
-            <w:noProof/>
-            <w:webHidden/>
-          </w:rPr>
-          <w:fldChar w:fldCharType="separate"/>
-        </w:r>
-        <w:r>
-          <w:rPr>
-            <w:noProof/>
-            <w:webHidden/>
-          </w:rPr>
-          <w:t>6</w:t>
+          <w:t>5</w:t>
         </w:r>
         <w:r>
           <w:rPr>
@@ -3265,11 +1978,13 @@
           <w:bCs w:val="0"/>
           <w:caps w:val="0"/>
           <w:noProof/>
-          <w:sz w:val="22"/>
-          <w:szCs w:val="22"/>
+          <w:kern w:val="2"/>
+          <w:sz w:val="24"/>
+          <w:szCs w:val="24"/>
+          <w14:ligatures w14:val="standardContextual"/>
         </w:rPr>
       </w:pPr>
-      <w:hyperlink w:anchor="_Toc308526350" w:history="1">
+      <w:hyperlink w:anchor="_Toc239402440" w:history="1">
         <w:r>
           <w:rPr>
             <w:rStyle w:val="Lienhypertexte"/>
@@ -3284,8 +1999,10 @@
             <w:bCs w:val="0"/>
             <w:caps w:val="0"/>
             <w:noProof/>
-            <w:sz w:val="22"/>
-            <w:szCs w:val="22"/>
+            <w:kern w:val="2"/>
+            <w:sz w:val="24"/>
+            <w:szCs w:val="24"/>
+            <w14:ligatures w14:val="standardContextual"/>
           </w:rPr>
           <w:tab/>
         </w:r>
@@ -3315,7 +2032,7 @@
             <w:noProof/>
             <w:webHidden/>
           </w:rPr>
-          <w:instrText xml:space="preserve"> PAGEREF _Toc308526350 \h </w:instrText>
+          <w:instrText xml:space="preserve"> PAGEREF _Toc239402440 \h </w:instrText>
         </w:r>
         <w:r>
           <w:rPr>
@@ -3335,7 +2052,7 @@
             <w:noProof/>
             <w:webHidden/>
           </w:rPr>
-          <w:t>6</w:t>
+          <w:t>5</w:t>
         </w:r>
         <w:r>
           <w:rPr>
@@ -3368,7 +2085,7 @@
       </w:pPr>
       <w:bookmarkStart w:id="0" w:name="_Toc532179955"/>
       <w:bookmarkStart w:id="1" w:name="_Toc165969637"/>
-      <w:bookmarkStart w:id="2" w:name="_Toc308526316"/>
+      <w:bookmarkStart w:id="2" w:name="_Toc239402421"/>
       <w:r>
         <w:lastRenderedPageBreak/>
         <w:t>Spécifications</w:t>
@@ -3386,9 +2103,9 @@
       <w:pPr>
         <w:pStyle w:val="Titre2"/>
       </w:pPr>
-      <w:bookmarkStart w:id="3" w:name="_Toc308526317"/>
-      <w:bookmarkStart w:id="4" w:name="_Toc532179969"/>
-      <w:bookmarkStart w:id="5" w:name="_Toc165969639"/>
+      <w:bookmarkStart w:id="3" w:name="_Toc532179969"/>
+      <w:bookmarkStart w:id="4" w:name="_Toc165969639"/>
+      <w:bookmarkStart w:id="5" w:name="_Toc239402422"/>
       <w:r>
         <w:t>T</w:t>
       </w:r>
@@ -3398,163 +2115,168 @@
       <w:r>
         <w:t>e</w:t>
       </w:r>
+      <w:bookmarkEnd w:id="5"/>
+    </w:p>
+    <w:p>
+      <w:pPr>
+        <w:pStyle w:val="Retraitcorpsdetexte"/>
+      </w:pPr>
+    </w:p>
+    <w:p>
+      <w:pPr>
+        <w:ind w:left="426" w:firstLine="708"/>
+      </w:pPr>
+      <w:r>
+        <w:t>P_320 Parking</w:t>
+      </w:r>
+    </w:p>
+    <w:p>
+      <w:pPr>
+        <w:pStyle w:val="Retraitcorpsdetexte"/>
+      </w:pPr>
+      <w:r>
+        <w:t xml:space="preserve"> </w:t>
+      </w:r>
+    </w:p>
+    <w:p>
+      <w:pPr>
+        <w:pStyle w:val="Titre2"/>
+      </w:pPr>
+      <w:bookmarkStart w:id="6" w:name="_Toc239402423"/>
+      <w:r>
+        <w:t>Description</w:t>
+      </w:r>
+      <w:bookmarkEnd w:id="6"/>
+    </w:p>
+    <w:p>
+      <w:pPr>
+        <w:pStyle w:val="Retraitcorpsdetexte"/>
+      </w:pPr>
+    </w:p>
+    <w:p>
+      <w:pPr>
+        <w:ind w:left="426" w:firstLine="708"/>
+      </w:pPr>
+      <w:r>
+        <w:t>Pour ce projet nous devons réaliser un programme C# orienté objet.</w:t>
+      </w:r>
+    </w:p>
+    <w:p>
+      <w:pPr>
+        <w:ind w:left="1134"/>
+      </w:pPr>
+      <w:r>
+        <w:t xml:space="preserve">Ce dernier est une interface console ou nous pouvons insérer </w:t>
+      </w:r>
+      <w:r>
+        <w:t>des véhicules</w:t>
+      </w:r>
+      <w:r>
+        <w:t xml:space="preserve"> les sortir du parking</w:t>
+      </w:r>
+      <w:r>
+        <w:t>, afficher le parking, etc.</w:t>
+      </w:r>
+    </w:p>
+    <w:p>
+      <w:pPr>
+        <w:pStyle w:val="Retraitcorpsdetexte"/>
+      </w:pPr>
+    </w:p>
+    <w:p>
+      <w:pPr>
+        <w:pStyle w:val="Titre2"/>
+      </w:pPr>
+      <w:bookmarkStart w:id="7" w:name="_Toc239402424"/>
+      <w:r>
+        <w:t>Matériel et logiciels à disposition</w:t>
+      </w:r>
+      <w:bookmarkEnd w:id="7"/>
+    </w:p>
+    <w:p/>
+    <w:p>
+      <w:pPr>
+        <w:ind w:left="426" w:firstLine="708"/>
+      </w:pPr>
+      <w:r>
+        <w:t>Ordinateurs de l’ETML, Visual Studio Code 2022, Internet</w:t>
+      </w:r>
+    </w:p>
+    <w:p>
+      <w:pPr>
+        <w:pStyle w:val="Retraitcorpsdetexte"/>
+      </w:pPr>
+    </w:p>
+    <w:p>
+      <w:pPr>
+        <w:pStyle w:val="Titre2"/>
+      </w:pPr>
+      <w:bookmarkStart w:id="8" w:name="_Toc239402425"/>
+      <w:r>
+        <w:t>P</w:t>
+      </w:r>
+      <w:r>
+        <w:t>rérequis</w:t>
+      </w:r>
+      <w:bookmarkEnd w:id="8"/>
+    </w:p>
+    <w:p>
+      <w:pPr>
+        <w:pStyle w:val="Retraitcorpsdetexte"/>
+      </w:pPr>
+    </w:p>
+    <w:p>
+      <w:pPr>
+        <w:ind w:left="426" w:firstLine="708"/>
+      </w:pPr>
+      <w:r>
+        <w:t>Avoir fait le module I319</w:t>
+      </w:r>
+    </w:p>
+    <w:p>
+      <w:pPr>
+        <w:pStyle w:val="Retraitcorpsdetexte"/>
+      </w:pPr>
+    </w:p>
+    <w:p>
+      <w:pPr>
+        <w:pStyle w:val="Titre2"/>
+      </w:pPr>
+      <w:bookmarkStart w:id="9" w:name="_Toc239402426"/>
+      <w:r>
+        <w:t>Cahier des charges</w:t>
+      </w:r>
+      <w:bookmarkEnd w:id="9"/>
+    </w:p>
+    <w:p>
+      <w:pPr>
+        <w:pStyle w:val="Retraitcorpsdetexte"/>
+      </w:pPr>
+    </w:p>
+    <w:p>
+      <w:pPr>
+        <w:pStyle w:val="Retraitcorpsdetexte"/>
+      </w:pPr>
+      <w:r>
+        <w:t>Se référer au fichier « </w:t>
+      </w:r>
+      <w:r>
+        <w:t>2026-oo-parking-cdc.pdf</w:t>
+      </w:r>
+      <w:r>
+        <w:t> »</w:t>
+      </w:r>
+    </w:p>
+    <w:p>
+      <w:pPr>
+        <w:pStyle w:val="Titre1"/>
+      </w:pPr>
+      <w:bookmarkStart w:id="10" w:name="_Toc239402427"/>
+      <w:r>
+        <w:t>Planification</w:t>
+      </w:r>
       <w:bookmarkEnd w:id="3"/>
-    </w:p>
-    <w:p>
-      <w:pPr>
-        <w:pStyle w:val="Retraitcorpsdetexte"/>
-      </w:pPr>
-    </w:p>
-    <w:p>
-      <w:pPr>
-        <w:ind w:left="426" w:firstLine="708"/>
-      </w:pPr>
-      <w:r>
-        <w:t>P_320 Parking</w:t>
-      </w:r>
-    </w:p>
-    <w:p>
-      <w:pPr>
-        <w:pStyle w:val="Retraitcorpsdetexte"/>
-      </w:pPr>
-      <w:r>
-        <w:t xml:space="preserve"> </w:t>
-      </w:r>
-    </w:p>
-    <w:p>
-      <w:pPr>
-        <w:pStyle w:val="Titre2"/>
-      </w:pPr>
-      <w:bookmarkStart w:id="6" w:name="_Toc308526318"/>
-      <w:r>
-        <w:t>Description</w:t>
-      </w:r>
-      <w:bookmarkEnd w:id="6"/>
-    </w:p>
-    <w:p>
-      <w:pPr>
-        <w:pStyle w:val="Retraitcorpsdetexte"/>
-      </w:pPr>
-    </w:p>
-    <w:p>
-      <w:pPr>
-        <w:ind w:left="426" w:firstLine="708"/>
-      </w:pPr>
-      <w:r>
-        <w:t>Pour ce projet nous devons réaliser un programme C# orienté objet.</w:t>
-      </w:r>
-    </w:p>
-    <w:p>
-      <w:pPr>
-        <w:ind w:left="1134"/>
-      </w:pPr>
-      <w:r>
-        <w:t xml:space="preserve">Ce dernier est une interface console ou nous pouvons insérer </w:t>
-      </w:r>
-      <w:r>
-        <w:t>des véhicules</w:t>
-      </w:r>
-      <w:r>
-        <w:t xml:space="preserve"> les sortir du parking</w:t>
-      </w:r>
-      <w:r>
-        <w:t>, afficher le parking, etc.</w:t>
-      </w:r>
-    </w:p>
-    <w:p>
-      <w:pPr>
-        <w:pStyle w:val="Retraitcorpsdetexte"/>
-      </w:pPr>
-    </w:p>
-    <w:p>
-      <w:pPr>
-        <w:pStyle w:val="Titre2"/>
-      </w:pPr>
-      <w:bookmarkStart w:id="7" w:name="_Toc308526319"/>
-      <w:r>
-        <w:t>Matériel et logiciels à disposition</w:t>
-      </w:r>
-      <w:bookmarkEnd w:id="7"/>
-    </w:p>
-    <w:p/>
-    <w:p>
-      <w:pPr>
-        <w:ind w:left="426" w:firstLine="708"/>
-      </w:pPr>
-      <w:r>
-        <w:t>Ordinateurs de l’ETML, Visual Studio Code 2022, Internet</w:t>
-      </w:r>
-    </w:p>
-    <w:p>
-      <w:pPr>
-        <w:pStyle w:val="Retraitcorpsdetexte"/>
-      </w:pPr>
-    </w:p>
-    <w:p>
-      <w:pPr>
-        <w:pStyle w:val="Titre2"/>
-      </w:pPr>
-      <w:bookmarkStart w:id="8" w:name="_Toc308526320"/>
-      <w:r>
-        <w:t>P</w:t>
-      </w:r>
-      <w:r>
-        <w:t>rérequis</w:t>
-      </w:r>
-      <w:bookmarkEnd w:id="8"/>
-    </w:p>
-    <w:p>
-      <w:pPr>
-        <w:pStyle w:val="Retraitcorpsdetexte"/>
-      </w:pPr>
-    </w:p>
-    <w:p>
-      <w:pPr>
-        <w:ind w:left="426" w:firstLine="708"/>
-      </w:pPr>
-      <w:r>
-        <w:t>Avoir fait le module I319</w:t>
-      </w:r>
-    </w:p>
-    <w:p>
-      <w:pPr>
-        <w:pStyle w:val="Retraitcorpsdetexte"/>
-      </w:pPr>
-    </w:p>
-    <w:p>
-      <w:pPr>
-        <w:pStyle w:val="Titre2"/>
-      </w:pPr>
-      <w:bookmarkStart w:id="9" w:name="_Toc308526321"/>
-      <w:r>
-        <w:t>Cahier des charges</w:t>
-      </w:r>
-      <w:bookmarkEnd w:id="9"/>
-    </w:p>
-    <w:p>
-      <w:pPr>
-        <w:pStyle w:val="Retraitcorpsdetexte"/>
-      </w:pPr>
-      <w:r>
-        <w:t>Se référer au fichier « </w:t>
-      </w:r>
-      <w:r>
-        <w:t>2026-oo-parking-cdc.pdf</w:t>
-      </w:r>
-      <w:r>
-        <w:t> »</w:t>
-      </w:r>
-    </w:p>
-    <w:p>
-      <w:pPr>
-        <w:pStyle w:val="Titre1"/>
-      </w:pPr>
-      <w:bookmarkStart w:id="10" w:name="_Toc308526331"/>
-      <w:r>
-        <w:t>Planification</w:t>
-      </w:r>
       <w:bookmarkEnd w:id="4"/>
-      <w:bookmarkEnd w:id="5"/>
       <w:r>
         <w:t xml:space="preserve"> Initiale</w:t>
       </w:r>
@@ -3566,6 +2288,9 @@
       </w:pPr>
       <w:r>
         <w:t>Se référer au fichier « T-320-alemartino-JdT.xlsx »</w:t>
+      </w:r>
+      <w:r>
+        <w:t xml:space="preserve"> dans l’onglet « Planification »</w:t>
       </w:r>
     </w:p>
     <w:p>
@@ -3574,7 +2299,7 @@
       </w:pPr>
       <w:bookmarkStart w:id="11" w:name="_Toc532179957"/>
       <w:bookmarkStart w:id="12" w:name="_Toc165969641"/>
-      <w:bookmarkStart w:id="13" w:name="_Toc308526332"/>
+      <w:bookmarkStart w:id="13" w:name="_Toc239402428"/>
       <w:r>
         <w:t>Analyse</w:t>
       </w:r>
@@ -3623,7 +2348,19 @@
         </w:numPr>
       </w:pPr>
       <w:r>
-        <w:t>Lier les classes Voitures, Parking, Ticket</w:t>
+        <w:t>Lier les classes Voitures, Ticket</w:t>
+      </w:r>
+    </w:p>
+    <w:p>
+      <w:pPr>
+        <w:pStyle w:val="Corpsdetexte"/>
+        <w:numPr>
+          <w:ilvl w:val="0"/>
+          <w:numId w:val="12"/>
+        </w:numPr>
+      </w:pPr>
+      <w:r>
+        <w:t>Mettre les voitures dans un tableau</w:t>
       </w:r>
     </w:p>
     <w:p>
@@ -3659,6 +2396,44 @@
     <w:p>
       <w:pPr>
         <w:pStyle w:val="Corpsdetexte"/>
+        <w:numPr>
+          <w:ilvl w:val="0"/>
+          <w:numId w:val="13"/>
+        </w:numPr>
+      </w:pPr>
+      <w:r>
+        <w:t xml:space="preserve">Supprimer </w:t>
+      </w:r>
+      <w:proofErr w:type="spellStart"/>
+      <w:r>
+        <w:t>l’object</w:t>
+      </w:r>
+      <w:proofErr w:type="spellEnd"/>
+      <w:r>
+        <w:t xml:space="preserve"> en laissant une trace dans l’historique</w:t>
+      </w:r>
+    </w:p>
+    <w:p>
+      <w:pPr>
+        <w:pStyle w:val="Corpsdetexte"/>
+        <w:numPr>
+          <w:ilvl w:val="0"/>
+          <w:numId w:val="13"/>
+        </w:numPr>
+      </w:pPr>
+      <w:r>
+        <w:t>Supprimer la voiture du tableau</w:t>
+      </w:r>
+    </w:p>
+    <w:p>
+      <w:pPr>
+        <w:pStyle w:val="Corpsdetexte"/>
+        <w:ind w:left="1647"/>
+      </w:pPr>
+    </w:p>
+    <w:p>
+      <w:pPr>
+        <w:pStyle w:val="Corpsdetexte"/>
         <w:ind w:left="1647"/>
       </w:pPr>
     </w:p>
@@ -3671,6 +2446,7 @@
         </w:numPr>
       </w:pPr>
       <w:r>
+        <w:lastRenderedPageBreak/>
         <w:t>Afficher l’état du parking</w:t>
       </w:r>
       <w:r>
@@ -3721,6 +2497,21 @@
       <w:r>
         <w:t>Pouvoir rechercher un véhicule qui est parqué dans le parking</w:t>
       </w:r>
+      <w:r>
+        <w:t xml:space="preserve"> (grâce à sa plaque d’immatriculation ou de la place)</w:t>
+      </w:r>
+    </w:p>
+    <w:p>
+      <w:pPr>
+        <w:pStyle w:val="Corpsdetexte"/>
+        <w:numPr>
+          <w:ilvl w:val="0"/>
+          <w:numId w:val="13"/>
+        </w:numPr>
+      </w:pPr>
+      <w:r>
+        <w:t>Parcourir le tableau</w:t>
+      </w:r>
     </w:p>
     <w:p>
       <w:pPr>
@@ -3787,6 +2578,9 @@
       <w:r>
         <w:t>Ajouter un historique</w:t>
       </w:r>
+      <w:r>
+        <w:t xml:space="preserve"> de tout ce qui s’est passé</w:t>
+      </w:r>
     </w:p>
     <w:p>
       <w:pPr>
@@ -3808,6 +2602,28 @@
     </w:p>
     <w:p>
       <w:pPr>
+        <w:pStyle w:val="Corpsdetexte"/>
+        <w:numPr>
+          <w:ilvl w:val="0"/>
+          <w:numId w:val="13"/>
+        </w:numPr>
+      </w:pPr>
+      <w:r>
+        <w:t>Faire ça grâce au tableau</w:t>
+      </w:r>
+    </w:p>
+    <w:p>
+      <w:pPr>
+        <w:pStyle w:val="Corpsdetexte"/>
+      </w:pPr>
+    </w:p>
+    <w:p>
+      <w:pPr>
+        <w:pStyle w:val="Corpsdetexte"/>
+      </w:pPr>
+    </w:p>
+    <w:p>
+      <w:pPr>
         <w:pStyle w:val="Informations"/>
         <w:ind w:left="2520"/>
       </w:pPr>
@@ -3818,7 +2634,7 @@
       </w:pPr>
       <w:bookmarkStart w:id="14" w:name="_Toc532179964"/>
       <w:bookmarkStart w:id="15" w:name="_Toc165969648"/>
-      <w:bookmarkStart w:id="16" w:name="_Toc308526337"/>
+      <w:bookmarkStart w:id="16" w:name="_Toc239402429"/>
       <w:r>
         <w:t>Réalisation</w:t>
       </w:r>
@@ -3832,7 +2648,7 @@
       </w:pPr>
       <w:bookmarkStart w:id="17" w:name="_Toc532179965"/>
       <w:bookmarkStart w:id="18" w:name="_Toc165969649"/>
-      <w:bookmarkStart w:id="19" w:name="_Toc308526338"/>
+      <w:bookmarkStart w:id="19" w:name="_Toc239402430"/>
       <w:r>
         <w:t>Dossier de Réalisation</w:t>
       </w:r>
@@ -3999,7 +2815,7 @@
       </w:pPr>
       <w:bookmarkStart w:id="20" w:name="_Toc532179960"/>
       <w:bookmarkStart w:id="21" w:name="_Toc165969644"/>
-      <w:bookmarkStart w:id="22" w:name="_Toc308526339"/>
+      <w:bookmarkStart w:id="22" w:name="_Toc239402431"/>
       <w:r>
         <w:t>Modifications</w:t>
       </w:r>
@@ -4049,7 +2865,7 @@
       </w:pPr>
       <w:bookmarkStart w:id="23" w:name="_Toc532179966"/>
       <w:bookmarkStart w:id="24" w:name="_Toc165969650"/>
-      <w:bookmarkStart w:id="25" w:name="_Toc308526340"/>
+      <w:bookmarkStart w:id="25" w:name="_Toc239402432"/>
       <w:r>
         <w:t>Tests</w:t>
       </w:r>
@@ -4064,7 +2880,7 @@
       <w:bookmarkStart w:id="26" w:name="_Toc532179968"/>
       <w:bookmarkStart w:id="27" w:name="_Toc165969652"/>
       <w:bookmarkStart w:id="28" w:name="_Ref308525868"/>
-      <w:bookmarkStart w:id="29" w:name="_Toc308526341"/>
+      <w:bookmarkStart w:id="29" w:name="_Toc239402433"/>
       <w:r>
         <w:t>Dossier des tests</w:t>
       </w:r>
@@ -4120,8 +2936,13 @@
           <w:numId w:val="7"/>
         </w:numPr>
       </w:pPr>
-      <w:r>
-        <w:t>raison, décisions, etc.</w:t>
+      <w:proofErr w:type="gramStart"/>
+      <w:r>
+        <w:t>raison</w:t>
+      </w:r>
+      <w:proofErr w:type="gramEnd"/>
+      <w:r>
+        <w:t>, décisions, etc.</w:t>
       </w:r>
     </w:p>
     <w:p>
@@ -4133,8 +2954,13 @@
         </w:numPr>
       </w:pPr>
       <w:r>
-        <w:t>Liste des bugs répertoriés avec la date de découverte et leur état:</w:t>
-      </w:r>
+        <w:t xml:space="preserve">Liste des bugs répertoriés avec la date de découverte et leur </w:t>
+      </w:r>
+      <w:proofErr w:type="gramStart"/>
+      <w:r>
+        <w:t>état:</w:t>
+      </w:r>
+      <w:proofErr w:type="gramEnd"/>
     </w:p>
     <w:p>
       <w:pPr>
@@ -4159,8 +2985,9 @@
         <w:pStyle w:val="Titre1"/>
       </w:pPr>
       <w:bookmarkStart w:id="30" w:name="_Toc165969653"/>
-      <w:bookmarkStart w:id="31" w:name="_Toc308526342"/>
-      <w:r>
+      <w:bookmarkStart w:id="31" w:name="_Toc239402434"/>
+      <w:r>
+        <w:lastRenderedPageBreak/>
         <w:t>Conclusion</w:t>
       </w:r>
       <w:bookmarkEnd w:id="30"/>
@@ -4171,7 +2998,7 @@
         <w:pStyle w:val="Titre2"/>
       </w:pPr>
       <w:bookmarkStart w:id="32" w:name="_Toc165969654"/>
-      <w:bookmarkStart w:id="33" w:name="_Toc308526343"/>
+      <w:bookmarkStart w:id="33" w:name="_Toc239402435"/>
       <w:r>
         <w:t xml:space="preserve">Bilan des </w:t>
       </w:r>
@@ -4219,7 +3046,7 @@
         <w:pStyle w:val="Titre2"/>
       </w:pPr>
       <w:bookmarkStart w:id="34" w:name="_Toc165969655"/>
-      <w:bookmarkStart w:id="35" w:name="_Toc308526344"/>
+      <w:bookmarkStart w:id="35" w:name="_Toc239402436"/>
       <w:r>
         <w:t>Bilan de la planification</w:t>
       </w:r>
@@ -4250,7 +3077,15 @@
         <w:t xml:space="preserve"> projet.</w:t>
       </w:r>
       <w:r>
-        <w:t xml:space="preserve"> Indiquer les différence entre les planifications initiales et détaillées avec le journal de travail.</w:t>
+        <w:t xml:space="preserve"> Indiquer </w:t>
+      </w:r>
+      <w:proofErr w:type="gramStart"/>
+      <w:r>
+        <w:t>les différence</w:t>
+      </w:r>
+      <w:proofErr w:type="gramEnd"/>
+      <w:r>
+        <w:t xml:space="preserve"> entre les planifications initiales et détaillées avec le journal de travail.</w:t>
       </w:r>
     </w:p>
     <w:p>
@@ -4258,7 +3093,7 @@
         <w:pStyle w:val="Titre2"/>
       </w:pPr>
       <w:bookmarkStart w:id="36" w:name="_Toc165969656"/>
-      <w:bookmarkStart w:id="37" w:name="_Toc308526345"/>
+      <w:bookmarkStart w:id="37" w:name="_Toc239402437"/>
       <w:r>
         <w:t>Bilan personnel</w:t>
       </w:r>
@@ -4274,11 +3109,16 @@
         </w:numPr>
       </w:pPr>
       <w:r>
-        <w:t>Si c’était à refaire</w:t>
+        <w:t xml:space="preserve">Si c’était à </w:t>
+      </w:r>
+      <w:proofErr w:type="gramStart"/>
+      <w:r>
+        <w:t>refaire</w:t>
       </w:r>
       <w:r>
         <w:t>:</w:t>
       </w:r>
+      <w:proofErr w:type="gramEnd"/>
     </w:p>
     <w:p>
       <w:pPr>
@@ -4345,9 +3185,13 @@
           <w:numId w:val="9"/>
         </w:numPr>
       </w:pPr>
-      <w:r>
-        <w:lastRenderedPageBreak/>
-        <w:t>Suite à donner, améliorations souhaitables, …</w:t>
+      <w:proofErr w:type="gramStart"/>
+      <w:r>
+        <w:t>Suite à</w:t>
+      </w:r>
+      <w:proofErr w:type="gramEnd"/>
+      <w:r>
+        <w:t xml:space="preserve"> donner, améliorations souhaitables, …</w:t>
       </w:r>
     </w:p>
     <w:p>
@@ -4368,7 +3212,7 @@
       </w:pPr>
       <w:bookmarkStart w:id="38" w:name="_Toc532179971"/>
       <w:bookmarkStart w:id="39" w:name="_Toc165969657"/>
-      <w:bookmarkStart w:id="40" w:name="_Toc308526346"/>
+      <w:bookmarkStart w:id="40" w:name="_Toc239402438"/>
       <w:r>
         <w:t>Divers</w:t>
       </w:r>
@@ -4382,7 +3226,7 @@
       </w:pPr>
       <w:bookmarkStart w:id="41" w:name="_Toc532179972"/>
       <w:bookmarkStart w:id="42" w:name="_Toc165969658"/>
-      <w:bookmarkStart w:id="43" w:name="_Toc308526347"/>
+      <w:bookmarkStart w:id="43" w:name="_Toc239402439"/>
       <w:r>
         <w:t>Journal de travail</w:t>
       </w:r>
@@ -4392,168 +3236,23 @@
     </w:p>
     <w:p>
       <w:pPr>
+        <w:ind w:left="1416"/>
+      </w:pPr>
+      <w:r>
+        <w:t xml:space="preserve">Voir le </w:t>
+      </w:r>
+      <w:r>
+        <w:t>fichier «</w:t>
+      </w:r>
+      <w:r>
+        <w:t xml:space="preserve"> T-320-alemartino-JdT.xlsx »</w:t>
+      </w:r>
+    </w:p>
+    <w:p>
+      <w:pPr>
         <w:pStyle w:val="Informations"/>
-        <w:numPr>
-          <w:ilvl w:val="5"/>
-          <w:numId w:val="10"/>
-        </w:numPr>
-      </w:pPr>
-      <w:r>
-        <w:t>Date, activité</w:t>
-      </w:r>
-      <w:r>
-        <w:t xml:space="preserve"> (description qui permet</w:t>
-      </w:r>
-      <w:r>
-        <w:t xml:space="preserve"> de reproduire le cheminement du projet)</w:t>
-      </w:r>
-      <w:r>
-        <w:t>, durée</w:t>
-      </w:r>
-      <w:r>
-        <w:t>, liens et références sur des documents externes</w:t>
-      </w:r>
-      <w:r>
-        <w:t>.</w:t>
-      </w:r>
-      <w:r>
-        <w:t xml:space="preserve"> Lorsqu’une activité de recherches a été entreprise, il convient d’énumérer ce qui a été trouvé, avec les références.</w:t>
-      </w:r>
-    </w:p>
-    <w:p>
-      <w:pPr>
-        <w:pStyle w:val="Titre2"/>
-      </w:pPr>
-      <w:bookmarkStart w:id="44" w:name="_Toc308526348"/>
-      <w:r>
-        <w:t>Bibliographie</w:t>
-      </w:r>
-      <w:bookmarkEnd w:id="44"/>
-    </w:p>
-    <w:p>
-      <w:pPr>
-        <w:pStyle w:val="Informations"/>
-        <w:numPr>
-          <w:ilvl w:val="5"/>
-          <w:numId w:val="10"/>
-        </w:numPr>
-      </w:pPr>
-      <w:r>
-        <w:t>Références des livres</w:t>
-      </w:r>
-      <w:r>
-        <w:t>, revues et publications</w:t>
-      </w:r>
-      <w:r>
-        <w:t xml:space="preserve"> u</w:t>
-      </w:r>
-      <w:r>
-        <w:t>tilisés durant le projet.</w:t>
-      </w:r>
-    </w:p>
-    <w:p>
-      <w:pPr>
-        <w:pStyle w:val="Titre2"/>
-      </w:pPr>
-      <w:bookmarkStart w:id="45" w:name="_Toc308526349"/>
-      <w:r>
-        <w:t>Webographie</w:t>
-      </w:r>
-      <w:bookmarkEnd w:id="45"/>
-    </w:p>
-    <w:p>
-      <w:pPr>
-        <w:pStyle w:val="Informations"/>
-        <w:numPr>
-          <w:ilvl w:val="5"/>
-          <w:numId w:val="10"/>
-        </w:numPr>
-      </w:pPr>
-      <w:r>
-        <w:t>Références des sites Internet consultés durant le projet.</w:t>
-      </w:r>
-    </w:p>
-    <w:p>
-      <w:pPr>
-        <w:pStyle w:val="Titre1"/>
-      </w:pPr>
-      <w:bookmarkStart w:id="46" w:name="_Toc308526350"/>
-      <w:r>
-        <w:t>Annexes</w:t>
-      </w:r>
-      <w:bookmarkEnd w:id="46"/>
-    </w:p>
-    <w:p>
-      <w:pPr>
-        <w:pStyle w:val="Informations"/>
-        <w:numPr>
-          <w:ilvl w:val="5"/>
-          <w:numId w:val="10"/>
-        </w:numPr>
-      </w:pPr>
-      <w:r>
-        <w:t>Listing du code source (partiel ou, plus rarement complet)</w:t>
-      </w:r>
-    </w:p>
-    <w:p>
-      <w:pPr>
-        <w:pStyle w:val="Informations"/>
-        <w:numPr>
-          <w:ilvl w:val="5"/>
-          <w:numId w:val="10"/>
-        </w:numPr>
-      </w:pPr>
-      <w:r>
-        <w:t>Guide</w:t>
-      </w:r>
-      <w:r>
-        <w:t>(s)</w:t>
-      </w:r>
-      <w:r>
-        <w:t xml:space="preserve"> d’utilisation et/ou guide de l’administrateur</w:t>
-      </w:r>
-    </w:p>
-    <w:p>
-      <w:pPr>
-        <w:pStyle w:val="Informations"/>
-        <w:numPr>
-          <w:ilvl w:val="5"/>
-          <w:numId w:val="10"/>
-        </w:numPr>
-      </w:pPr>
-      <w:r>
-        <w:t>Etat ou</w:t>
-      </w:r>
-      <w:r>
-        <w:t xml:space="preserve"> « dump » </w:t>
-      </w:r>
-      <w:r>
-        <w:t xml:space="preserve">de la configuration </w:t>
-      </w:r>
-      <w:r>
-        <w:t>des équipements</w:t>
-      </w:r>
-      <w:r>
-        <w:t xml:space="preserve"> (routeur, switch, robot, etc.).</w:t>
-      </w:r>
-    </w:p>
-    <w:p>
-      <w:pPr>
-        <w:pStyle w:val="Informations"/>
-        <w:numPr>
-          <w:ilvl w:val="5"/>
-          <w:numId w:val="10"/>
-        </w:numPr>
-      </w:pPr>
-      <w:r>
-        <w:t>Extraits</w:t>
-      </w:r>
-      <w:r>
-        <w:t xml:space="preserve"> de catalogue, documentation de fabricant</w:t>
-      </w:r>
-      <w:r>
-        <w:t>, etc.</w:t>
-      </w:r>
+        <w:ind w:left="2160"/>
+      </w:pPr>
     </w:p>
     <w:sectPr>
       <w:headerReference w:type="default" r:id="rId12"/>
@@ -4604,9 +3303,9 @@
       <w:tblLook w:val="01E0" w:firstRow="1" w:lastRow="1" w:firstColumn="1" w:lastColumn="1" w:noHBand="0" w:noVBand="0"/>
     </w:tblPr>
     <w:tblGrid>
-      <w:gridCol w:w="3434"/>
-      <w:gridCol w:w="2609"/>
-      <w:gridCol w:w="3027"/>
+      <w:gridCol w:w="3435"/>
+      <w:gridCol w:w="2610"/>
+      <w:gridCol w:w="3025"/>
     </w:tblGrid>
     <w:tr>
       <w:trPr>
@@ -4897,62 +3596,12 @@
         <w:p>
           <w:pPr>
             <w:pStyle w:val="-Pieddepage"/>
-            <w:jc w:val="right"/>
+            <w:jc w:val="center"/>
             <w:rPr>
               <w:rFonts w:cs="Arial"/>
               <w:szCs w:val="16"/>
             </w:rPr>
           </w:pPr>
-          <w:r>
-            <w:rPr>
-              <w:rFonts w:cs="Arial"/>
-              <w:szCs w:val="16"/>
-            </w:rPr>
-            <w:t>Impression</w:t>
-          </w:r>
-          <w:r>
-            <w:rPr>
-              <w:rFonts w:cs="Arial"/>
-              <w:szCs w:val="16"/>
-            </w:rPr>
-            <w:t xml:space="preserve"> : </w:t>
-          </w:r>
-          <w:r>
-            <w:rPr>
-              <w:rFonts w:cs="Arial"/>
-              <w:szCs w:val="16"/>
-            </w:rPr>
-            <w:fldChar w:fldCharType="begin"/>
-          </w:r>
-          <w:r>
-            <w:rPr>
-              <w:rFonts w:cs="Arial"/>
-              <w:szCs w:val="16"/>
-            </w:rPr>
-            <w:instrText xml:space="preserve"> PRINTDATE  \@ "dd.MM.yyyy HH:mm"  \* MERGEFORMAT </w:instrText>
-          </w:r>
-          <w:r>
-            <w:rPr>
-              <w:rFonts w:cs="Arial"/>
-              <w:szCs w:val="16"/>
-            </w:rPr>
-            <w:fldChar w:fldCharType="separate"/>
-          </w:r>
-          <w:r>
-            <w:rPr>
-              <w:rFonts w:cs="Arial"/>
-              <w:noProof/>
-              <w:szCs w:val="16"/>
-            </w:rPr>
-            <w:t>04.09.2009 15:21</w:t>
-          </w:r>
-          <w:r>
-            <w:rPr>
-              <w:rFonts w:cs="Arial"/>
-              <w:szCs w:val="16"/>
-            </w:rPr>
-            <w:fldChar w:fldCharType="end"/>
-          </w:r>
         </w:p>
       </w:tc>
     </w:tr>
@@ -4973,12 +3622,21 @@
               <w:szCs w:val="16"/>
             </w:rPr>
           </w:pPr>
+          <w:proofErr w:type="gramStart"/>
           <w:r>
             <w:rPr>
               <w:rFonts w:cs="Arial"/>
               <w:szCs w:val="16"/>
             </w:rPr>
-            <w:t xml:space="preserve">Version: </w:t>
+            <w:t>Version:</w:t>
+          </w:r>
+          <w:proofErr w:type="gramEnd"/>
+          <w:r>
+            <w:rPr>
+              <w:rFonts w:cs="Arial"/>
+              <w:szCs w:val="16"/>
+            </w:rPr>
+            <w:t xml:space="preserve"> </w:t>
           </w:r>
           <w:fldSimple w:instr=" REVNUM   \* MERGEFORMAT ">
             <w:r>
@@ -5024,7 +3682,7 @@
               <w:noProof/>
               <w:szCs w:val="16"/>
             </w:rPr>
-            <w:t>28.08.2026 08:52</w:t>
+            <w:t>28.08.2026 11:20</w:t>
           </w:r>
           <w:r>
             <w:rPr>
@@ -5050,16 +3708,9 @@
               <w:szCs w:val="16"/>
             </w:rPr>
           </w:pPr>
-          <w:fldSimple w:instr=" FILENAME  \* FirstCap  \* MERGEFORMAT ">
-            <w:r>
-              <w:rPr>
-                <w:rFonts w:cs="Arial"/>
-                <w:noProof/>
-                <w:szCs w:val="16"/>
-              </w:rPr>
-              <w:t>Document1</w:t>
-            </w:r>
-          </w:fldSimple>
+          <w:r>
+            <w:t>R-320-alemartino</w:t>
+          </w:r>
         </w:p>
       </w:tc>
     </w:tr>
@@ -5236,7 +3887,7 @@
         <v:path o:extrusionok="f" gradientshapeok="t" o:connecttype="rect"/>
         <o:lock v:ext="edit" aspectratio="t"/>
       </v:shapetype>
-      <v:shape id="_x0000_i1025" type="#_x0000_t75" style="width:12pt;height:12pt" o:bullet="t">
+      <v:shape id="_x0000_i1025" type="#_x0000_t75" style="width:11.9pt;height:11.9pt" o:bullet="t">
         <v:imagedata r:id="rId1" o:title="BD10263_"/>
       </v:shape>
     </w:pict>
@@ -5892,7 +4543,7 @@
   <w:abstractNum w:abstractNumId="6" w15:restartNumberingAfterBreak="0">
     <w:nsid w:val="267B6FEC"/>
     <w:multiLevelType w:val="hybridMultilevel"/>
-    <w:tmpl w:val="39AAA94E"/>
+    <w:tmpl w:val="08B0BC38"/>
     <w:lvl w:ilvl="0" w:tplc="100C0001">
       <w:start w:val="1"/>
       <w:numFmt w:val="bullet"/>
@@ -6027,7 +4678,7 @@
         <w:ind w:left="1647" w:hanging="360"/>
       </w:pPr>
     </w:lvl>
-    <w:lvl w:ilvl="2" w:tplc="100C001B" w:tentative="1">
+    <w:lvl w:ilvl="2" w:tplc="100C001B">
       <w:start w:val="1"/>
       <w:numFmt w:val="lowerRoman"/>
       <w:lvlText w:val="%3."/>
@@ -7423,7 +6074,6 @@
     <w:next w:val="Normal"/>
     <w:autoRedefine/>
     <w:uiPriority w:val="39"/>
-    <w:semiHidden/>
     <w:rsid w:val="00656974"/>
     <w:pPr>
       <w:spacing w:before="120" w:after="120"/>
@@ -7440,7 +6090,6 @@
     <w:next w:val="Normal"/>
     <w:autoRedefine/>
     <w:uiPriority w:val="39"/>
-    <w:semiHidden/>
     <w:rsid w:val="007F30AE"/>
     <w:pPr>
       <w:ind w:left="200"/>
@@ -7767,6 +6416,18 @@
       <w:contextualSpacing/>
     </w:pPr>
   </w:style>
+  <w:style w:type="character" w:styleId="Mentionnonrsolue">
+    <w:name w:val="Unresolved Mention"/>
+    <w:basedOn w:val="Policepardfaut"/>
+    <w:uiPriority w:val="99"/>
+    <w:semiHidden/>
+    <w:unhideWhenUsed/>
+    <w:rsid w:val="007C1537"/>
+    <w:rPr>
+      <w:color w:val="605E5C"/>
+      <w:shd w:val="clear" w:color="auto" w:fill="E1DFDD"/>
+    </w:rPr>
+  </w:style>
 </w:styles>
 </file>
 
@@ -8057,6 +6718,25 @@
 </file>
 
 <file path=customXml/item1.xml><?xml version="1.0" encoding="utf-8"?>
+<p:properties xmlns:p="http://schemas.microsoft.com/office/2006/metadata/properties" xmlns:xsi="http://www.w3.org/2001/XMLSchema-instance" xmlns:pc="http://schemas.microsoft.com/office/infopath/2007/PartnerControls">
+  <documentManagement/>
+</p:properties>
+</file>
+
+<file path=customXml/item2.xml><?xml version="1.0" encoding="utf-8"?>
+<b:Sources xmlns:b="http://schemas.openxmlformats.org/officeDocument/2006/bibliography" xmlns="http://schemas.openxmlformats.org/officeDocument/2006/bibliography" SelectedStyle="\APA.XSL" StyleName="APA"/>
+</file>
+
+<file path=customXml/item3.xml><?xml version="1.0" encoding="utf-8"?>
+<?mso-contentType ?>
+<FormTemplates xmlns="http://schemas.microsoft.com/sharepoint/v3/contenttype/forms">
+  <Display>DocumentLibraryForm</Display>
+  <Edit>DocumentLibraryForm</Edit>
+  <New>DocumentLibraryForm</New>
+</FormTemplates>
+</file>
+
+<file path=customXml/item4.xml><?xml version="1.0" encoding="utf-8"?>
 <ct:contentTypeSchema xmlns:ct="http://schemas.microsoft.com/office/2006/metadata/contentType" xmlns:ma="http://schemas.microsoft.com/office/2006/metadata/properties/metaAttributes" ct:_="" ma:_="" ma:contentTypeName="Document" ma:contentTypeID="0x010100FBB99F57F4D89D439F52EDCD0CED316B" ma:contentTypeVersion="7" ma:contentTypeDescription="Crée un document." ma:contentTypeScope="" ma:versionID="7f146099027e1b74c82fbe61e090590b">
   <xsd:schema xmlns:xsd="http://www.w3.org/2001/XMLSchema" xmlns:xs="http://www.w3.org/2001/XMLSchema" xmlns:p="http://schemas.microsoft.com/office/2006/metadata/properties" xmlns:ns2="6b19550a-bdc3-4796-8096-c6911560d534" targetNamespace="http://schemas.microsoft.com/office/2006/metadata/properties" ma:root="true" ma:fieldsID="7044bf5f632aa66a3f32a70d04b92caa" ns2:_="">
     <xsd:import namespace="6b19550a-bdc3-4796-8096-c6911560d534"/>
@@ -8218,26 +6898,32 @@
 </ct:contentTypeSchema>
 </file>
 
-<file path=customXml/item2.xml><?xml version="1.0" encoding="utf-8"?>
-<?mso-contentType ?>
-<FormTemplates xmlns="http://schemas.microsoft.com/sharepoint/v3/contenttype/forms">
-  <Display>DocumentLibraryForm</Display>
-  <Edit>DocumentLibraryForm</Edit>
-  <New>DocumentLibraryForm</New>
-</FormTemplates>
+<file path=customXml/itemProps1.xml><?xml version="1.0" encoding="utf-8"?>
+<ds:datastoreItem xmlns:ds="http://schemas.openxmlformats.org/officeDocument/2006/customXml" ds:itemID="{2319CDB8-A2CD-412D-8359-13E6B4DF1FF4}">
+  <ds:schemaRefs>
+    <ds:schemaRef ds:uri="http://schemas.microsoft.com/office/2006/metadata/properties"/>
+    <ds:schemaRef ds:uri="http://schemas.microsoft.com/office/infopath/2007/PartnerControls"/>
+  </ds:schemaRefs>
+</ds:datastoreItem>
 </file>
 
-<file path=customXml/item3.xml><?xml version="1.0" encoding="utf-8"?>
-<b:Sources xmlns:b="http://schemas.openxmlformats.org/officeDocument/2006/bibliography" xmlns="http://schemas.openxmlformats.org/officeDocument/2006/bibliography" SelectedStyle="\APA.XSL" StyleName="APA"/>
+<file path=customXml/itemProps2.xml><?xml version="1.0" encoding="utf-8"?>
+<ds:datastoreItem xmlns:ds="http://schemas.openxmlformats.org/officeDocument/2006/customXml" ds:itemID="{C8C35155-3E6A-4058-B6E4-303717845E3B}">
+  <ds:schemaRefs>
+    <ds:schemaRef ds:uri="http://schemas.openxmlformats.org/officeDocument/2006/bibliography"/>
+  </ds:schemaRefs>
+</ds:datastoreItem>
 </file>
 
-<file path=customXml/item4.xml><?xml version="1.0" encoding="utf-8"?>
-<p:properties xmlns:p="http://schemas.microsoft.com/office/2006/metadata/properties" xmlns:xsi="http://www.w3.org/2001/XMLSchema-instance" xmlns:pc="http://schemas.microsoft.com/office/infopath/2007/PartnerControls">
-  <documentManagement/>
-</p:properties>
+<file path=customXml/itemProps3.xml><?xml version="1.0" encoding="utf-8"?>
+<ds:datastoreItem xmlns:ds="http://schemas.openxmlformats.org/officeDocument/2006/customXml" ds:itemID="{6C3F7A66-EDE3-46FD-83EB-3C265E5D2669}">
+  <ds:schemaRefs>
+    <ds:schemaRef ds:uri="http://schemas.microsoft.com/sharepoint/v3/contenttype/forms"/>
+  </ds:schemaRefs>
+</ds:datastoreItem>
 </file>
 
-<file path=customXml/itemProps1.xml><?xml version="1.0" encoding="utf-8"?>
+<file path=customXml/itemProps4.xml><?xml version="1.0" encoding="utf-8"?>
 <ds:datastoreItem xmlns:ds="http://schemas.openxmlformats.org/officeDocument/2006/customXml" ds:itemID="{75ED066B-A5C4-4F00-9682-79C6BF6A6E3B}">
   <ds:schemaRefs>
     <ds:schemaRef ds:uri="http://schemas.microsoft.com/office/2006/metadata/contentType"/>
@@ -8253,29 +6939,4 @@
     <ds:schemaRef ds:uri="http://schemas.microsoft.com/internal/obd"/>
   </ds:schemaRefs>
 </ds:datastoreItem>
-</file>
-
-<file path=customXml/itemProps2.xml><?xml version="1.0" encoding="utf-8"?>
-<ds:datastoreItem xmlns:ds="http://schemas.openxmlformats.org/officeDocument/2006/customXml" ds:itemID="{6C3F7A66-EDE3-46FD-83EB-3C265E5D2669}">
-  <ds:schemaRefs>
-    <ds:schemaRef ds:uri="http://schemas.microsoft.com/sharepoint/v3/contenttype/forms"/>
-  </ds:schemaRefs>
-</ds:datastoreItem>
-</file>
-
-<file path=customXml/itemProps3.xml><?xml version="1.0" encoding="utf-8"?>
-<ds:datastoreItem xmlns:ds="http://schemas.openxmlformats.org/officeDocument/2006/customXml" ds:itemID="{C8C35155-3E6A-4058-B6E4-303717845E3B}">
-  <ds:schemaRefs>
-    <ds:schemaRef ds:uri="http://schemas.openxmlformats.org/officeDocument/2006/bibliography"/>
-  </ds:schemaRefs>
-</ds:datastoreItem>
-</file>
-
-<file path=customXml/itemProps4.xml><?xml version="1.0" encoding="utf-8"?>
-<ds:datastoreItem xmlns:ds="http://schemas.openxmlformats.org/officeDocument/2006/customXml" ds:itemID="{2319CDB8-A2CD-412D-8359-13E6B4DF1FF4}">
-  <ds:schemaRefs>
-    <ds:schemaRef ds:uri="http://schemas.microsoft.com/office/2006/metadata/properties"/>
-    <ds:schemaRef ds:uri="http://schemas.microsoft.com/office/infopath/2007/PartnerControls"/>
-  </ds:schemaRefs>
-</ds:datastoreItem>
 </file>
</xml_diff>

<commit_message>
doc(all): redaction du rapport
</commit_message>
<xml_diff>
--- a/R-320-alemartino.docx
+++ b/R-320-alemartino.docx
@@ -170,7 +170,7 @@
         </w:rPr>
         <w:fldChar w:fldCharType="separate"/>
       </w:r>
-      <w:hyperlink w:anchor="_Toc239402421" w:history="1">
+      <w:hyperlink w:anchor="_Toc244244853" w:history="1">
         <w:r>
           <w:rPr>
             <w:rStyle w:val="Lienhypertexte"/>
@@ -218,7 +218,7 @@
             <w:noProof/>
             <w:webHidden/>
           </w:rPr>
-          <w:instrText xml:space="preserve"> PAGEREF _Toc239402421 \h </w:instrText>
+          <w:instrText xml:space="preserve"> PAGEREF _Toc244244853 \h </w:instrText>
         </w:r>
         <w:r>
           <w:rPr>
@@ -266,7 +266,7 @@
           <w14:ligatures w14:val="standardContextual"/>
         </w:rPr>
       </w:pPr>
-      <w:hyperlink w:anchor="_Toc239402422" w:history="1">
+      <w:hyperlink w:anchor="_Toc244244854" w:history="1">
         <w:r>
           <w:rPr>
             <w:rStyle w:val="Lienhypertexte"/>
@@ -312,7 +312,7 @@
             <w:noProof/>
             <w:webHidden/>
           </w:rPr>
-          <w:instrText xml:space="preserve"> PAGEREF _Toc239402422 \h </w:instrText>
+          <w:instrText xml:space="preserve"> PAGEREF _Toc244244854 \h </w:instrText>
         </w:r>
         <w:r>
           <w:rPr>
@@ -360,7 +360,7 @@
           <w14:ligatures w14:val="standardContextual"/>
         </w:rPr>
       </w:pPr>
-      <w:hyperlink w:anchor="_Toc239402423" w:history="1">
+      <w:hyperlink w:anchor="_Toc244244855" w:history="1">
         <w:r>
           <w:rPr>
             <w:rStyle w:val="Lienhypertexte"/>
@@ -406,7 +406,7 @@
             <w:noProof/>
             <w:webHidden/>
           </w:rPr>
-          <w:instrText xml:space="preserve"> PAGEREF _Toc239402423 \h </w:instrText>
+          <w:instrText xml:space="preserve"> PAGEREF _Toc244244855 \h </w:instrText>
         </w:r>
         <w:r>
           <w:rPr>
@@ -454,7 +454,7 @@
           <w14:ligatures w14:val="standardContextual"/>
         </w:rPr>
       </w:pPr>
-      <w:hyperlink w:anchor="_Toc239402424" w:history="1">
+      <w:hyperlink w:anchor="_Toc244244856" w:history="1">
         <w:r>
           <w:rPr>
             <w:rStyle w:val="Lienhypertexte"/>
@@ -500,7 +500,7 @@
             <w:noProof/>
             <w:webHidden/>
           </w:rPr>
-          <w:instrText xml:space="preserve"> PAGEREF _Toc239402424 \h </w:instrText>
+          <w:instrText xml:space="preserve"> PAGEREF _Toc244244856 \h </w:instrText>
         </w:r>
         <w:r>
           <w:rPr>
@@ -548,7 +548,7 @@
           <w14:ligatures w14:val="standardContextual"/>
         </w:rPr>
       </w:pPr>
-      <w:hyperlink w:anchor="_Toc239402425" w:history="1">
+      <w:hyperlink w:anchor="_Toc244244857" w:history="1">
         <w:r>
           <w:rPr>
             <w:rStyle w:val="Lienhypertexte"/>
@@ -594,7 +594,7 @@
             <w:noProof/>
             <w:webHidden/>
           </w:rPr>
-          <w:instrText xml:space="preserve"> PAGEREF _Toc239402425 \h </w:instrText>
+          <w:instrText xml:space="preserve"> PAGEREF _Toc244244857 \h </w:instrText>
         </w:r>
         <w:r>
           <w:rPr>
@@ -642,7 +642,7 @@
           <w14:ligatures w14:val="standardContextual"/>
         </w:rPr>
       </w:pPr>
-      <w:hyperlink w:anchor="_Toc239402426" w:history="1">
+      <w:hyperlink w:anchor="_Toc244244858" w:history="1">
         <w:r>
           <w:rPr>
             <w:rStyle w:val="Lienhypertexte"/>
@@ -688,7 +688,7 @@
             <w:noProof/>
             <w:webHidden/>
           </w:rPr>
-          <w:instrText xml:space="preserve"> PAGEREF _Toc239402426 \h </w:instrText>
+          <w:instrText xml:space="preserve"> PAGEREF _Toc244244858 \h </w:instrText>
         </w:r>
         <w:r>
           <w:rPr>
@@ -738,7 +738,7 @@
           <w14:ligatures w14:val="standardContextual"/>
         </w:rPr>
       </w:pPr>
-      <w:hyperlink w:anchor="_Toc239402427" w:history="1">
+      <w:hyperlink w:anchor="_Toc244244859" w:history="1">
         <w:r>
           <w:rPr>
             <w:rStyle w:val="Lienhypertexte"/>
@@ -786,7 +786,7 @@
             <w:noProof/>
             <w:webHidden/>
           </w:rPr>
-          <w:instrText xml:space="preserve"> PAGEREF _Toc239402427 \h </w:instrText>
+          <w:instrText xml:space="preserve"> PAGEREF _Toc244244859 \h </w:instrText>
         </w:r>
         <w:r>
           <w:rPr>
@@ -836,7 +836,7 @@
           <w14:ligatures w14:val="standardContextual"/>
         </w:rPr>
       </w:pPr>
-      <w:hyperlink w:anchor="_Toc239402428" w:history="1">
+      <w:hyperlink w:anchor="_Toc244244860" w:history="1">
         <w:r>
           <w:rPr>
             <w:rStyle w:val="Lienhypertexte"/>
@@ -884,7 +884,7 @@
             <w:noProof/>
             <w:webHidden/>
           </w:rPr>
-          <w:instrText xml:space="preserve"> PAGEREF _Toc239402428 \h </w:instrText>
+          <w:instrText xml:space="preserve"> PAGEREF _Toc244244860 \h </w:instrText>
         </w:r>
         <w:r>
           <w:rPr>
@@ -934,7 +934,7 @@
           <w14:ligatures w14:val="standardContextual"/>
         </w:rPr>
       </w:pPr>
-      <w:hyperlink w:anchor="_Toc239402429" w:history="1">
+      <w:hyperlink w:anchor="_Toc244244861" w:history="1">
         <w:r>
           <w:rPr>
             <w:rStyle w:val="Lienhypertexte"/>
@@ -982,7 +982,7 @@
             <w:noProof/>
             <w:webHidden/>
           </w:rPr>
-          <w:instrText xml:space="preserve"> PAGEREF _Toc239402429 \h </w:instrText>
+          <w:instrText xml:space="preserve"> PAGEREF _Toc244244861 \h </w:instrText>
         </w:r>
         <w:r>
           <w:rPr>
@@ -1030,7 +1030,7 @@
           <w14:ligatures w14:val="standardContextual"/>
         </w:rPr>
       </w:pPr>
-      <w:hyperlink w:anchor="_Toc239402430" w:history="1">
+      <w:hyperlink w:anchor="_Toc244244862" w:history="1">
         <w:r>
           <w:rPr>
             <w:rStyle w:val="Lienhypertexte"/>
@@ -1055,7 +1055,7 @@
             <w:rStyle w:val="Lienhypertexte"/>
             <w:noProof/>
           </w:rPr>
-          <w:t>Dossier de Réalisation</w:t>
+          <w:t>Bilan du déroulement du projet</w:t>
         </w:r>
         <w:r>
           <w:rPr>
@@ -1076,7 +1076,7 @@
             <w:noProof/>
             <w:webHidden/>
           </w:rPr>
-          <w:instrText xml:space="preserve"> PAGEREF _Toc239402430 \h </w:instrText>
+          <w:instrText xml:space="preserve"> PAGEREF _Toc244244862 \h </w:instrText>
         </w:r>
         <w:r>
           <w:rPr>
@@ -1124,7 +1124,7 @@
           <w14:ligatures w14:val="standardContextual"/>
         </w:rPr>
       </w:pPr>
-      <w:hyperlink w:anchor="_Toc239402431" w:history="1">
+      <w:hyperlink w:anchor="_Toc244244863" w:history="1">
         <w:r>
           <w:rPr>
             <w:rStyle w:val="Lienhypertexte"/>
@@ -1149,7 +1149,21 @@
             <w:rStyle w:val="Lienhypertexte"/>
             <w:noProof/>
           </w:rPr>
-          <w:t>Modifications</w:t>
+          <w:t>Bilan pr</w:t>
+        </w:r>
+        <w:r>
+          <w:rPr>
+            <w:rStyle w:val="Lienhypertexte"/>
+            <w:noProof/>
+          </w:rPr>
+          <w:t>o</w:t>
+        </w:r>
+        <w:r>
+          <w:rPr>
+            <w:rStyle w:val="Lienhypertexte"/>
+            <w:noProof/>
+          </w:rPr>
+          <w:t>duit</w:t>
         </w:r>
         <w:r>
           <w:rPr>
@@ -1170,7 +1184,7 @@
             <w:noProof/>
             <w:webHidden/>
           </w:rPr>
-          <w:instrText xml:space="preserve"> PAGEREF _Toc239402431 \h </w:instrText>
+          <w:instrText xml:space="preserve"> PAGEREF _Toc244244863 \h </w:instrText>
         </w:r>
         <w:r>
           <w:rPr>
@@ -1220,7 +1234,7 @@
           <w14:ligatures w14:val="standardContextual"/>
         </w:rPr>
       </w:pPr>
-      <w:hyperlink w:anchor="_Toc239402432" w:history="1">
+      <w:hyperlink w:anchor="_Toc244244864" w:history="1">
         <w:r>
           <w:rPr>
             <w:rStyle w:val="Lienhypertexte"/>
@@ -1268,7 +1282,7 @@
             <w:noProof/>
             <w:webHidden/>
           </w:rPr>
-          <w:instrText xml:space="preserve"> PAGEREF _Toc239402432 \h </w:instrText>
+          <w:instrText xml:space="preserve"> PAGEREF _Toc244244864 \h </w:instrText>
         </w:r>
         <w:r>
           <w:rPr>
@@ -1288,7 +1302,7 @@
             <w:noProof/>
             <w:webHidden/>
           </w:rPr>
-          <w:t>4</w:t>
+          <w:t>5</w:t>
         </w:r>
         <w:r>
           <w:rPr>
@@ -1316,7 +1330,7 @@
           <w14:ligatures w14:val="standardContextual"/>
         </w:rPr>
       </w:pPr>
-      <w:hyperlink w:anchor="_Toc239402433" w:history="1">
+      <w:hyperlink w:anchor="_Toc244244865" w:history="1">
         <w:r>
           <w:rPr>
             <w:rStyle w:val="Lienhypertexte"/>
@@ -1341,7 +1355,7 @@
             <w:rStyle w:val="Lienhypertexte"/>
             <w:noProof/>
           </w:rPr>
-          <w:t>Dossier des tests</w:t>
+          <w:t>Rapport des tests</w:t>
         </w:r>
         <w:r>
           <w:rPr>
@@ -1362,7 +1376,7 @@
             <w:noProof/>
             <w:webHidden/>
           </w:rPr>
-          <w:instrText xml:space="preserve"> PAGEREF _Toc239402433 \h </w:instrText>
+          <w:instrText xml:space="preserve"> PAGEREF _Toc244244865 \h </w:instrText>
         </w:r>
         <w:r>
           <w:rPr>
@@ -1382,7 +1396,7 @@
             <w:noProof/>
             <w:webHidden/>
           </w:rPr>
-          <w:t>4</w:t>
+          <w:t>5</w:t>
         </w:r>
         <w:r>
           <w:rPr>
@@ -1412,7 +1426,7 @@
           <w14:ligatures w14:val="standardContextual"/>
         </w:rPr>
       </w:pPr>
-      <w:hyperlink w:anchor="_Toc239402434" w:history="1">
+      <w:hyperlink w:anchor="_Toc244244866" w:history="1">
         <w:r>
           <w:rPr>
             <w:rStyle w:val="Lienhypertexte"/>
@@ -1439,7 +1453,7 @@
             <w:rStyle w:val="Lienhypertexte"/>
             <w:noProof/>
           </w:rPr>
-          <w:t>Conclusion</w:t>
+          <w:t>Conception</w:t>
         </w:r>
         <w:r>
           <w:rPr>
@@ -1460,289 +1474,7 @@
             <w:noProof/>
             <w:webHidden/>
           </w:rPr>
-          <w:instrText xml:space="preserve"> PAGEREF _Toc239402434 \h </w:instrText>
-        </w:r>
-        <w:r>
-          <w:rPr>
-            <w:noProof/>
-            <w:webHidden/>
-          </w:rPr>
-        </w:r>
-        <w:r>
-          <w:rPr>
-            <w:noProof/>
-            <w:webHidden/>
-          </w:rPr>
-          <w:fldChar w:fldCharType="separate"/>
-        </w:r>
-        <w:r>
-          <w:rPr>
-            <w:noProof/>
-            <w:webHidden/>
-          </w:rPr>
-          <w:t>4</w:t>
-        </w:r>
-        <w:r>
-          <w:rPr>
-            <w:noProof/>
-            <w:webHidden/>
-          </w:rPr>
-          <w:fldChar w:fldCharType="end"/>
-        </w:r>
-      </w:hyperlink>
-    </w:p>
-    <w:p>
-      <w:pPr>
-        <w:pStyle w:val="TM2"/>
-        <w:tabs>
-          <w:tab w:val="left" w:pos="800"/>
-          <w:tab w:val="right" w:leader="dot" w:pos="9060"/>
-        </w:tabs>
-        <w:rPr>
-          <w:rFonts w:eastAsiaTheme="minorEastAsia" w:cstheme="minorBidi"/>
-          <w:smallCaps w:val="0"/>
-          <w:noProof/>
-          <w:kern w:val="2"/>
-          <w:sz w:val="24"/>
-          <w:szCs w:val="24"/>
-          <w14:ligatures w14:val="standardContextual"/>
-        </w:rPr>
-      </w:pPr>
-      <w:hyperlink w:anchor="_Toc239402435" w:history="1">
-        <w:r>
-          <w:rPr>
-            <w:rStyle w:val="Lienhypertexte"/>
-            <w:noProof/>
-          </w:rPr>
-          <w:t>6.1</w:t>
-        </w:r>
-        <w:r>
-          <w:rPr>
-            <w:rFonts w:eastAsiaTheme="minorEastAsia" w:cstheme="minorBidi"/>
-            <w:smallCaps w:val="0"/>
-            <w:noProof/>
-            <w:kern w:val="2"/>
-            <w:sz w:val="24"/>
-            <w:szCs w:val="24"/>
-            <w14:ligatures w14:val="standardContextual"/>
-          </w:rPr>
-          <w:tab/>
-        </w:r>
-        <w:r>
-          <w:rPr>
-            <w:rStyle w:val="Lienhypertexte"/>
-            <w:noProof/>
-          </w:rPr>
-          <w:t>Bilan des fonctionnalités demandées</w:t>
-        </w:r>
-        <w:r>
-          <w:rPr>
-            <w:noProof/>
-            <w:webHidden/>
-          </w:rPr>
-          <w:tab/>
-        </w:r>
-        <w:r>
-          <w:rPr>
-            <w:noProof/>
-            <w:webHidden/>
-          </w:rPr>
-          <w:fldChar w:fldCharType="begin"/>
-        </w:r>
-        <w:r>
-          <w:rPr>
-            <w:noProof/>
-            <w:webHidden/>
-          </w:rPr>
-          <w:instrText xml:space="preserve"> PAGEREF _Toc239402435 \h </w:instrText>
-        </w:r>
-        <w:r>
-          <w:rPr>
-            <w:noProof/>
-            <w:webHidden/>
-          </w:rPr>
-        </w:r>
-        <w:r>
-          <w:rPr>
-            <w:noProof/>
-            <w:webHidden/>
-          </w:rPr>
-          <w:fldChar w:fldCharType="separate"/>
-        </w:r>
-        <w:r>
-          <w:rPr>
-            <w:noProof/>
-            <w:webHidden/>
-          </w:rPr>
-          <w:t>4</w:t>
-        </w:r>
-        <w:r>
-          <w:rPr>
-            <w:noProof/>
-            <w:webHidden/>
-          </w:rPr>
-          <w:fldChar w:fldCharType="end"/>
-        </w:r>
-      </w:hyperlink>
-    </w:p>
-    <w:p>
-      <w:pPr>
-        <w:pStyle w:val="TM2"/>
-        <w:tabs>
-          <w:tab w:val="left" w:pos="800"/>
-          <w:tab w:val="right" w:leader="dot" w:pos="9060"/>
-        </w:tabs>
-        <w:rPr>
-          <w:rFonts w:eastAsiaTheme="minorEastAsia" w:cstheme="minorBidi"/>
-          <w:smallCaps w:val="0"/>
-          <w:noProof/>
-          <w:kern w:val="2"/>
-          <w:sz w:val="24"/>
-          <w:szCs w:val="24"/>
-          <w14:ligatures w14:val="standardContextual"/>
-        </w:rPr>
-      </w:pPr>
-      <w:hyperlink w:anchor="_Toc239402436" w:history="1">
-        <w:r>
-          <w:rPr>
-            <w:rStyle w:val="Lienhypertexte"/>
-            <w:noProof/>
-          </w:rPr>
-          <w:t>6.2</w:t>
-        </w:r>
-        <w:r>
-          <w:rPr>
-            <w:rFonts w:eastAsiaTheme="minorEastAsia" w:cstheme="minorBidi"/>
-            <w:smallCaps w:val="0"/>
-            <w:noProof/>
-            <w:kern w:val="2"/>
-            <w:sz w:val="24"/>
-            <w:szCs w:val="24"/>
-            <w14:ligatures w14:val="standardContextual"/>
-          </w:rPr>
-          <w:tab/>
-        </w:r>
-        <w:r>
-          <w:rPr>
-            <w:rStyle w:val="Lienhypertexte"/>
-            <w:noProof/>
-          </w:rPr>
-          <w:t>Bilan de la planification</w:t>
-        </w:r>
-        <w:r>
-          <w:rPr>
-            <w:noProof/>
-            <w:webHidden/>
-          </w:rPr>
-          <w:tab/>
-        </w:r>
-        <w:r>
-          <w:rPr>
-            <w:noProof/>
-            <w:webHidden/>
-          </w:rPr>
-          <w:fldChar w:fldCharType="begin"/>
-        </w:r>
-        <w:r>
-          <w:rPr>
-            <w:noProof/>
-            <w:webHidden/>
-          </w:rPr>
-          <w:instrText xml:space="preserve"> PAGEREF _Toc239402436 \h </w:instrText>
-        </w:r>
-        <w:r>
-          <w:rPr>
-            <w:noProof/>
-            <w:webHidden/>
-          </w:rPr>
-        </w:r>
-        <w:r>
-          <w:rPr>
-            <w:noProof/>
-            <w:webHidden/>
-          </w:rPr>
-          <w:fldChar w:fldCharType="separate"/>
-        </w:r>
-        <w:r>
-          <w:rPr>
-            <w:noProof/>
-            <w:webHidden/>
-          </w:rPr>
-          <w:t>4</w:t>
-        </w:r>
-        <w:r>
-          <w:rPr>
-            <w:noProof/>
-            <w:webHidden/>
-          </w:rPr>
-          <w:fldChar w:fldCharType="end"/>
-        </w:r>
-      </w:hyperlink>
-    </w:p>
-    <w:p>
-      <w:pPr>
-        <w:pStyle w:val="TM2"/>
-        <w:tabs>
-          <w:tab w:val="left" w:pos="800"/>
-          <w:tab w:val="right" w:leader="dot" w:pos="9060"/>
-        </w:tabs>
-        <w:rPr>
-          <w:rFonts w:eastAsiaTheme="minorEastAsia" w:cstheme="minorBidi"/>
-          <w:smallCaps w:val="0"/>
-          <w:noProof/>
-          <w:kern w:val="2"/>
-          <w:sz w:val="24"/>
-          <w:szCs w:val="24"/>
-          <w14:ligatures w14:val="standardContextual"/>
-        </w:rPr>
-      </w:pPr>
-      <w:hyperlink w:anchor="_Toc239402437" w:history="1">
-        <w:r>
-          <w:rPr>
-            <w:rStyle w:val="Lienhypertexte"/>
-            <w:noProof/>
-          </w:rPr>
-          <w:t>6.3</w:t>
-        </w:r>
-        <w:r>
-          <w:rPr>
-            <w:rFonts w:eastAsiaTheme="minorEastAsia" w:cstheme="minorBidi"/>
-            <w:smallCaps w:val="0"/>
-            <w:noProof/>
-            <w:kern w:val="2"/>
-            <w:sz w:val="24"/>
-            <w:szCs w:val="24"/>
-            <w14:ligatures w14:val="standardContextual"/>
-          </w:rPr>
-          <w:tab/>
-        </w:r>
-        <w:r>
-          <w:rPr>
-            <w:rStyle w:val="Lienhypertexte"/>
-            <w:noProof/>
-          </w:rPr>
-          <w:t>Bilan personnel</w:t>
-        </w:r>
-        <w:r>
-          <w:rPr>
-            <w:noProof/>
-            <w:webHidden/>
-          </w:rPr>
-          <w:tab/>
-        </w:r>
-        <w:r>
-          <w:rPr>
-            <w:noProof/>
-            <w:webHidden/>
-          </w:rPr>
-          <w:fldChar w:fldCharType="begin"/>
-        </w:r>
-        <w:r>
-          <w:rPr>
-            <w:noProof/>
-            <w:webHidden/>
-          </w:rPr>
-          <w:instrText xml:space="preserve"> PAGEREF _Toc239402437 \h </w:instrText>
+          <w:instrText xml:space="preserve"> PAGEREF _Toc244244866 \h </w:instrText>
         </w:r>
         <w:r>
           <w:rPr>
@@ -1792,7 +1524,7 @@
           <w14:ligatures w14:val="standardContextual"/>
         </w:rPr>
       </w:pPr>
-      <w:hyperlink w:anchor="_Toc239402438" w:history="1">
+      <w:hyperlink w:anchor="_Toc244244867" w:history="1">
         <w:r>
           <w:rPr>
             <w:rStyle w:val="Lienhypertexte"/>
@@ -1819,7 +1551,7 @@
             <w:rStyle w:val="Lienhypertexte"/>
             <w:noProof/>
           </w:rPr>
-          <w:t>Divers</w:t>
+          <w:t>Conclusion</w:t>
         </w:r>
         <w:r>
           <w:rPr>
@@ -1840,7 +1572,7 @@
             <w:noProof/>
             <w:webHidden/>
           </w:rPr>
-          <w:instrText xml:space="preserve"> PAGEREF _Toc239402438 \h </w:instrText>
+          <w:instrText xml:space="preserve"> PAGEREF _Toc244244867 \h </w:instrText>
         </w:r>
         <w:r>
           <w:rPr>
@@ -1888,7 +1620,7 @@
           <w14:ligatures w14:val="standardContextual"/>
         </w:rPr>
       </w:pPr>
-      <w:hyperlink w:anchor="_Toc239402439" w:history="1">
+      <w:hyperlink w:anchor="_Toc244244868" w:history="1">
         <w:r>
           <w:rPr>
             <w:rStyle w:val="Lienhypertexte"/>
@@ -1913,7 +1645,7 @@
             <w:rStyle w:val="Lienhypertexte"/>
             <w:noProof/>
           </w:rPr>
-          <w:t>Journal de travail</w:t>
+          <w:t>Bilan des fonctionnalités demandées</w:t>
         </w:r>
         <w:r>
           <w:rPr>
@@ -1934,7 +1666,7 @@
             <w:noProof/>
             <w:webHidden/>
           </w:rPr>
-          <w:instrText xml:space="preserve"> PAGEREF _Toc239402439 \h </w:instrText>
+          <w:instrText xml:space="preserve"> PAGEREF _Toc244244868 \h </w:instrText>
         </w:r>
         <w:r>
           <w:rPr>
@@ -1955,6 +1687,288 @@
             <w:webHidden/>
           </w:rPr>
           <w:t>5</w:t>
+        </w:r>
+        <w:r>
+          <w:rPr>
+            <w:noProof/>
+            <w:webHidden/>
+          </w:rPr>
+          <w:fldChar w:fldCharType="end"/>
+        </w:r>
+      </w:hyperlink>
+    </w:p>
+    <w:p>
+      <w:pPr>
+        <w:pStyle w:val="TM2"/>
+        <w:tabs>
+          <w:tab w:val="left" w:pos="800"/>
+          <w:tab w:val="right" w:leader="dot" w:pos="9060"/>
+        </w:tabs>
+        <w:rPr>
+          <w:rFonts w:eastAsiaTheme="minorEastAsia" w:cstheme="minorBidi"/>
+          <w:smallCaps w:val="0"/>
+          <w:noProof/>
+          <w:kern w:val="2"/>
+          <w:sz w:val="24"/>
+          <w:szCs w:val="24"/>
+          <w14:ligatures w14:val="standardContextual"/>
+        </w:rPr>
+      </w:pPr>
+      <w:hyperlink w:anchor="_Toc244244869" w:history="1">
+        <w:r>
+          <w:rPr>
+            <w:rStyle w:val="Lienhypertexte"/>
+            <w:noProof/>
+          </w:rPr>
+          <w:t>7.2</w:t>
+        </w:r>
+        <w:r>
+          <w:rPr>
+            <w:rFonts w:eastAsiaTheme="minorEastAsia" w:cstheme="minorBidi"/>
+            <w:smallCaps w:val="0"/>
+            <w:noProof/>
+            <w:kern w:val="2"/>
+            <w:sz w:val="24"/>
+            <w:szCs w:val="24"/>
+            <w14:ligatures w14:val="standardContextual"/>
+          </w:rPr>
+          <w:tab/>
+        </w:r>
+        <w:r>
+          <w:rPr>
+            <w:rStyle w:val="Lienhypertexte"/>
+            <w:noProof/>
+          </w:rPr>
+          <w:t>Bilan de la planification</w:t>
+        </w:r>
+        <w:r>
+          <w:rPr>
+            <w:noProof/>
+            <w:webHidden/>
+          </w:rPr>
+          <w:tab/>
+        </w:r>
+        <w:r>
+          <w:rPr>
+            <w:noProof/>
+            <w:webHidden/>
+          </w:rPr>
+          <w:fldChar w:fldCharType="begin"/>
+        </w:r>
+        <w:r>
+          <w:rPr>
+            <w:noProof/>
+            <w:webHidden/>
+          </w:rPr>
+          <w:instrText xml:space="preserve"> PAGEREF _Toc244244869 \h </w:instrText>
+        </w:r>
+        <w:r>
+          <w:rPr>
+            <w:noProof/>
+            <w:webHidden/>
+          </w:rPr>
+        </w:r>
+        <w:r>
+          <w:rPr>
+            <w:noProof/>
+            <w:webHidden/>
+          </w:rPr>
+          <w:fldChar w:fldCharType="separate"/>
+        </w:r>
+        <w:r>
+          <w:rPr>
+            <w:noProof/>
+            <w:webHidden/>
+          </w:rPr>
+          <w:t>5</w:t>
+        </w:r>
+        <w:r>
+          <w:rPr>
+            <w:noProof/>
+            <w:webHidden/>
+          </w:rPr>
+          <w:fldChar w:fldCharType="end"/>
+        </w:r>
+      </w:hyperlink>
+    </w:p>
+    <w:p>
+      <w:pPr>
+        <w:pStyle w:val="TM2"/>
+        <w:tabs>
+          <w:tab w:val="left" w:pos="800"/>
+          <w:tab w:val="right" w:leader="dot" w:pos="9060"/>
+        </w:tabs>
+        <w:rPr>
+          <w:rFonts w:eastAsiaTheme="minorEastAsia" w:cstheme="minorBidi"/>
+          <w:smallCaps w:val="0"/>
+          <w:noProof/>
+          <w:kern w:val="2"/>
+          <w:sz w:val="24"/>
+          <w:szCs w:val="24"/>
+          <w14:ligatures w14:val="standardContextual"/>
+        </w:rPr>
+      </w:pPr>
+      <w:hyperlink w:anchor="_Toc244244870" w:history="1">
+        <w:r>
+          <w:rPr>
+            <w:rStyle w:val="Lienhypertexte"/>
+            <w:noProof/>
+          </w:rPr>
+          <w:t>7.3</w:t>
+        </w:r>
+        <w:r>
+          <w:rPr>
+            <w:rFonts w:eastAsiaTheme="minorEastAsia" w:cstheme="minorBidi"/>
+            <w:smallCaps w:val="0"/>
+            <w:noProof/>
+            <w:kern w:val="2"/>
+            <w:sz w:val="24"/>
+            <w:szCs w:val="24"/>
+            <w14:ligatures w14:val="standardContextual"/>
+          </w:rPr>
+          <w:tab/>
+        </w:r>
+        <w:r>
+          <w:rPr>
+            <w:rStyle w:val="Lienhypertexte"/>
+            <w:noProof/>
+          </w:rPr>
+          <w:t>Bilan personnel</w:t>
+        </w:r>
+        <w:r>
+          <w:rPr>
+            <w:noProof/>
+            <w:webHidden/>
+          </w:rPr>
+          <w:tab/>
+        </w:r>
+        <w:r>
+          <w:rPr>
+            <w:noProof/>
+            <w:webHidden/>
+          </w:rPr>
+          <w:fldChar w:fldCharType="begin"/>
+        </w:r>
+        <w:r>
+          <w:rPr>
+            <w:noProof/>
+            <w:webHidden/>
+          </w:rPr>
+          <w:instrText xml:space="preserve"> PAGEREF _Toc244244870 \h </w:instrText>
+        </w:r>
+        <w:r>
+          <w:rPr>
+            <w:noProof/>
+            <w:webHidden/>
+          </w:rPr>
+        </w:r>
+        <w:r>
+          <w:rPr>
+            <w:noProof/>
+            <w:webHidden/>
+          </w:rPr>
+          <w:fldChar w:fldCharType="separate"/>
+        </w:r>
+        <w:r>
+          <w:rPr>
+            <w:noProof/>
+            <w:webHidden/>
+          </w:rPr>
+          <w:t>6</w:t>
+        </w:r>
+        <w:r>
+          <w:rPr>
+            <w:noProof/>
+            <w:webHidden/>
+          </w:rPr>
+          <w:fldChar w:fldCharType="end"/>
+        </w:r>
+      </w:hyperlink>
+    </w:p>
+    <w:p>
+      <w:pPr>
+        <w:pStyle w:val="TM2"/>
+        <w:tabs>
+          <w:tab w:val="left" w:pos="800"/>
+          <w:tab w:val="right" w:leader="dot" w:pos="9060"/>
+        </w:tabs>
+        <w:rPr>
+          <w:rFonts w:eastAsiaTheme="minorEastAsia" w:cstheme="minorBidi"/>
+          <w:smallCaps w:val="0"/>
+          <w:noProof/>
+          <w:kern w:val="2"/>
+          <w:sz w:val="24"/>
+          <w:szCs w:val="24"/>
+          <w14:ligatures w14:val="standardContextual"/>
+        </w:rPr>
+      </w:pPr>
+      <w:hyperlink w:anchor="_Toc244244871" w:history="1">
+        <w:r>
+          <w:rPr>
+            <w:rStyle w:val="Lienhypertexte"/>
+            <w:noProof/>
+          </w:rPr>
+          <w:t>7.4</w:t>
+        </w:r>
+        <w:r>
+          <w:rPr>
+            <w:rFonts w:eastAsiaTheme="minorEastAsia" w:cstheme="minorBidi"/>
+            <w:smallCaps w:val="0"/>
+            <w:noProof/>
+            <w:kern w:val="2"/>
+            <w:sz w:val="24"/>
+            <w:szCs w:val="24"/>
+            <w14:ligatures w14:val="standardContextual"/>
+          </w:rPr>
+          <w:tab/>
+        </w:r>
+        <w:r>
+          <w:rPr>
+            <w:rStyle w:val="Lienhypertexte"/>
+            <w:noProof/>
+          </w:rPr>
+          <w:t>Bilan de l’utilisation de l’IA</w:t>
+        </w:r>
+        <w:r>
+          <w:rPr>
+            <w:noProof/>
+            <w:webHidden/>
+          </w:rPr>
+          <w:tab/>
+        </w:r>
+        <w:r>
+          <w:rPr>
+            <w:noProof/>
+            <w:webHidden/>
+          </w:rPr>
+          <w:fldChar w:fldCharType="begin"/>
+        </w:r>
+        <w:r>
+          <w:rPr>
+            <w:noProof/>
+            <w:webHidden/>
+          </w:rPr>
+          <w:instrText xml:space="preserve"> PAGEREF _Toc244244871 \h </w:instrText>
+        </w:r>
+        <w:r>
+          <w:rPr>
+            <w:noProof/>
+            <w:webHidden/>
+          </w:rPr>
+        </w:r>
+        <w:r>
+          <w:rPr>
+            <w:noProof/>
+            <w:webHidden/>
+          </w:rPr>
+          <w:fldChar w:fldCharType="separate"/>
+        </w:r>
+        <w:r>
+          <w:rPr>
+            <w:noProof/>
+            <w:webHidden/>
+          </w:rPr>
+          <w:t>6</w:t>
         </w:r>
         <w:r>
           <w:rPr>
@@ -1984,7 +1998,7 @@
           <w14:ligatures w14:val="standardContextual"/>
         </w:rPr>
       </w:pPr>
-      <w:hyperlink w:anchor="_Toc239402440" w:history="1">
+      <w:hyperlink w:anchor="_Toc244244872" w:history="1">
         <w:r>
           <w:rPr>
             <w:rStyle w:val="Lienhypertexte"/>
@@ -2011,7 +2025,7 @@
             <w:rStyle w:val="Lienhypertexte"/>
             <w:noProof/>
           </w:rPr>
-          <w:t>Annexes</w:t>
+          <w:t>Divers</w:t>
         </w:r>
         <w:r>
           <w:rPr>
@@ -2032,7 +2046,7 @@
             <w:noProof/>
             <w:webHidden/>
           </w:rPr>
-          <w:instrText xml:space="preserve"> PAGEREF _Toc239402440 \h </w:instrText>
+          <w:instrText xml:space="preserve"> PAGEREF _Toc244244872 \h </w:instrText>
         </w:r>
         <w:r>
           <w:rPr>
@@ -2052,7 +2066,101 @@
             <w:noProof/>
             <w:webHidden/>
           </w:rPr>
-          <w:t>5</w:t>
+          <w:t>6</w:t>
+        </w:r>
+        <w:r>
+          <w:rPr>
+            <w:noProof/>
+            <w:webHidden/>
+          </w:rPr>
+          <w:fldChar w:fldCharType="end"/>
+        </w:r>
+      </w:hyperlink>
+    </w:p>
+    <w:p>
+      <w:pPr>
+        <w:pStyle w:val="TM2"/>
+        <w:tabs>
+          <w:tab w:val="left" w:pos="800"/>
+          <w:tab w:val="right" w:leader="dot" w:pos="9060"/>
+        </w:tabs>
+        <w:rPr>
+          <w:rFonts w:eastAsiaTheme="minorEastAsia" w:cstheme="minorBidi"/>
+          <w:smallCaps w:val="0"/>
+          <w:noProof/>
+          <w:kern w:val="2"/>
+          <w:sz w:val="24"/>
+          <w:szCs w:val="24"/>
+          <w14:ligatures w14:val="standardContextual"/>
+        </w:rPr>
+      </w:pPr>
+      <w:hyperlink w:anchor="_Toc244244873" w:history="1">
+        <w:r>
+          <w:rPr>
+            <w:rStyle w:val="Lienhypertexte"/>
+            <w:noProof/>
+          </w:rPr>
+          <w:t>8.1</w:t>
+        </w:r>
+        <w:r>
+          <w:rPr>
+            <w:rFonts w:eastAsiaTheme="minorEastAsia" w:cstheme="minorBidi"/>
+            <w:smallCaps w:val="0"/>
+            <w:noProof/>
+            <w:kern w:val="2"/>
+            <w:sz w:val="24"/>
+            <w:szCs w:val="24"/>
+            <w14:ligatures w14:val="standardContextual"/>
+          </w:rPr>
+          <w:tab/>
+        </w:r>
+        <w:r>
+          <w:rPr>
+            <w:rStyle w:val="Lienhypertexte"/>
+            <w:noProof/>
+          </w:rPr>
+          <w:t>Journal de travail</w:t>
+        </w:r>
+        <w:r>
+          <w:rPr>
+            <w:noProof/>
+            <w:webHidden/>
+          </w:rPr>
+          <w:tab/>
+        </w:r>
+        <w:r>
+          <w:rPr>
+            <w:noProof/>
+            <w:webHidden/>
+          </w:rPr>
+          <w:fldChar w:fldCharType="begin"/>
+        </w:r>
+        <w:r>
+          <w:rPr>
+            <w:noProof/>
+            <w:webHidden/>
+          </w:rPr>
+          <w:instrText xml:space="preserve"> PAGEREF _Toc244244873 \h </w:instrText>
+        </w:r>
+        <w:r>
+          <w:rPr>
+            <w:noProof/>
+            <w:webHidden/>
+          </w:rPr>
+        </w:r>
+        <w:r>
+          <w:rPr>
+            <w:noProof/>
+            <w:webHidden/>
+          </w:rPr>
+          <w:fldChar w:fldCharType="separate"/>
+        </w:r>
+        <w:r>
+          <w:rPr>
+            <w:noProof/>
+            <w:webHidden/>
+          </w:rPr>
+          <w:t>6</w:t>
         </w:r>
         <w:r>
           <w:rPr>
@@ -2085,7 +2193,7 @@
       </w:pPr>
       <w:bookmarkStart w:id="0" w:name="_Toc532179955"/>
       <w:bookmarkStart w:id="1" w:name="_Toc165969637"/>
-      <w:bookmarkStart w:id="2" w:name="_Toc239402421"/>
+      <w:bookmarkStart w:id="2" w:name="_Toc244244853"/>
       <w:r>
         <w:lastRenderedPageBreak/>
         <w:t>Spécifications</w:t>
@@ -2105,7 +2213,7 @@
       </w:pPr>
       <w:bookmarkStart w:id="3" w:name="_Toc532179969"/>
       <w:bookmarkStart w:id="4" w:name="_Toc165969639"/>
-      <w:bookmarkStart w:id="5" w:name="_Toc239402422"/>
+      <w:bookmarkStart w:id="5" w:name="_Toc244244854"/>
       <w:r>
         <w:t>T</w:t>
       </w:r>
@@ -2142,7 +2250,7 @@
       <w:pPr>
         <w:pStyle w:val="Titre2"/>
       </w:pPr>
-      <w:bookmarkStart w:id="6" w:name="_Toc239402423"/>
+      <w:bookmarkStart w:id="6" w:name="_Toc244244855"/>
       <w:r>
         <w:t>Description</w:t>
       </w:r>
@@ -2187,7 +2295,7 @@
       <w:pPr>
         <w:pStyle w:val="Titre2"/>
       </w:pPr>
-      <w:bookmarkStart w:id="7" w:name="_Toc239402424"/>
+      <w:bookmarkStart w:id="7" w:name="_Toc244244856"/>
       <w:r>
         <w:t>Matériel et logiciels à disposition</w:t>
       </w:r>
@@ -2211,7 +2319,7 @@
       <w:pPr>
         <w:pStyle w:val="Titre2"/>
       </w:pPr>
-      <w:bookmarkStart w:id="8" w:name="_Toc239402425"/>
+      <w:bookmarkStart w:id="8" w:name="_Toc244244857"/>
       <w:r>
         <w:t>P</w:t>
       </w:r>
@@ -2242,7 +2350,7 @@
       <w:pPr>
         <w:pStyle w:val="Titre2"/>
       </w:pPr>
-      <w:bookmarkStart w:id="9" w:name="_Toc239402426"/>
+      <w:bookmarkStart w:id="9" w:name="_Toc244244858"/>
       <w:r>
         <w:t>Cahier des charges</w:t>
       </w:r>
@@ -2271,7 +2379,7 @@
       <w:pPr>
         <w:pStyle w:val="Titre1"/>
       </w:pPr>
-      <w:bookmarkStart w:id="10" w:name="_Toc239402427"/>
+      <w:bookmarkStart w:id="10" w:name="_Toc244244859"/>
       <w:r>
         <w:t>Planification</w:t>
       </w:r>
@@ -2299,7 +2407,7 @@
       </w:pPr>
       <w:bookmarkStart w:id="11" w:name="_Toc532179957"/>
       <w:bookmarkStart w:id="12" w:name="_Toc165969641"/>
-      <w:bookmarkStart w:id="13" w:name="_Toc239402428"/>
+      <w:bookmarkStart w:id="13" w:name="_Toc244244860"/>
       <w:r>
         <w:t>Analyse</w:t>
       </w:r>
@@ -2404,11 +2512,9 @@
       <w:r>
         <w:t xml:space="preserve">Supprimer </w:t>
       </w:r>
-      <w:proofErr w:type="spellStart"/>
-      <w:r>
-        <w:t>l’object</w:t>
-      </w:r>
-      <w:proofErr w:type="spellEnd"/>
+      <w:r>
+        <w:t>l’Object</w:t>
+      </w:r>
       <w:r>
         <w:t xml:space="preserve"> en laissant une trace dans l’historique</w:t>
       </w:r>
@@ -2634,7 +2740,7 @@
       </w:pPr>
       <w:bookmarkStart w:id="14" w:name="_Toc532179964"/>
       <w:bookmarkStart w:id="15" w:name="_Toc165969648"/>
-      <w:bookmarkStart w:id="16" w:name="_Toc239402429"/>
+      <w:bookmarkStart w:id="16" w:name="_Toc244244861"/>
       <w:r>
         <w:t>Réalisation</w:t>
       </w:r>
@@ -2646,593 +2752,575 @@
       <w:pPr>
         <w:pStyle w:val="Titre2"/>
       </w:pPr>
-      <w:bookmarkStart w:id="17" w:name="_Toc532179965"/>
-      <w:bookmarkStart w:id="18" w:name="_Toc165969649"/>
-      <w:bookmarkStart w:id="19" w:name="_Toc239402430"/>
-      <w:r>
-        <w:t>Dossier de Réalisation</w:t>
+      <w:bookmarkStart w:id="17" w:name="_Toc244244862"/>
+      <w:r>
+        <w:t>Bilan du déroulement du projet</w:t>
       </w:r>
       <w:bookmarkEnd w:id="17"/>
+    </w:p>
+    <w:p>
+      <w:pPr>
+        <w:pStyle w:val="Retraitcorpsdetexte"/>
+      </w:pPr>
+      <w:r>
+        <w:t xml:space="preserve">Lors de ce projet une partie du temps a été consacré a testé les différentes fonctionnalités de mon code pour voir </w:t>
+      </w:r>
+      <w:r>
+        <w:t>s’il</w:t>
+      </w:r>
+      <w:r>
+        <w:t xml:space="preserve"> y avait un bug et une autre petite partie </w:t>
+      </w:r>
+      <w:r>
+        <w:t>à</w:t>
+      </w:r>
+      <w:r>
+        <w:t xml:space="preserve"> discuter avec Luca et Hugo pour essayer de comprendre ce </w:t>
+      </w:r>
+      <w:r>
+        <w:t>qui n’allait pas</w:t>
+      </w:r>
+      <w:r>
+        <w:t xml:space="preserve"> ou juste pour leur faire essayer mon code.</w:t>
+      </w:r>
+    </w:p>
+    <w:p>
+      <w:pPr>
+        <w:pStyle w:val="Retraitcorpsdetexte"/>
+      </w:pPr>
+    </w:p>
+    <w:p>
+      <w:pPr>
+        <w:pStyle w:val="Retraitcorpsdetexte"/>
+      </w:pPr>
+      <w:r>
+        <w:t>J’ai eu pas mal de problèmes au début du projet pour tout ce qui touche aux Objets</w:t>
+      </w:r>
+      <w:r>
+        <w:t>, particulièrement avec l’entrée des voitures</w:t>
+      </w:r>
+      <w:r>
+        <w:t>, car je ne comprenais pas encore très bien leurs fonctionnements et j’ai pris un peu de retard par apport à la planification initiale.</w:t>
+      </w:r>
+    </w:p>
+    <w:p>
+      <w:pPr>
+        <w:pStyle w:val="Retraitcorpsdetexte"/>
+      </w:pPr>
+    </w:p>
+    <w:p>
+      <w:pPr>
+        <w:pStyle w:val="Retraitcorpsdetexte"/>
+      </w:pPr>
+      <w:r>
+        <w:t xml:space="preserve">Dès que les Objets ont été compris, le projet a </w:t>
+      </w:r>
+      <w:r>
+        <w:t>commencé</w:t>
+      </w:r>
+      <w:r>
+        <w:t xml:space="preserve"> à avancer plus vite.</w:t>
+      </w:r>
+    </w:p>
+    <w:p>
+      <w:pPr>
+        <w:pStyle w:val="Titre2"/>
+      </w:pPr>
+      <w:bookmarkStart w:id="18" w:name="_Toc244244863"/>
+      <w:r>
+        <w:t>Bilan produit</w:t>
+      </w:r>
       <w:bookmarkEnd w:id="18"/>
+    </w:p>
+    <w:p>
+      <w:pPr>
+        <w:pStyle w:val="Retraitcorpsdetexte"/>
+      </w:pPr>
+      <w:r>
+        <w:t xml:space="preserve">Pour ce projet tout ce qui a été demandé </w:t>
+      </w:r>
+      <w:r>
+        <w:t>a été fait.</w:t>
+      </w:r>
+    </w:p>
+    <w:p>
+      <w:pPr>
+        <w:pStyle w:val="Retraitcorpsdetexte"/>
+      </w:pPr>
+    </w:p>
+    <w:p>
+      <w:pPr>
+        <w:pStyle w:val="Retraitcorpsdetexte"/>
+      </w:pPr>
+    </w:p>
+    <w:p>
+      <w:pPr>
+        <w:pStyle w:val="Retraitcorpsdetexte"/>
+      </w:pPr>
+    </w:p>
+    <w:p>
+      <w:pPr>
+        <w:pStyle w:val="Retraitcorpsdetexte"/>
+      </w:pPr>
+    </w:p>
+    <w:p>
+      <w:pPr>
+        <w:pStyle w:val="Titre1"/>
+      </w:pPr>
+      <w:bookmarkStart w:id="19" w:name="_Toc532179966"/>
+      <w:bookmarkStart w:id="20" w:name="_Toc165969650"/>
+      <w:bookmarkStart w:id="21" w:name="_Toc244244864"/>
+      <w:r>
+        <w:lastRenderedPageBreak/>
+        <w:t>Tests</w:t>
+      </w:r>
       <w:bookmarkEnd w:id="19"/>
-    </w:p>
-    <w:p>
-      <w:pPr>
-        <w:pStyle w:val="Informations"/>
-        <w:numPr>
-          <w:ilvl w:val="5"/>
-          <w:numId w:val="5"/>
-        </w:numPr>
-      </w:pPr>
-      <w:r>
-        <w:t>Ce</w:t>
-      </w:r>
-      <w:r>
-        <w:t>tte partie</w:t>
-      </w:r>
-      <w:r>
-        <w:t xml:space="preserve"> permet de reproduire ou reprendre le projet par un tiers.</w:t>
-      </w:r>
-    </w:p>
-    <w:p>
-      <w:pPr>
-        <w:pStyle w:val="Informations"/>
-        <w:numPr>
-          <w:ilvl w:val="5"/>
-          <w:numId w:val="5"/>
-        </w:numPr>
-      </w:pPr>
-      <w:r>
-        <w:t xml:space="preserve">Pour chaque </w:t>
-      </w:r>
-      <w:r>
-        <w:t xml:space="preserve">étape, il faut décrire sa mise en </w:t>
-      </w:r>
-      <w:r>
-        <w:t>œuvre. Typiquement</w:t>
-      </w:r>
-      <w:r>
-        <w:t> :</w:t>
-      </w:r>
-    </w:p>
-    <w:p>
-      <w:pPr>
-        <w:pStyle w:val="Informations"/>
-        <w:numPr>
-          <w:ilvl w:val="6"/>
-          <w:numId w:val="5"/>
-        </w:numPr>
-      </w:pPr>
-      <w:r>
-        <w:t>Versions des outils logiciels utilisés (OS, applications, pilotes, librairies, etc.)</w:t>
-      </w:r>
-    </w:p>
-    <w:p>
-      <w:pPr>
-        <w:pStyle w:val="Informations"/>
-        <w:numPr>
-          <w:ilvl w:val="6"/>
-          <w:numId w:val="5"/>
-        </w:numPr>
-      </w:pPr>
-      <w:r>
-        <w:t>Configurations spéciales</w:t>
-      </w:r>
-      <w:r>
-        <w:t xml:space="preserve"> des outils (Equipements, </w:t>
-      </w:r>
-      <w:r>
-        <w:t>PC</w:t>
-      </w:r>
-      <w:r>
-        <w:t xml:space="preserve">, machines, </w:t>
-      </w:r>
-      <w:r>
-        <w:t xml:space="preserve">outillage, </w:t>
-      </w:r>
-      <w:r>
-        <w:t>etc.)</w:t>
-      </w:r>
-    </w:p>
-    <w:p>
-      <w:pPr>
-        <w:pStyle w:val="Informations"/>
-        <w:numPr>
-          <w:ilvl w:val="6"/>
-          <w:numId w:val="5"/>
-        </w:numPr>
-      </w:pPr>
-      <w:r>
-        <w:t xml:space="preserve">Code source </w:t>
-      </w:r>
-      <w:r>
-        <w:t xml:space="preserve">commenté </w:t>
-      </w:r>
-      <w:r>
-        <w:t xml:space="preserve">des </w:t>
-      </w:r>
-      <w:r>
-        <w:t>éléments logiciels</w:t>
-      </w:r>
-      <w:r>
-        <w:t xml:space="preserve"> développés.</w:t>
-      </w:r>
-    </w:p>
-    <w:p>
-      <w:pPr>
-        <w:pStyle w:val="Informations"/>
-        <w:numPr>
-          <w:ilvl w:val="6"/>
-          <w:numId w:val="5"/>
-        </w:numPr>
-      </w:pPr>
-      <w:r>
-        <w:t>Modèle physique d’une base de données.</w:t>
-      </w:r>
-    </w:p>
-    <w:p>
-      <w:pPr>
-        <w:pStyle w:val="Informations"/>
-        <w:numPr>
-          <w:ilvl w:val="6"/>
-          <w:numId w:val="5"/>
-        </w:numPr>
-      </w:pPr>
-      <w:r>
-        <w:t>Arborescences des documents produits</w:t>
-      </w:r>
-      <w:r>
-        <w:t>.</w:t>
-      </w:r>
-    </w:p>
-    <w:p>
-      <w:pPr>
-        <w:pStyle w:val="Informations"/>
-        <w:numPr>
-          <w:ilvl w:val="5"/>
-          <w:numId w:val="5"/>
-        </w:numPr>
-      </w:pPr>
-      <w:r>
-        <w:t>Il faut décrire le parcours de réalisation e</w:t>
-      </w:r>
-      <w:r>
-        <w:t>t</w:t>
-      </w:r>
-      <w:r>
-        <w:t xml:space="preserve"> justifi</w:t>
-      </w:r>
-      <w:r>
-        <w:t>er</w:t>
-      </w:r>
-      <w:r>
-        <w:t xml:space="preserve"> les choix. </w:t>
-      </w:r>
-    </w:p>
-    <w:p>
-      <w:pPr>
-        <w:pStyle w:val="Titre2"/>
-      </w:pPr>
-      <w:bookmarkStart w:id="20" w:name="_Toc532179960"/>
-      <w:bookmarkStart w:id="21" w:name="_Toc165969644"/>
-      <w:bookmarkStart w:id="22" w:name="_Toc239402431"/>
-      <w:r>
-        <w:t>Modifications</w:t>
-      </w:r>
       <w:bookmarkEnd w:id="20"/>
       <w:bookmarkEnd w:id="21"/>
+    </w:p>
+    <w:p>
+      <w:pPr>
+        <w:pStyle w:val="Titre2"/>
+      </w:pPr>
+      <w:bookmarkStart w:id="22" w:name="_Toc532179968"/>
+      <w:bookmarkStart w:id="23" w:name="_Toc165969652"/>
+      <w:bookmarkStart w:id="24" w:name="_Ref308525868"/>
+      <w:bookmarkStart w:id="25" w:name="_Toc244244865"/>
+      <w:r>
+        <w:t>Rapport</w:t>
+      </w:r>
+      <w:r>
+        <w:t xml:space="preserve"> des tests</w:t>
+      </w:r>
       <w:bookmarkEnd w:id="22"/>
-    </w:p>
-    <w:p>
-      <w:pPr>
-        <w:pStyle w:val="Informations"/>
-        <w:numPr>
-          <w:ilvl w:val="5"/>
-          <w:numId w:val="6"/>
-        </w:numPr>
-      </w:pPr>
-      <w:r>
-        <w:t>Historique</w:t>
-      </w:r>
-      <w:r>
-        <w:t xml:space="preserve"> des modifications demandées (ou nécessaires) au</w:t>
-      </w:r>
-      <w:r>
-        <w:t>x</w:t>
-      </w:r>
-      <w:r>
-        <w:t xml:space="preserve"> spécifications détaillé</w:t>
-      </w:r>
-      <w:r>
-        <w:t>es.</w:t>
-      </w:r>
-    </w:p>
-    <w:p>
-      <w:pPr>
-        <w:pStyle w:val="Informations"/>
-        <w:numPr>
-          <w:ilvl w:val="5"/>
-          <w:numId w:val="6"/>
-        </w:numPr>
-      </w:pPr>
-      <w:r>
-        <w:t>Date, raison, description, etc.</w:t>
-      </w:r>
-    </w:p>
-    <w:p>
-      <w:pPr>
-        <w:pStyle w:val="Titre1"/>
-      </w:pPr>
-      <w:bookmarkStart w:id="23" w:name="_Toc532179966"/>
-      <w:bookmarkStart w:id="24" w:name="_Toc165969650"/>
-      <w:bookmarkStart w:id="25" w:name="_Toc239402432"/>
-      <w:r>
-        <w:t>Tests</w:t>
-      </w:r>
       <w:bookmarkEnd w:id="23"/>
       <w:bookmarkEnd w:id="24"/>
       <w:bookmarkEnd w:id="25"/>
     </w:p>
     <w:p>
+      <w:r>
+        <w:drawing>
+          <wp:inline distT="0" distB="0" distL="0" distR="0" wp14:anchorId="6C1F56B6" wp14:editId="782DAB54">
+            <wp:extent cx="5759450" cy="2082165"/>
+            <wp:effectExtent l="0" t="0" r="0" b="0"/>
+            <wp:docPr id="1308819522" name="Image 1"/>
+            <wp:cNvGraphicFramePr>
+              <a:graphicFrameLocks xmlns:a="http://schemas.openxmlformats.org/drawingml/2006/main" noChangeAspect="1"/>
+            </wp:cNvGraphicFramePr>
+            <a:graphic xmlns:a="http://schemas.openxmlformats.org/drawingml/2006/main">
+              <a:graphicData uri="http://schemas.openxmlformats.org/drawingml/2006/picture">
+                <pic:pic xmlns:pic="http://schemas.openxmlformats.org/drawingml/2006/picture">
+                  <pic:nvPicPr>
+                    <pic:cNvPr id="1308819522" name=""/>
+                    <pic:cNvPicPr/>
+                  </pic:nvPicPr>
+                  <pic:blipFill>
+                    <a:blip r:embed="rId12"/>
+                    <a:stretch>
+                      <a:fillRect/>
+                    </a:stretch>
+                  </pic:blipFill>
+                  <pic:spPr>
+                    <a:xfrm>
+                      <a:off x="0" y="0"/>
+                      <a:ext cx="5759450" cy="2082165"/>
+                    </a:xfrm>
+                    <a:prstGeom prst="rect">
+                      <a:avLst/>
+                    </a:prstGeom>
+                  </pic:spPr>
+                </pic:pic>
+              </a:graphicData>
+            </a:graphic>
+          </wp:inline>
+        </w:drawing>
+      </w:r>
+    </w:p>
+    <w:p>
+      <w:pPr>
+        <w:pStyle w:val="Titre1"/>
+      </w:pPr>
+      <w:bookmarkStart w:id="26" w:name="_Toc165969653"/>
+      <w:bookmarkStart w:id="27" w:name="_Toc244244866"/>
+      <w:r>
+        <w:t>Conception</w:t>
+      </w:r>
+      <w:bookmarkEnd w:id="27"/>
+    </w:p>
+    <w:p>
+      <w:pPr>
+        <w:pStyle w:val="Corpsdetexte"/>
+      </w:pPr>
+      <w:r>
+        <w:drawing>
+          <wp:inline distT="0" distB="0" distL="0" distR="0" wp14:anchorId="188929FA" wp14:editId="0F39D30B">
+            <wp:extent cx="1317831" cy="2243580"/>
+            <wp:effectExtent l="0" t="0" r="0" b="4445"/>
+            <wp:docPr id="533950045" name="Image 1"/>
+            <wp:cNvGraphicFramePr>
+              <a:graphicFrameLocks xmlns:a="http://schemas.openxmlformats.org/drawingml/2006/main" noChangeAspect="1"/>
+            </wp:cNvGraphicFramePr>
+            <a:graphic xmlns:a="http://schemas.openxmlformats.org/drawingml/2006/main">
+              <a:graphicData uri="http://schemas.openxmlformats.org/drawingml/2006/picture">
+                <pic:pic xmlns:pic="http://schemas.openxmlformats.org/drawingml/2006/picture">
+                  <pic:nvPicPr>
+                    <pic:cNvPr id="533950045" name=""/>
+                    <pic:cNvPicPr/>
+                  </pic:nvPicPr>
+                  <pic:blipFill>
+                    <a:blip r:embed="rId13"/>
+                    <a:stretch>
+                      <a:fillRect/>
+                    </a:stretch>
+                  </pic:blipFill>
+                  <pic:spPr>
+                    <a:xfrm>
+                      <a:off x="0" y="0"/>
+                      <a:ext cx="1322648" cy="2251780"/>
+                    </a:xfrm>
+                    <a:prstGeom prst="rect">
+                      <a:avLst/>
+                    </a:prstGeom>
+                  </pic:spPr>
+                </pic:pic>
+              </a:graphicData>
+            </a:graphic>
+          </wp:inline>
+        </w:drawing>
+      </w:r>
+    </w:p>
+    <w:p>
+      <w:pPr>
+        <w:pStyle w:val="Corpsdetexte"/>
+      </w:pPr>
+      <w:r>
+        <w:t>Mon diagramme de classe contient 3 classes : Parking, Voiture et Ticket.</w:t>
+      </w:r>
+    </w:p>
+    <w:p>
+      <w:pPr>
+        <w:pStyle w:val="Corpsdetexte"/>
+      </w:pPr>
+      <w:r>
+        <w:t xml:space="preserve">La classe Parking gère </w:t>
+      </w:r>
+      <w:r>
+        <w:t>le parking, surtout pour le nombre de places disponible , les entrées des véhicules, les sorties et l’affichage.</w:t>
+      </w:r>
+    </w:p>
+    <w:p>
+      <w:pPr>
+        <w:pStyle w:val="Corpsdetexte"/>
+      </w:pPr>
+      <w:r>
+        <w:t>La classe Voiture représente les voitures avec leurs places et leurs plaques.</w:t>
+      </w:r>
+    </w:p>
+    <w:p>
+      <w:pPr>
+        <w:pStyle w:val="Corpsdetexte"/>
+      </w:pPr>
+      <w:r>
+        <w:t xml:space="preserve">La classe Ticket représente les tickets qui garde les informations du stationnement ainsi que le prix du parking et le temps que la voiture est restée </w:t>
+      </w:r>
+    </w:p>
+    <w:p>
+      <w:pPr>
+        <w:pStyle w:val="Titre1"/>
+      </w:pPr>
+      <w:bookmarkStart w:id="28" w:name="_Toc244244867"/>
+      <w:r>
+        <w:t>Conclusion</w:t>
+      </w:r>
+      <w:bookmarkEnd w:id="26"/>
+      <w:bookmarkEnd w:id="28"/>
+    </w:p>
+    <w:p>
       <w:pPr>
         <w:pStyle w:val="Titre2"/>
       </w:pPr>
-      <w:bookmarkStart w:id="26" w:name="_Toc532179968"/>
-      <w:bookmarkStart w:id="27" w:name="_Toc165969652"/>
-      <w:bookmarkStart w:id="28" w:name="_Ref308525868"/>
-      <w:bookmarkStart w:id="29" w:name="_Toc239402433"/>
-      <w:r>
-        <w:t>Dossier des tests</w:t>
-      </w:r>
-      <w:bookmarkEnd w:id="26"/>
-      <w:bookmarkEnd w:id="27"/>
-      <w:bookmarkEnd w:id="28"/>
+      <w:bookmarkStart w:id="29" w:name="_Toc165969654"/>
+      <w:bookmarkStart w:id="30" w:name="_Toc244244868"/>
+      <w:r>
+        <w:t xml:space="preserve">Bilan des </w:t>
+      </w:r>
       <w:bookmarkEnd w:id="29"/>
-    </w:p>
-    <w:p>
-      <w:pPr>
-        <w:pStyle w:val="Informations"/>
+      <w:r>
+        <w:t>fonctionnalités demandées</w:t>
+      </w:r>
+      <w:bookmarkEnd w:id="30"/>
+    </w:p>
+    <w:p>
+      <w:pPr>
+        <w:ind w:left="1134"/>
+      </w:pPr>
+      <w:r>
+        <w:t>Tout ce qui a été demandé dans le cahier des charges a été implémenté</w:t>
+      </w:r>
+    </w:p>
+    <w:p>
+      <w:pPr>
+        <w:pStyle w:val="Titre2"/>
+      </w:pPr>
+      <w:bookmarkStart w:id="31" w:name="_Toc165969655"/>
+      <w:bookmarkStart w:id="32" w:name="_Toc244244869"/>
+      <w:r>
+        <w:t>Bilan de la planification</w:t>
+      </w:r>
+      <w:bookmarkEnd w:id="31"/>
+      <w:bookmarkEnd w:id="32"/>
+    </w:p>
+    <w:p>
+      <w:pPr>
+        <w:ind w:left="1134"/>
+      </w:pPr>
+      <w:r>
+        <w:t>J’ai pris du retard surtout vers le début lors de la création de la méthode qui gère l’entrée des véhicules. Mais le retard a été rattrapé durant les vacances d’octobre.</w:t>
+      </w:r>
+    </w:p>
+    <w:p>
+      <w:pPr>
+        <w:pStyle w:val="Titre2"/>
+      </w:pPr>
+      <w:bookmarkStart w:id="33" w:name="_Toc165969656"/>
+      <w:bookmarkStart w:id="34" w:name="_Toc244244870"/>
+      <w:r>
+        <w:lastRenderedPageBreak/>
+        <w:t>Bilan personnel</w:t>
+      </w:r>
+      <w:bookmarkEnd w:id="33"/>
+      <w:bookmarkEnd w:id="34"/>
+    </w:p>
+    <w:p>
+      <w:pPr>
+        <w:ind w:left="1134"/>
+      </w:pPr>
+      <w:r>
+        <w:t>Si c’était à refaire je garderai le petit feedback chaque semaine car je trouve cela nécessaire pour suivre l’évolution de notre note finale.</w:t>
+      </w:r>
+    </w:p>
+    <w:p>
+      <w:pPr>
+        <w:pStyle w:val="Titre2"/>
+      </w:pPr>
+      <w:bookmarkStart w:id="35" w:name="_Toc244244871"/>
+      <w:r>
+        <w:t>Bilan de l’utilisation de l’IA</w:t>
+      </w:r>
+      <w:bookmarkEnd w:id="35"/>
+    </w:p>
+    <w:p>
+      <w:pPr>
+        <w:ind w:left="1416"/>
+      </w:pPr>
+      <w:r>
+        <w:t>Lors de ce projet, je l’ai utilisé lors de la planification initiale pour avoir une comparaison externe</w:t>
+      </w:r>
+      <w:r>
+        <w:br/>
+      </w:r>
+      <w:r>
+        <w:br/>
+        <w:t>L’IA utilisée a été ChatGPT</w:t>
+      </w:r>
+    </w:p>
+    <w:p>
+      <w:pPr>
+        <w:ind w:left="1416"/>
+      </w:pPr>
+    </w:p>
+    <w:p>
+      <w:pPr>
+        <w:ind w:left="1416"/>
+      </w:pPr>
+      <w:r>
+        <w:t xml:space="preserve">Luca m’avait fait prendre conscience que le scrollback ne se supprimait pas avec le Console.Clear(), et il m’ a donc donné sa ligne : </w:t>
+      </w:r>
+      <w:r>
+        <w:t>Console.Write("\x1b[3J");</w:t>
+      </w:r>
+    </w:p>
+    <w:p>
+      <w:pPr>
+        <w:ind w:left="1416"/>
+      </w:pPr>
+    </w:p>
+    <w:p>
+      <w:pPr>
+        <w:ind w:left="1416"/>
+      </w:pPr>
+      <w:r>
+        <w:t xml:space="preserve">Je me suis donc </w:t>
+      </w:r>
+      <w:r>
+        <w:t>renseigné</w:t>
+      </w:r>
+      <w:r>
+        <w:t xml:space="preserve"> avec l’IA en lui demandant :</w:t>
+      </w:r>
+      <w:r>
+        <w:rPr>
+          <w:rFonts w:ascii="Segoe UI" w:hAnsi="Segoe UI" w:cs="Segoe UI"/>
+          <w:color w:val="0C274A"/>
+          <w:shd w:val="clear" w:color="auto" w:fill="E8F3FE"/>
+        </w:rPr>
+        <w:t xml:space="preserve"> </w:t>
+      </w:r>
+      <w:r>
+        <w:t>ça</w:t>
+      </w:r>
+      <w:r>
+        <w:t xml:space="preserve"> fait quoi Console.Write("\x1b[3J");</w:t>
+      </w:r>
+      <w:r>
+        <w:t xml:space="preserve">. Elle m’a répondu : </w:t>
+      </w:r>
+    </w:p>
+    <w:p>
+      <w:pPr>
+        <w:ind w:left="1416"/>
+      </w:pPr>
+    </w:p>
+    <w:p>
+      <w:pPr>
+        <w:pStyle w:val="Paragraphedeliste"/>
         <w:numPr>
-          <w:ilvl w:val="5"/>
-          <w:numId w:val="7"/>
+          <w:ilvl w:val="0"/>
+          <w:numId w:val="13"/>
         </w:numPr>
       </w:pPr>
       <w:r>
-        <w:t>On dresse le bilan des t</w:t>
-      </w:r>
-      <w:r>
-        <w:t>ests effectués (qui, quand, avec quelles données…)</w:t>
-      </w:r>
-      <w:r>
-        <w:t xml:space="preserve"> sous forme de procédure. Lorsque cela est possible, fournir un tableau des tests effectués avec les résultats obtenus et les actions à entreprendre en conséquence</w:t>
-      </w:r>
-      <w:r>
-        <w:t xml:space="preserve"> (et une estimation de leur durée)</w:t>
-      </w:r>
-      <w:r>
-        <w:t>.</w:t>
-      </w:r>
-    </w:p>
-    <w:p>
-      <w:pPr>
-        <w:pStyle w:val="Informations"/>
+        <w:t>Console.Write(...) : écrit du texte dans la console sans retour à la ligne.</w:t>
+      </w:r>
+    </w:p>
+    <w:p>
+      <w:pPr>
+        <w:pStyle w:val="Paragraphedeliste"/>
         <w:numPr>
-          <w:ilvl w:val="5"/>
-          <w:numId w:val="7"/>
+          <w:ilvl w:val="0"/>
+          <w:numId w:val="13"/>
         </w:numPr>
       </w:pPr>
       <w:r>
-        <w:t xml:space="preserve">Si des tests prévus dans la stratégie n'ont pas pu être </w:t>
-      </w:r>
-      <w:r>
-        <w:t>effectués :</w:t>
-      </w:r>
-    </w:p>
-    <w:p>
-      <w:pPr>
-        <w:pStyle w:val="Informations"/>
+        <w:t>\</w:t>
+      </w:r>
+      <w:r>
+        <w:t>x1b : représente le caractère d'échappement ESC (code hexadécimal 1B).</w:t>
+      </w:r>
+    </w:p>
+    <w:p>
+      <w:pPr>
+        <w:pStyle w:val="Paragraphedeliste"/>
         <w:numPr>
-          <w:ilvl w:val="6"/>
-          <w:numId w:val="7"/>
+          <w:ilvl w:val="0"/>
+          <w:numId w:val="13"/>
         </w:numPr>
       </w:pPr>
-      <w:proofErr w:type="gramStart"/>
-      <w:r>
-        <w:t>raison</w:t>
-      </w:r>
-      <w:proofErr w:type="gramEnd"/>
-      <w:r>
-        <w:t>, décisions, etc.</w:t>
-      </w:r>
-    </w:p>
-    <w:p>
-      <w:pPr>
-        <w:pStyle w:val="Informations"/>
-        <w:numPr>
-          <w:ilvl w:val="5"/>
-          <w:numId w:val="7"/>
-        </w:numPr>
-      </w:pPr>
-      <w:r>
-        <w:t xml:space="preserve">Liste des bugs répertoriés avec la date de découverte et leur </w:t>
-      </w:r>
-      <w:proofErr w:type="gramStart"/>
-      <w:r>
-        <w:t>état:</w:t>
-      </w:r>
-      <w:proofErr w:type="gramEnd"/>
-    </w:p>
-    <w:p>
-      <w:pPr>
-        <w:pStyle w:val="Informations"/>
-        <w:numPr>
-          <w:ilvl w:val="6"/>
-          <w:numId w:val="7"/>
-        </w:numPr>
-      </w:pPr>
-      <w:r>
-        <w:t>Corrigé</w:t>
-      </w:r>
-      <w:r>
-        <w:t xml:space="preserve">, </w:t>
-      </w:r>
-      <w:r>
-        <w:t>date de correction, corrigé par, etc.</w:t>
+      <w:r>
+        <w:t>[3J : commande ANSI qui demande au terminal d'effacer son historique de défilement.</w:t>
+      </w:r>
+    </w:p>
+    <w:p>
+      <w:pPr>
+        <w:ind w:left="1287"/>
+      </w:pPr>
+      <w:r>
+        <w:t xml:space="preserve">Grâce </w:t>
+      </w:r>
+      <w:r>
+        <w:t>à</w:t>
+      </w:r>
+      <w:r>
+        <w:t xml:space="preserve"> </w:t>
+      </w:r>
+      <w:r>
+        <w:t>ça</w:t>
+      </w:r>
+      <w:r>
+        <w:t xml:space="preserve"> j’ai compris </w:t>
+      </w:r>
+      <w:r>
+        <w:t>à</w:t>
+      </w:r>
+      <w:r>
+        <w:t xml:space="preserve"> quoi </w:t>
+      </w:r>
+      <w:r>
+        <w:t>ça</w:t>
+      </w:r>
+      <w:r>
+        <w:t xml:space="preserve"> servait.</w:t>
+      </w:r>
+    </w:p>
+    <w:p>
+      <w:pPr>
+        <w:ind w:left="1287"/>
+      </w:pPr>
+    </w:p>
+    <w:p>
+      <w:pPr>
+        <w:ind w:left="1287"/>
+      </w:pPr>
+      <w:r>
+        <w:t xml:space="preserve">Vu qu’on ne </w:t>
+      </w:r>
+      <w:r>
+        <w:t>pouvait</w:t>
+      </w:r>
+      <w:r>
+        <w:t xml:space="preserve"> pas utiliser l’IA pour générer du code, je n’ai pas fait d’autre utilisations.</w:t>
+      </w:r>
+    </w:p>
+    <w:p>
+      <w:pPr>
+        <w:ind w:left="1416"/>
+      </w:pPr>
+    </w:p>
+    <w:p>
+      <w:pPr>
+        <w:ind w:left="1416"/>
+      </w:pPr>
+    </w:p>
+    <w:p>
+      <w:pPr>
+        <w:ind w:left="1416"/>
+      </w:pPr>
+    </w:p>
+    <w:p>
+      <w:pPr>
+        <w:ind w:left="1416"/>
+      </w:pPr>
+      <w:r>
+        <w:t xml:space="preserve"> </w:t>
       </w:r>
     </w:p>
     <w:p>
       <w:pPr>
         <w:pStyle w:val="Titre1"/>
       </w:pPr>
-      <w:bookmarkStart w:id="30" w:name="_Toc165969653"/>
-      <w:bookmarkStart w:id="31" w:name="_Toc239402434"/>
-      <w:r>
-        <w:lastRenderedPageBreak/>
-        <w:t>Conclusion</w:t>
-      </w:r>
-      <w:bookmarkEnd w:id="30"/>
-      <w:bookmarkEnd w:id="31"/>
-    </w:p>
-    <w:p>
-      <w:pPr>
-        <w:pStyle w:val="Titre2"/>
-      </w:pPr>
-      <w:bookmarkStart w:id="32" w:name="_Toc165969654"/>
-      <w:bookmarkStart w:id="33" w:name="_Toc239402435"/>
-      <w:r>
-        <w:t xml:space="preserve">Bilan des </w:t>
-      </w:r>
-      <w:bookmarkEnd w:id="32"/>
-      <w:r>
-        <w:t>fonctionnalités demandées</w:t>
-      </w:r>
-      <w:bookmarkEnd w:id="33"/>
-    </w:p>
-    <w:p>
-      <w:pPr>
-        <w:pStyle w:val="Informations"/>
-        <w:numPr>
-          <w:ilvl w:val="5"/>
-          <w:numId w:val="8"/>
-        </w:numPr>
-      </w:pPr>
-      <w:r>
-        <w:t xml:space="preserve">Il s’agit de reprendre point par point les fonctionnalités décrites dans les spécifications de départ </w:t>
-      </w:r>
-      <w:r>
-        <w:t>et de définir si elles sont atteintes ou pas, et pourquoi.</w:t>
-      </w:r>
-    </w:p>
-    <w:p>
-      <w:pPr>
-        <w:pStyle w:val="Informations"/>
-        <w:numPr>
-          <w:ilvl w:val="5"/>
-          <w:numId w:val="8"/>
-        </w:numPr>
-      </w:pPr>
-      <w:r>
-        <w:t>Si ce n’est pas le cas, estimer</w:t>
-      </w:r>
-      <w:r>
-        <w:t xml:space="preserve"> en « % » ou en « temps supplémentaire » </w:t>
-      </w:r>
-      <w:r>
-        <w:t>le travail qu’il reste à accomplir pour terminer le tout.</w:t>
-      </w:r>
-    </w:p>
-    <w:p>
-      <w:pPr>
-        <w:pStyle w:val="Titre2"/>
-      </w:pPr>
-      <w:bookmarkStart w:id="34" w:name="_Toc165969655"/>
-      <w:bookmarkStart w:id="35" w:name="_Toc239402436"/>
-      <w:r>
-        <w:t>Bilan de la planification</w:t>
-      </w:r>
-      <w:bookmarkEnd w:id="34"/>
-      <w:bookmarkEnd w:id="35"/>
-    </w:p>
-    <w:p>
-      <w:pPr>
-        <w:pStyle w:val="Informations"/>
-        <w:numPr>
-          <w:ilvl w:val="5"/>
-          <w:numId w:val="9"/>
-        </w:numPr>
-      </w:pPr>
-      <w:r>
-        <w:t xml:space="preserve">Distinguer </w:t>
-      </w:r>
-      <w:r>
-        <w:t xml:space="preserve">et expliquer </w:t>
-      </w:r>
-      <w:r>
-        <w:t xml:space="preserve">les tâches qui ont généré des retards ou de l'avance dans la </w:t>
-      </w:r>
-      <w:r>
-        <w:t>gestion du</w:t>
-      </w:r>
-      <w:r>
-        <w:t xml:space="preserve"> projet.</w:t>
-      </w:r>
-      <w:r>
-        <w:t xml:space="preserve"> Indiquer </w:t>
-      </w:r>
-      <w:proofErr w:type="gramStart"/>
-      <w:r>
-        <w:t>les différence</w:t>
-      </w:r>
-      <w:proofErr w:type="gramEnd"/>
-      <w:r>
-        <w:t xml:space="preserve"> entre les planifications initiales et détaillées avec le journal de travail.</w:t>
-      </w:r>
-    </w:p>
-    <w:p>
-      <w:pPr>
-        <w:pStyle w:val="Titre2"/>
-      </w:pPr>
-      <w:bookmarkStart w:id="36" w:name="_Toc165969656"/>
-      <w:bookmarkStart w:id="37" w:name="_Toc239402437"/>
-      <w:r>
-        <w:t>Bilan personnel</w:t>
+      <w:bookmarkStart w:id="36" w:name="_Toc532179971"/>
+      <w:bookmarkStart w:id="37" w:name="_Toc165969657"/>
+      <w:bookmarkStart w:id="38" w:name="_Toc244244872"/>
+      <w:r>
+        <w:t>Divers</w:t>
       </w:r>
       <w:bookmarkEnd w:id="36"/>
       <w:bookmarkEnd w:id="37"/>
-    </w:p>
-    <w:p>
-      <w:pPr>
-        <w:pStyle w:val="Informations"/>
-        <w:numPr>
-          <w:ilvl w:val="5"/>
-          <w:numId w:val="9"/>
-        </w:numPr>
-      </w:pPr>
-      <w:r>
-        <w:t xml:space="preserve">Si c’était à </w:t>
-      </w:r>
-      <w:proofErr w:type="gramStart"/>
-      <w:r>
-        <w:t>refaire</w:t>
-      </w:r>
-      <w:r>
-        <w:t>:</w:t>
-      </w:r>
-      <w:proofErr w:type="gramEnd"/>
-    </w:p>
-    <w:p>
-      <w:pPr>
-        <w:pStyle w:val="Informations"/>
-        <w:numPr>
-          <w:ilvl w:val="6"/>
-          <w:numId w:val="9"/>
-        </w:numPr>
-      </w:pPr>
-      <w:r>
-        <w:t>Q</w:t>
-      </w:r>
-      <w:r>
-        <w:t xml:space="preserve">u’est-ce </w:t>
-      </w:r>
-      <w:r>
-        <w:t>qu’il faudrait garder</w:t>
-      </w:r>
-      <w:r>
-        <w:t> </w:t>
-      </w:r>
-      <w:r>
-        <w:t>? Les</w:t>
-      </w:r>
-      <w:r>
-        <w:t xml:space="preserve"> plus et les moins ?</w:t>
-      </w:r>
-    </w:p>
-    <w:p>
-      <w:pPr>
-        <w:pStyle w:val="Informations"/>
-        <w:numPr>
-          <w:ilvl w:val="6"/>
-          <w:numId w:val="9"/>
-        </w:numPr>
-      </w:pPr>
-      <w:r>
-        <w:t>Q</w:t>
-      </w:r>
-      <w:r>
-        <w:t xml:space="preserve">u’est-ce </w:t>
-      </w:r>
-      <w:r>
-        <w:t>qu’il faudrait gérer, réaliser ou traiter différemment ?</w:t>
-      </w:r>
-    </w:p>
-    <w:p>
-      <w:pPr>
-        <w:pStyle w:val="Informations"/>
-        <w:numPr>
-          <w:ilvl w:val="5"/>
-          <w:numId w:val="9"/>
-        </w:numPr>
-      </w:pPr>
-      <w:r>
-        <w:t>Qu’est que ce projet m’a appris ?</w:t>
-      </w:r>
-    </w:p>
-    <w:p>
-      <w:pPr>
-        <w:pStyle w:val="Informations"/>
-        <w:numPr>
-          <w:ilvl w:val="5"/>
-          <w:numId w:val="9"/>
-        </w:numPr>
-      </w:pPr>
-      <w:proofErr w:type="gramStart"/>
-      <w:r>
-        <w:t>Suite à</w:t>
-      </w:r>
-      <w:proofErr w:type="gramEnd"/>
-      <w:r>
-        <w:t xml:space="preserve"> donner, améliorations souhaitables, …</w:t>
-      </w:r>
-    </w:p>
-    <w:p>
-      <w:pPr>
-        <w:pStyle w:val="Informations"/>
-        <w:numPr>
-          <w:ilvl w:val="5"/>
-          <w:numId w:val="9"/>
-        </w:numPr>
-      </w:pPr>
-      <w:r>
-        <w:t>Remerciements, signature, etc.</w:t>
-      </w:r>
-    </w:p>
-    <w:p>
-      <w:pPr>
-        <w:pStyle w:val="Titre1"/>
-      </w:pPr>
-      <w:bookmarkStart w:id="38" w:name="_Toc532179971"/>
-      <w:bookmarkStart w:id="39" w:name="_Toc165969657"/>
-      <w:bookmarkStart w:id="40" w:name="_Toc239402438"/>
-      <w:r>
-        <w:t>Divers</w:t>
-      </w:r>
       <w:bookmarkEnd w:id="38"/>
+    </w:p>
+    <w:p>
+      <w:pPr>
+        <w:pStyle w:val="Titre2"/>
+      </w:pPr>
+      <w:bookmarkStart w:id="39" w:name="_Toc532179972"/>
+      <w:bookmarkStart w:id="40" w:name="_Toc165969658"/>
+      <w:bookmarkStart w:id="41" w:name="_Toc244244873"/>
+      <w:r>
+        <w:t>Journal de travail</w:t>
+      </w:r>
       <w:bookmarkEnd w:id="39"/>
       <w:bookmarkEnd w:id="40"/>
-    </w:p>
-    <w:p>
-      <w:pPr>
-        <w:pStyle w:val="Titre2"/>
-      </w:pPr>
-      <w:bookmarkStart w:id="41" w:name="_Toc532179972"/>
-      <w:bookmarkStart w:id="42" w:name="_Toc165969658"/>
-      <w:bookmarkStart w:id="43" w:name="_Toc239402439"/>
-      <w:r>
-        <w:t>Journal de travail</w:t>
-      </w:r>
       <w:bookmarkEnd w:id="41"/>
-      <w:bookmarkEnd w:id="42"/>
-      <w:bookmarkEnd w:id="43"/>
     </w:p>
     <w:p>
       <w:pPr>
@@ -3255,8 +3343,8 @@
       </w:pPr>
     </w:p>
     <w:sectPr>
-      <w:headerReference w:type="default" r:id="rId12"/>
-      <w:footerReference w:type="default" r:id="rId13"/>
+      <w:headerReference w:type="default" r:id="rId14"/>
+      <w:footerReference w:type="default" r:id="rId15"/>
       <w:pgSz w:w="11906" w:h="16838" w:code="9"/>
       <w:pgMar w:top="1418" w:right="1418" w:bottom="1418" w:left="1418" w:header="709" w:footer="709" w:gutter="0"/>
       <w:cols w:space="708"/>
@@ -3622,21 +3710,12 @@
               <w:szCs w:val="16"/>
             </w:rPr>
           </w:pPr>
-          <w:proofErr w:type="gramStart"/>
           <w:r>
             <w:rPr>
               <w:rFonts w:cs="Arial"/>
               <w:szCs w:val="16"/>
             </w:rPr>
-            <w:t>Version:</w:t>
-          </w:r>
-          <w:proofErr w:type="gramEnd"/>
-          <w:r>
-            <w:rPr>
-              <w:rFonts w:cs="Arial"/>
-              <w:szCs w:val="16"/>
-            </w:rPr>
-            <w:t xml:space="preserve"> </w:t>
+            <w:t xml:space="preserve">Version: </w:t>
           </w:r>
           <w:fldSimple w:instr=" REVNUM   \* MERGEFORMAT ">
             <w:r>
@@ -3682,7 +3761,7 @@
               <w:noProof/>
               <w:szCs w:val="16"/>
             </w:rPr>
-            <w:t>28.08.2026 11:20</w:t>
+            <w:t>04.09.2026 09:02</w:t>
           </w:r>
           <w:r>
             <w:rPr>
@@ -3887,7 +3966,7 @@
         <v:path o:extrusionok="f" gradientshapeok="t" o:connecttype="rect"/>
         <o:lock v:ext="edit" aspectratio="t"/>
       </v:shapetype>
-      <v:shape id="_x0000_i1025" type="#_x0000_t75" style="width:11.9pt;height:11.9pt" o:bullet="t">
+      <v:shape id="_x0000_i1025" type="#_x0000_t75" style="width:11.75pt;height:11.75pt" o:bullet="t">
         <v:imagedata r:id="rId1" o:title="BD10263_"/>
       </v:shape>
     </w:pict>
@@ -4543,7 +4622,7 @@
   <w:abstractNum w:abstractNumId="6" w15:restartNumberingAfterBreak="0">
     <w:nsid w:val="267B6FEC"/>
     <w:multiLevelType w:val="hybridMultilevel"/>
-    <w:tmpl w:val="08B0BC38"/>
+    <w:tmpl w:val="1C043D7C"/>
     <w:lvl w:ilvl="0" w:tplc="100C0001">
       <w:start w:val="1"/>
       <w:numFmt w:val="bullet"/>
@@ -5886,7 +5965,6 @@
   <w:style w:type="character" w:default="1" w:styleId="Policepardfaut">
     <w:name w:val="Default Paragraph Font"/>
     <w:uiPriority w:val="1"/>
-    <w:semiHidden/>
     <w:unhideWhenUsed/>
   </w:style>
   <w:style w:type="table" w:default="1" w:styleId="TableauNormal">
@@ -6428,6 +6506,16 @@
       <w:shd w:val="clear" w:color="auto" w:fill="E1DFDD"/>
     </w:rPr>
   </w:style>
+  <w:style w:type="paragraph" w:styleId="NormalWeb">
+    <w:name w:val="Normal (Web)"/>
+    <w:basedOn w:val="Normal"/>
+    <w:rsid w:val="008032BD"/>
+    <w:rPr>
+      <w:rFonts w:ascii="Times New Roman" w:hAnsi="Times New Roman"/>
+      <w:sz w:val="24"/>
+      <w:szCs w:val="24"/>
+    </w:rPr>
+  </w:style>
 </w:styles>
 </file>
 
@@ -6718,25 +6806,6 @@
 </file>
 
 <file path=customXml/item1.xml><?xml version="1.0" encoding="utf-8"?>
-<p:properties xmlns:p="http://schemas.microsoft.com/office/2006/metadata/properties" xmlns:xsi="http://www.w3.org/2001/XMLSchema-instance" xmlns:pc="http://schemas.microsoft.com/office/infopath/2007/PartnerControls">
-  <documentManagement/>
-</p:properties>
-</file>
-
-<file path=customXml/item2.xml><?xml version="1.0" encoding="utf-8"?>
-<b:Sources xmlns:b="http://schemas.openxmlformats.org/officeDocument/2006/bibliography" xmlns="http://schemas.openxmlformats.org/officeDocument/2006/bibliography" SelectedStyle="\APA.XSL" StyleName="APA"/>
-</file>
-
-<file path=customXml/item3.xml><?xml version="1.0" encoding="utf-8"?>
-<?mso-contentType ?>
-<FormTemplates xmlns="http://schemas.microsoft.com/sharepoint/v3/contenttype/forms">
-  <Display>DocumentLibraryForm</Display>
-  <Edit>DocumentLibraryForm</Edit>
-  <New>DocumentLibraryForm</New>
-</FormTemplates>
-</file>
-
-<file path=customXml/item4.xml><?xml version="1.0" encoding="utf-8"?>
 <ct:contentTypeSchema xmlns:ct="http://schemas.microsoft.com/office/2006/metadata/contentType" xmlns:ma="http://schemas.microsoft.com/office/2006/metadata/properties/metaAttributes" ct:_="" ma:_="" ma:contentTypeName="Document" ma:contentTypeID="0x010100FBB99F57F4D89D439F52EDCD0CED316B" ma:contentTypeVersion="7" ma:contentTypeDescription="Crée un document." ma:contentTypeScope="" ma:versionID="7f146099027e1b74c82fbe61e090590b">
   <xsd:schema xmlns:xsd="http://www.w3.org/2001/XMLSchema" xmlns:xs="http://www.w3.org/2001/XMLSchema" xmlns:p="http://schemas.microsoft.com/office/2006/metadata/properties" xmlns:ns2="6b19550a-bdc3-4796-8096-c6911560d534" targetNamespace="http://schemas.microsoft.com/office/2006/metadata/properties" ma:root="true" ma:fieldsID="7044bf5f632aa66a3f32a70d04b92caa" ns2:_="">
     <xsd:import namespace="6b19550a-bdc3-4796-8096-c6911560d534"/>
@@ -6898,32 +6967,26 @@
 </ct:contentTypeSchema>
 </file>
 
-<file path=customXml/itemProps1.xml><?xml version="1.0" encoding="utf-8"?>
-<ds:datastoreItem xmlns:ds="http://schemas.openxmlformats.org/officeDocument/2006/customXml" ds:itemID="{2319CDB8-A2CD-412D-8359-13E6B4DF1FF4}">
-  <ds:schemaRefs>
-    <ds:schemaRef ds:uri="http://schemas.microsoft.com/office/2006/metadata/properties"/>
-    <ds:schemaRef ds:uri="http://schemas.microsoft.com/office/infopath/2007/PartnerControls"/>
-  </ds:schemaRefs>
-</ds:datastoreItem>
+<file path=customXml/item2.xml><?xml version="1.0" encoding="utf-8"?>
+<?mso-contentType ?>
+<FormTemplates xmlns="http://schemas.microsoft.com/sharepoint/v3/contenttype/forms">
+  <Display>DocumentLibraryForm</Display>
+  <Edit>DocumentLibraryForm</Edit>
+  <New>DocumentLibraryForm</New>
+</FormTemplates>
 </file>
 
-<file path=customXml/itemProps2.xml><?xml version="1.0" encoding="utf-8"?>
-<ds:datastoreItem xmlns:ds="http://schemas.openxmlformats.org/officeDocument/2006/customXml" ds:itemID="{C8C35155-3E6A-4058-B6E4-303717845E3B}">
-  <ds:schemaRefs>
-    <ds:schemaRef ds:uri="http://schemas.openxmlformats.org/officeDocument/2006/bibliography"/>
-  </ds:schemaRefs>
-</ds:datastoreItem>
+<file path=customXml/item3.xml><?xml version="1.0" encoding="utf-8"?>
+<b:Sources xmlns:b="http://schemas.openxmlformats.org/officeDocument/2006/bibliography" xmlns="http://schemas.openxmlformats.org/officeDocument/2006/bibliography" SelectedStyle="\APA.XSL" StyleName="APA"/>
 </file>
 
-<file path=customXml/itemProps3.xml><?xml version="1.0" encoding="utf-8"?>
-<ds:datastoreItem xmlns:ds="http://schemas.openxmlformats.org/officeDocument/2006/customXml" ds:itemID="{6C3F7A66-EDE3-46FD-83EB-3C265E5D2669}">
-  <ds:schemaRefs>
-    <ds:schemaRef ds:uri="http://schemas.microsoft.com/sharepoint/v3/contenttype/forms"/>
-  </ds:schemaRefs>
-</ds:datastoreItem>
+<file path=customXml/item4.xml><?xml version="1.0" encoding="utf-8"?>
+<p:properties xmlns:p="http://schemas.microsoft.com/office/2006/metadata/properties" xmlns:xsi="http://www.w3.org/2001/XMLSchema-instance" xmlns:pc="http://schemas.microsoft.com/office/infopath/2007/PartnerControls">
+  <documentManagement/>
+</p:properties>
 </file>
 
-<file path=customXml/itemProps4.xml><?xml version="1.0" encoding="utf-8"?>
+<file path=customXml/itemProps1.xml><?xml version="1.0" encoding="utf-8"?>
 <ds:datastoreItem xmlns:ds="http://schemas.openxmlformats.org/officeDocument/2006/customXml" ds:itemID="{75ED066B-A5C4-4F00-9682-79C6BF6A6E3B}">
   <ds:schemaRefs>
     <ds:schemaRef ds:uri="http://schemas.microsoft.com/office/2006/metadata/contentType"/>
@@ -6939,4 +7002,29 @@
     <ds:schemaRef ds:uri="http://schemas.microsoft.com/internal/obd"/>
   </ds:schemaRefs>
 </ds:datastoreItem>
+</file>
+
+<file path=customXml/itemProps2.xml><?xml version="1.0" encoding="utf-8"?>
+<ds:datastoreItem xmlns:ds="http://schemas.openxmlformats.org/officeDocument/2006/customXml" ds:itemID="{6C3F7A66-EDE3-46FD-83EB-3C265E5D2669}">
+  <ds:schemaRefs>
+    <ds:schemaRef ds:uri="http://schemas.microsoft.com/sharepoint/v3/contenttype/forms"/>
+  </ds:schemaRefs>
+</ds:datastoreItem>
+</file>
+
+<file path=customXml/itemProps3.xml><?xml version="1.0" encoding="utf-8"?>
+<ds:datastoreItem xmlns:ds="http://schemas.openxmlformats.org/officeDocument/2006/customXml" ds:itemID="{C8C35155-3E6A-4058-B6E4-303717845E3B}">
+  <ds:schemaRefs>
+    <ds:schemaRef ds:uri="http://schemas.openxmlformats.org/officeDocument/2006/bibliography"/>
+  </ds:schemaRefs>
+</ds:datastoreItem>
+</file>
+
+<file path=customXml/itemProps4.xml><?xml version="1.0" encoding="utf-8"?>
+<ds:datastoreItem xmlns:ds="http://schemas.openxmlformats.org/officeDocument/2006/customXml" ds:itemID="{2319CDB8-A2CD-412D-8359-13E6B4DF1FF4}">
+  <ds:schemaRefs>
+    <ds:schemaRef ds:uri="http://schemas.microsoft.com/office/2006/metadata/properties"/>
+    <ds:schemaRef ds:uri="http://schemas.microsoft.com/office/infopath/2007/PartnerControls"/>
+  </ds:schemaRefs>
+</ds:datastoreItem>
 </file>
</xml_diff>

<commit_message>
chore(commit final): commit final pour pouvoir faire une release
</commit_message>
<xml_diff>
--- a/R-320-alemartino.docx
+++ b/R-320-alemartino.docx
@@ -1149,21 +1149,7 @@
             <w:rStyle w:val="Lienhypertexte"/>
             <w:noProof/>
           </w:rPr>
-          <w:t>Bilan pr</w:t>
-        </w:r>
-        <w:r>
-          <w:rPr>
-            <w:rStyle w:val="Lienhypertexte"/>
-            <w:noProof/>
-          </w:rPr>
-          <w:t>o</w:t>
-        </w:r>
-        <w:r>
-          <w:rPr>
-            <w:rStyle w:val="Lienhypertexte"/>
-            <w:noProof/>
-          </w:rPr>
-          <w:t>duit</w:t>
+          <w:t>Bilan produit</w:t>
         </w:r>
         <w:r>
           <w:rPr>
@@ -2211,9 +2197,9 @@
       <w:pPr>
         <w:pStyle w:val="Titre2"/>
       </w:pPr>
-      <w:bookmarkStart w:id="3" w:name="_Toc532179969"/>
-      <w:bookmarkStart w:id="4" w:name="_Toc165969639"/>
-      <w:bookmarkStart w:id="5" w:name="_Toc244244854"/>
+      <w:bookmarkStart w:id="3" w:name="_Toc244244854"/>
+      <w:bookmarkStart w:id="4" w:name="_Toc532179969"/>
+      <w:bookmarkStart w:id="5" w:name="_Toc165969639"/>
       <w:r>
         <w:t>T</w:t>
       </w:r>
@@ -2223,168 +2209,168 @@
       <w:r>
         <w:t>e</w:t>
       </w:r>
+      <w:bookmarkEnd w:id="3"/>
+    </w:p>
+    <w:p>
+      <w:pPr>
+        <w:pStyle w:val="Retraitcorpsdetexte"/>
+      </w:pPr>
+    </w:p>
+    <w:p>
+      <w:pPr>
+        <w:ind w:left="426" w:firstLine="708"/>
+      </w:pPr>
+      <w:r>
+        <w:t>P_320 Parking</w:t>
+      </w:r>
+    </w:p>
+    <w:p>
+      <w:pPr>
+        <w:pStyle w:val="Retraitcorpsdetexte"/>
+      </w:pPr>
+      <w:r>
+        <w:t xml:space="preserve"> </w:t>
+      </w:r>
+    </w:p>
+    <w:p>
+      <w:pPr>
+        <w:pStyle w:val="Titre2"/>
+      </w:pPr>
+      <w:bookmarkStart w:id="6" w:name="_Toc244244855"/>
+      <w:r>
+        <w:t>Description</w:t>
+      </w:r>
+      <w:bookmarkEnd w:id="6"/>
+    </w:p>
+    <w:p>
+      <w:pPr>
+        <w:pStyle w:val="Retraitcorpsdetexte"/>
+      </w:pPr>
+    </w:p>
+    <w:p>
+      <w:pPr>
+        <w:ind w:left="426" w:firstLine="708"/>
+      </w:pPr>
+      <w:r>
+        <w:t>Pour ce projet nous devons réaliser un programme C# orienté objet.</w:t>
+      </w:r>
+    </w:p>
+    <w:p>
+      <w:pPr>
+        <w:ind w:left="1134"/>
+      </w:pPr>
+      <w:r>
+        <w:t xml:space="preserve">Ce dernier est une interface console ou nous pouvons insérer </w:t>
+      </w:r>
+      <w:r>
+        <w:t>des véhicules</w:t>
+      </w:r>
+      <w:r>
+        <w:t xml:space="preserve"> les sortir du parking</w:t>
+      </w:r>
+      <w:r>
+        <w:t>, afficher le parking, etc.</w:t>
+      </w:r>
+    </w:p>
+    <w:p>
+      <w:pPr>
+        <w:pStyle w:val="Retraitcorpsdetexte"/>
+      </w:pPr>
+    </w:p>
+    <w:p>
+      <w:pPr>
+        <w:pStyle w:val="Titre2"/>
+      </w:pPr>
+      <w:bookmarkStart w:id="7" w:name="_Toc244244856"/>
+      <w:r>
+        <w:t>Matériel et logiciels à disposition</w:t>
+      </w:r>
+      <w:bookmarkEnd w:id="7"/>
+    </w:p>
+    <w:p/>
+    <w:p>
+      <w:pPr>
+        <w:ind w:left="426" w:firstLine="708"/>
+      </w:pPr>
+      <w:r>
+        <w:t>Ordinateurs de l’ETML, Visual Studio Code 2022, Internet</w:t>
+      </w:r>
+    </w:p>
+    <w:p>
+      <w:pPr>
+        <w:pStyle w:val="Retraitcorpsdetexte"/>
+      </w:pPr>
+    </w:p>
+    <w:p>
+      <w:pPr>
+        <w:pStyle w:val="Titre2"/>
+      </w:pPr>
+      <w:bookmarkStart w:id="8" w:name="_Toc244244857"/>
+      <w:r>
+        <w:t>P</w:t>
+      </w:r>
+      <w:r>
+        <w:t>rérequis</w:t>
+      </w:r>
+      <w:bookmarkEnd w:id="8"/>
+    </w:p>
+    <w:p>
+      <w:pPr>
+        <w:pStyle w:val="Retraitcorpsdetexte"/>
+      </w:pPr>
+    </w:p>
+    <w:p>
+      <w:pPr>
+        <w:ind w:left="426" w:firstLine="708"/>
+      </w:pPr>
+      <w:r>
+        <w:t>Avoir fait le module I319</w:t>
+      </w:r>
+    </w:p>
+    <w:p>
+      <w:pPr>
+        <w:pStyle w:val="Retraitcorpsdetexte"/>
+      </w:pPr>
+    </w:p>
+    <w:p>
+      <w:pPr>
+        <w:pStyle w:val="Titre2"/>
+      </w:pPr>
+      <w:bookmarkStart w:id="9" w:name="_Toc244244858"/>
+      <w:r>
+        <w:t>Cahier des charges</w:t>
+      </w:r>
+      <w:bookmarkEnd w:id="9"/>
+    </w:p>
+    <w:p>
+      <w:pPr>
+        <w:pStyle w:val="Retraitcorpsdetexte"/>
+      </w:pPr>
+    </w:p>
+    <w:p>
+      <w:pPr>
+        <w:pStyle w:val="Retraitcorpsdetexte"/>
+      </w:pPr>
+      <w:r>
+        <w:t>Se référer au fichier « </w:t>
+      </w:r>
+      <w:r>
+        <w:t>2026-oo-parking-cdc.pdf</w:t>
+      </w:r>
+      <w:r>
+        <w:t> »</w:t>
+      </w:r>
+    </w:p>
+    <w:p>
+      <w:pPr>
+        <w:pStyle w:val="Titre1"/>
+      </w:pPr>
+      <w:bookmarkStart w:id="10" w:name="_Toc244244859"/>
+      <w:r>
+        <w:t>Planification</w:t>
+      </w:r>
+      <w:bookmarkEnd w:id="4"/>
       <w:bookmarkEnd w:id="5"/>
-    </w:p>
-    <w:p>
-      <w:pPr>
-        <w:pStyle w:val="Retraitcorpsdetexte"/>
-      </w:pPr>
-    </w:p>
-    <w:p>
-      <w:pPr>
-        <w:ind w:left="426" w:firstLine="708"/>
-      </w:pPr>
-      <w:r>
-        <w:t>P_320 Parking</w:t>
-      </w:r>
-    </w:p>
-    <w:p>
-      <w:pPr>
-        <w:pStyle w:val="Retraitcorpsdetexte"/>
-      </w:pPr>
-      <w:r>
-        <w:t xml:space="preserve"> </w:t>
-      </w:r>
-    </w:p>
-    <w:p>
-      <w:pPr>
-        <w:pStyle w:val="Titre2"/>
-      </w:pPr>
-      <w:bookmarkStart w:id="6" w:name="_Toc244244855"/>
-      <w:r>
-        <w:t>Description</w:t>
-      </w:r>
-      <w:bookmarkEnd w:id="6"/>
-    </w:p>
-    <w:p>
-      <w:pPr>
-        <w:pStyle w:val="Retraitcorpsdetexte"/>
-      </w:pPr>
-    </w:p>
-    <w:p>
-      <w:pPr>
-        <w:ind w:left="426" w:firstLine="708"/>
-      </w:pPr>
-      <w:r>
-        <w:t>Pour ce projet nous devons réaliser un programme C# orienté objet.</w:t>
-      </w:r>
-    </w:p>
-    <w:p>
-      <w:pPr>
-        <w:ind w:left="1134"/>
-      </w:pPr>
-      <w:r>
-        <w:t xml:space="preserve">Ce dernier est une interface console ou nous pouvons insérer </w:t>
-      </w:r>
-      <w:r>
-        <w:t>des véhicules</w:t>
-      </w:r>
-      <w:r>
-        <w:t xml:space="preserve"> les sortir du parking</w:t>
-      </w:r>
-      <w:r>
-        <w:t>, afficher le parking, etc.</w:t>
-      </w:r>
-    </w:p>
-    <w:p>
-      <w:pPr>
-        <w:pStyle w:val="Retraitcorpsdetexte"/>
-      </w:pPr>
-    </w:p>
-    <w:p>
-      <w:pPr>
-        <w:pStyle w:val="Titre2"/>
-      </w:pPr>
-      <w:bookmarkStart w:id="7" w:name="_Toc244244856"/>
-      <w:r>
-        <w:t>Matériel et logiciels à disposition</w:t>
-      </w:r>
-      <w:bookmarkEnd w:id="7"/>
-    </w:p>
-    <w:p/>
-    <w:p>
-      <w:pPr>
-        <w:ind w:left="426" w:firstLine="708"/>
-      </w:pPr>
-      <w:r>
-        <w:t>Ordinateurs de l’ETML, Visual Studio Code 2022, Internet</w:t>
-      </w:r>
-    </w:p>
-    <w:p>
-      <w:pPr>
-        <w:pStyle w:val="Retraitcorpsdetexte"/>
-      </w:pPr>
-    </w:p>
-    <w:p>
-      <w:pPr>
-        <w:pStyle w:val="Titre2"/>
-      </w:pPr>
-      <w:bookmarkStart w:id="8" w:name="_Toc244244857"/>
-      <w:r>
-        <w:t>P</w:t>
-      </w:r>
-      <w:r>
-        <w:t>rérequis</w:t>
-      </w:r>
-      <w:bookmarkEnd w:id="8"/>
-    </w:p>
-    <w:p>
-      <w:pPr>
-        <w:pStyle w:val="Retraitcorpsdetexte"/>
-      </w:pPr>
-    </w:p>
-    <w:p>
-      <w:pPr>
-        <w:ind w:left="426" w:firstLine="708"/>
-      </w:pPr>
-      <w:r>
-        <w:t>Avoir fait le module I319</w:t>
-      </w:r>
-    </w:p>
-    <w:p>
-      <w:pPr>
-        <w:pStyle w:val="Retraitcorpsdetexte"/>
-      </w:pPr>
-    </w:p>
-    <w:p>
-      <w:pPr>
-        <w:pStyle w:val="Titre2"/>
-      </w:pPr>
-      <w:bookmarkStart w:id="9" w:name="_Toc244244858"/>
-      <w:r>
-        <w:t>Cahier des charges</w:t>
-      </w:r>
-      <w:bookmarkEnd w:id="9"/>
-    </w:p>
-    <w:p>
-      <w:pPr>
-        <w:pStyle w:val="Retraitcorpsdetexte"/>
-      </w:pPr>
-    </w:p>
-    <w:p>
-      <w:pPr>
-        <w:pStyle w:val="Retraitcorpsdetexte"/>
-      </w:pPr>
-      <w:r>
-        <w:t>Se référer au fichier « </w:t>
-      </w:r>
-      <w:r>
-        <w:t>2026-oo-parking-cdc.pdf</w:t>
-      </w:r>
-      <w:r>
-        <w:t> »</w:t>
-      </w:r>
-    </w:p>
-    <w:p>
-      <w:pPr>
-        <w:pStyle w:val="Titre1"/>
-      </w:pPr>
-      <w:bookmarkStart w:id="10" w:name="_Toc244244859"/>
-      <w:r>
-        <w:t>Planification</w:t>
-      </w:r>
-      <w:bookmarkEnd w:id="3"/>
-      <w:bookmarkEnd w:id="4"/>
       <w:r>
         <w:t xml:space="preserve"> Initiale</w:t>
       </w:r>
@@ -2899,6 +2885,9 @@
     </w:p>
     <w:p>
       <w:r>
+        <w:rPr>
+          <w:noProof/>
+        </w:rPr>
         <w:drawing>
           <wp:inline distT="0" distB="0" distL="0" distR="0" wp14:anchorId="6C1F56B6" wp14:editId="782DAB54">
             <wp:extent cx="5759450" cy="2082165"/>
@@ -2940,18 +2929,21 @@
       <w:pPr>
         <w:pStyle w:val="Titre1"/>
       </w:pPr>
-      <w:bookmarkStart w:id="26" w:name="_Toc165969653"/>
-      <w:bookmarkStart w:id="27" w:name="_Toc244244866"/>
+      <w:bookmarkStart w:id="26" w:name="_Toc244244866"/>
+      <w:bookmarkStart w:id="27" w:name="_Toc165969653"/>
       <w:r>
         <w:t>Conception</w:t>
       </w:r>
-      <w:bookmarkEnd w:id="27"/>
+      <w:bookmarkEnd w:id="26"/>
     </w:p>
     <w:p>
       <w:pPr>
         <w:pStyle w:val="Corpsdetexte"/>
       </w:pPr>
       <w:r>
+        <w:rPr>
+          <w:noProof/>
+        </w:rPr>
         <w:drawing>
           <wp:inline distT="0" distB="0" distL="0" distR="0" wp14:anchorId="188929FA" wp14:editId="0F39D30B">
             <wp:extent cx="1317831" cy="2243580"/>
@@ -3032,7 +3024,7 @@
       <w:r>
         <w:t>Conclusion</w:t>
       </w:r>
-      <w:bookmarkEnd w:id="26"/>
+      <w:bookmarkEnd w:id="27"/>
       <w:bookmarkEnd w:id="28"/>
     </w:p>
     <w:p>
@@ -3270,21 +3262,6 @@
       <w:r>
         <w:t xml:space="preserve"> pas utiliser l’IA pour générer du code, je n’ai pas fait d’autre utilisations.</w:t>
       </w:r>
-    </w:p>
-    <w:p>
-      <w:pPr>
-        <w:ind w:left="1416"/>
-      </w:pPr>
-    </w:p>
-    <w:p>
-      <w:pPr>
-        <w:ind w:left="1416"/>
-      </w:pPr>
-    </w:p>
-    <w:p>
-      <w:pPr>
-        <w:ind w:left="1416"/>
-      </w:pPr>
     </w:p>
     <w:p>
       <w:pPr>
@@ -3761,7 +3738,7 @@
               <w:noProof/>
               <w:szCs w:val="16"/>
             </w:rPr>
-            <w:t>04.09.2026 09:02</w:t>
+            <w:t>30.10.2026 09:33</w:t>
           </w:r>
           <w:r>
             <w:rPr>
@@ -5965,6 +5942,7 @@
   <w:style w:type="character" w:default="1" w:styleId="Policepardfaut">
     <w:name w:val="Default Paragraph Font"/>
     <w:uiPriority w:val="1"/>
+    <w:semiHidden/>
     <w:unhideWhenUsed/>
   </w:style>
   <w:style w:type="table" w:default="1" w:styleId="TableauNormal">
@@ -6806,6 +6784,15 @@
 </file>
 
 <file path=customXml/item1.xml><?xml version="1.0" encoding="utf-8"?>
+<?mso-contentType ?>
+<FormTemplates xmlns="http://schemas.microsoft.com/sharepoint/v3/contenttype/forms">
+  <Display>DocumentLibraryForm</Display>
+  <Edit>DocumentLibraryForm</Edit>
+  <New>DocumentLibraryForm</New>
+</FormTemplates>
+</file>
+
+<file path=customXml/item2.xml><?xml version="1.0" encoding="utf-8"?>
 <ct:contentTypeSchema xmlns:ct="http://schemas.microsoft.com/office/2006/metadata/contentType" xmlns:ma="http://schemas.microsoft.com/office/2006/metadata/properties/metaAttributes" ct:_="" ma:_="" ma:contentTypeName="Document" ma:contentTypeID="0x010100FBB99F57F4D89D439F52EDCD0CED316B" ma:contentTypeVersion="7" ma:contentTypeDescription="Crée un document." ma:contentTypeScope="" ma:versionID="7f146099027e1b74c82fbe61e090590b">
   <xsd:schema xmlns:xsd="http://www.w3.org/2001/XMLSchema" xmlns:xs="http://www.w3.org/2001/XMLSchema" xmlns:p="http://schemas.microsoft.com/office/2006/metadata/properties" xmlns:ns2="6b19550a-bdc3-4796-8096-c6911560d534" targetNamespace="http://schemas.microsoft.com/office/2006/metadata/properties" ma:root="true" ma:fieldsID="7044bf5f632aa66a3f32a70d04b92caa" ns2:_="">
     <xsd:import namespace="6b19550a-bdc3-4796-8096-c6911560d534"/>
@@ -6967,26 +6954,25 @@
 </ct:contentTypeSchema>
 </file>
 
-<file path=customXml/item2.xml><?xml version="1.0" encoding="utf-8"?>
-<?mso-contentType ?>
-<FormTemplates xmlns="http://schemas.microsoft.com/sharepoint/v3/contenttype/forms">
-  <Display>DocumentLibraryForm</Display>
-  <Edit>DocumentLibraryForm</Edit>
-  <New>DocumentLibraryForm</New>
-</FormTemplates>
-</file>
-
 <file path=customXml/item3.xml><?xml version="1.0" encoding="utf-8"?>
-<b:Sources xmlns:b="http://schemas.openxmlformats.org/officeDocument/2006/bibliography" xmlns="http://schemas.openxmlformats.org/officeDocument/2006/bibliography" SelectedStyle="\APA.XSL" StyleName="APA"/>
-</file>
-
-<file path=customXml/item4.xml><?xml version="1.0" encoding="utf-8"?>
 <p:properties xmlns:p="http://schemas.microsoft.com/office/2006/metadata/properties" xmlns:xsi="http://www.w3.org/2001/XMLSchema-instance" xmlns:pc="http://schemas.microsoft.com/office/infopath/2007/PartnerControls">
   <documentManagement/>
 </p:properties>
 </file>
 
+<file path=customXml/item4.xml><?xml version="1.0" encoding="utf-8"?>
+<b:Sources xmlns:b="http://schemas.openxmlformats.org/officeDocument/2006/bibliography" xmlns="http://schemas.openxmlformats.org/officeDocument/2006/bibliography" SelectedStyle="\APA.XSL" StyleName="APA"/>
+</file>
+
 <file path=customXml/itemProps1.xml><?xml version="1.0" encoding="utf-8"?>
+<ds:datastoreItem xmlns:ds="http://schemas.openxmlformats.org/officeDocument/2006/customXml" ds:itemID="{6C3F7A66-EDE3-46FD-83EB-3C265E5D2669}">
+  <ds:schemaRefs>
+    <ds:schemaRef ds:uri="http://schemas.microsoft.com/sharepoint/v3/contenttype/forms"/>
+  </ds:schemaRefs>
+</ds:datastoreItem>
+</file>
+
+<file path=customXml/itemProps2.xml><?xml version="1.0" encoding="utf-8"?>
 <ds:datastoreItem xmlns:ds="http://schemas.openxmlformats.org/officeDocument/2006/customXml" ds:itemID="{75ED066B-A5C4-4F00-9682-79C6BF6A6E3B}">
   <ds:schemaRefs>
     <ds:schemaRef ds:uri="http://schemas.microsoft.com/office/2006/metadata/contentType"/>
@@ -7004,27 +6990,19 @@
 </ds:datastoreItem>
 </file>
 
-<file path=customXml/itemProps2.xml><?xml version="1.0" encoding="utf-8"?>
-<ds:datastoreItem xmlns:ds="http://schemas.openxmlformats.org/officeDocument/2006/customXml" ds:itemID="{6C3F7A66-EDE3-46FD-83EB-3C265E5D2669}">
-  <ds:schemaRefs>
-    <ds:schemaRef ds:uri="http://schemas.microsoft.com/sharepoint/v3/contenttype/forms"/>
-  </ds:schemaRefs>
-</ds:datastoreItem>
-</file>
-
 <file path=customXml/itemProps3.xml><?xml version="1.0" encoding="utf-8"?>
-<ds:datastoreItem xmlns:ds="http://schemas.openxmlformats.org/officeDocument/2006/customXml" ds:itemID="{C8C35155-3E6A-4058-B6E4-303717845E3B}">
-  <ds:schemaRefs>
-    <ds:schemaRef ds:uri="http://schemas.openxmlformats.org/officeDocument/2006/bibliography"/>
-  </ds:schemaRefs>
-</ds:datastoreItem>
-</file>
-
-<file path=customXml/itemProps4.xml><?xml version="1.0" encoding="utf-8"?>
 <ds:datastoreItem xmlns:ds="http://schemas.openxmlformats.org/officeDocument/2006/customXml" ds:itemID="{2319CDB8-A2CD-412D-8359-13E6B4DF1FF4}">
   <ds:schemaRefs>
     <ds:schemaRef ds:uri="http://schemas.microsoft.com/office/2006/metadata/properties"/>
     <ds:schemaRef ds:uri="http://schemas.microsoft.com/office/infopath/2007/PartnerControls"/>
   </ds:schemaRefs>
 </ds:datastoreItem>
+</file>
+
+<file path=customXml/itemProps4.xml><?xml version="1.0" encoding="utf-8"?>
+<ds:datastoreItem xmlns:ds="http://schemas.openxmlformats.org/officeDocument/2006/customXml" ds:itemID="{C8C35155-3E6A-4058-B6E4-303717845E3B}">
+  <ds:schemaRefs>
+    <ds:schemaRef ds:uri="http://schemas.openxmlformats.org/officeDocument/2006/bibliography"/>
+  </ds:schemaRefs>
+</ds:datastoreItem>
 </file>
</xml_diff>